<commit_message>
docs: rapport corrige - comparaison V1 (HTML) / V2 (Algolia) / V3 (API)
Le rapport distingue correctement les 3 approches :
- V1 : scraping HTML avec Selenium + BeautifulSoup (architecture originale)
- V2 : scraping via API Algolia avec auto-refresh de cle (ajout recent)
- V3 : API a la demande avec filtres geo Algolia (proposee)

Co-Authored-By: Claude Opus 4.6 <noreply@anthropic.com>
</commit_message>
<xml_diff>
--- a/backend/doc/rapport_comparatif_scraping_vs_api.docx
+++ b/backend/doc/rapport_comparatif_scraping_vs_api.docx
@@ -30,9 +30,9 @@
           <w:color w:val="595959"/>
           <w:sz w:val="32"/>
         </w:rPr>
-        <w:t>Scraping Algolia vs API a la demande</w:t>
+        <w:t>Trois approches pour la recuperation</w:t>
         <w:br/>
-        <w:t>pour la recuperation des evenements Infolocale</w:t>
+        <w:t>des evenements Infolocale</w:t>
       </w:r>
     </w:p>
     <w:p/>
@@ -78,7 +78,7 @@
         <w:spacing w:after="40"/>
       </w:pPr>
       <w:r>
-        <w:t>2. Architecture actuelle (Scraping Algolia)</w:t>
+        <w:t>2. V1 - Scraping HTML (architecture originale)</w:t>
       </w:r>
     </w:p>
     <w:p>
@@ -86,7 +86,7 @@
         <w:spacing w:after="40"/>
       </w:pPr>
       <w:r>
-        <w:t>3. Architecture proposee (API a la demande)</w:t>
+        <w:t>3. V2 - Scraping via API Algolia</w:t>
       </w:r>
     </w:p>
     <w:p>
@@ -94,7 +94,7 @@
         <w:spacing w:after="40"/>
       </w:pPr>
       <w:r>
-        <w:t>4. Comparaison detaillee</w:t>
+        <w:t>4. V3 - API a la demande (architecture proposee)</w:t>
       </w:r>
     </w:p>
     <w:p>
@@ -102,7 +102,7 @@
         <w:spacing w:after="40"/>
       </w:pPr>
       <w:r>
-        <w:t>5. Analyse des risques</w:t>
+        <w:t>5. Comparaison detaillee des 3 approches</w:t>
       </w:r>
     </w:p>
     <w:p>
@@ -110,7 +110,7 @@
         <w:spacing w:after="40"/>
       </w:pPr>
       <w:r>
-        <w:t>6. Performance et scalabilite</w:t>
+        <w:t>6. Analyse des risques</w:t>
       </w:r>
     </w:p>
     <w:p>
@@ -118,7 +118,7 @@
         <w:spacing w:after="40"/>
       </w:pPr>
       <w:r>
-        <w:t>7. Cout et maintenance</w:t>
+        <w:t>7. Performance et scalabilite</w:t>
       </w:r>
     </w:p>
     <w:p>
@@ -126,7 +126,7 @@
         <w:spacing w:after="40"/>
       </w:pPr>
       <w:r>
-        <w:t>8. Recommandation finale</w:t>
+        <w:t>8. Cout et maintenance</w:t>
       </w:r>
     </w:p>
     <w:p>
@@ -134,7 +134,15 @@
         <w:spacing w:after="40"/>
       </w:pPr>
       <w:r>
-        <w:t>9. Plan de migration</w:t>
+        <w:t>9. Recommandation finale</w:t>
+      </w:r>
+    </w:p>
+    <w:p>
+      <w:pPr>
+        <w:spacing w:after="40"/>
+      </w:pPr>
+      <w:r>
+        <w:t>10. Plan de migration</w:t>
       </w:r>
     </w:p>
     <w:p>
@@ -165,7 +173,7 @@
     </w:p>
     <w:p>
       <w:r>
-        <w:t>Infolocale.fr utilise l'index Algolia memo_events qui contient plus de 110 000 evenements. L'acces a cet index se fait via une "secured key" base64 avec un champ validUntil qui expire regulierement.</w:t>
+        <w:t>Infolocale.fr est une plateforme d'evenements locaux couvrant l'ensemble du territoire francais. Le site affiche les evenements sous forme de cartes HTML et utilise en interne un index Algolia (memo_events, 110 000+ evenements) pour la recherche cote frontend.</w:t>
       </w:r>
     </w:p>
     <w:p>
@@ -173,12 +181,12 @@
         <w:pStyle w:val="Heading2"/>
       </w:pPr>
       <w:r>
-        <w:t>1.2 Problematique</w:t>
+        <w:t>1.2 Les trois approches</w:t>
       </w:r>
     </w:p>
     <w:p>
       <w:r>
-        <w:t>Deux approches sont possibles pour exploiter ces donnees :</w:t>
+        <w:t>Ce rapport compare trois architectures possibles pour exploiter ces donnees :</w:t>
       </w:r>
     </w:p>
     <w:p>
@@ -186,10 +194,10 @@
         <w:rPr>
           <w:b/>
         </w:rPr>
-        <w:t xml:space="preserve">Approche 1 (actuelle) : </w:t>
+        <w:t xml:space="preserve">V1 - Scraping HTML (originale) : </w:t>
       </w:r>
       <w:r>
-        <w:t>Scraping massif : recuperer tous les evenements via l'API Algolia Browse, les stocker en base PostgreSQL, puis les servir via une API FastAPI.</w:t>
+        <w:t>Parcourir les pages HTML d'infolocale.fr avec Selenium et BeautifulSoup pour extraire les evenements, les stocker en base PostgreSQL, puis les servir via une API FastAPI.</w:t>
       </w:r>
     </w:p>
     <w:p>
@@ -197,10 +205,21 @@
         <w:rPr>
           <w:b/>
         </w:rPr>
-        <w:t xml:space="preserve">Approche 2 (proposee) : </w:t>
+        <w:t xml:space="preserve">V2 - Scraping Algolia : </w:t>
       </w:r>
       <w:r>
-        <w:t>API a la demande : l'API FastAPI interroge Algolia directement a chaque requete utilisateur, en utilisant les filtres geographiques natifs d'Algolia.</w:t>
+        <w:t>Interroger directement l'API Algolia (index memo_events) pour recuperer massivement les evenements, les stocker en base et les servir via l'API. Necessite une cle API avec auto-renouvellement.</w:t>
+      </w:r>
+    </w:p>
+    <w:p>
+      <w:r>
+        <w:rPr>
+          <w:b/>
+        </w:rPr>
+        <w:t xml:space="preserve">V3 - API a la demande (proposee) : </w:t>
+      </w:r>
+      <w:r>
+        <w:t>L'API FastAPI interroge Algolia en temps reel a chaque requete utilisateur, en utilisant les filtres geographiques natifs d'Algolia. Pas de stockage local des evenements.</w:t>
       </w:r>
     </w:p>
     <w:p>
@@ -213,7 +232,7 @@
         <w:pStyle w:val="Heading1"/>
       </w:pPr>
       <w:r>
-        <w:t>2. Architecture actuelle (Scraping Algolia)</w:t>
+        <w:t>2. V1 - Scraping HTML (architecture originale)</w:t>
       </w:r>
     </w:p>
     <w:p>
@@ -221,314 +240,12 @@
         <w:pStyle w:val="Heading2"/>
       </w:pPr>
       <w:r>
-        <w:t>2.1 Pipeline de donnees</w:t>
+        <w:t>2.1 Principe</w:t>
       </w:r>
     </w:p>
     <w:p>
       <w:r>
-        <w:t>L'architecture actuelle repose sur 3 pipelines d'ingestion :</w:t>
-      </w:r>
-    </w:p>
-    <w:tbl>
-      <w:tblPr>
-        <w:tblStyle w:val="TableGrid"/>
-        <w:tblW w:type="auto" w:w="0"/>
-        <w:jc w:val="center"/>
-        <w:tblLook w:firstColumn="1" w:firstRow="1" w:lastColumn="0" w:lastRow="0" w:noHBand="0" w:noVBand="1" w:val="04A0"/>
-      </w:tblPr>
-      <w:tblGrid>
-        <w:gridCol w:w="2160"/>
-        <w:gridCol w:w="2160"/>
-        <w:gridCol w:w="2160"/>
-        <w:gridCol w:w="2160"/>
-      </w:tblGrid>
-      <w:tr>
-        <w:tc>
-          <w:tcPr>
-            <w:tcW w:type="dxa" w:w="1984"/>
-            <w:shd w:fill="2E74B5" w:val="clear"/>
-          </w:tcPr>
-          <w:p>
-            <w:pPr>
-              <w:jc w:val="center"/>
-            </w:pPr>
-            <w:r>
-              <w:rPr>
-                <w:b/>
-                <w:color w:val="FFFFFF"/>
-                <w:sz w:val="18"/>
-              </w:rPr>
-              <w:t>Pipeline</w:t>
-            </w:r>
-          </w:p>
-        </w:tc>
-        <w:tc>
-          <w:tcPr>
-            <w:tcW w:type="dxa" w:w="2268"/>
-            <w:shd w:fill="2E74B5" w:val="clear"/>
-          </w:tcPr>
-          <w:p>
-            <w:pPr>
-              <w:jc w:val="center"/>
-            </w:pPr>
-            <w:r>
-              <w:rPr>
-                <w:b/>
-                <w:color w:val="FFFFFF"/>
-                <w:sz w:val="18"/>
-              </w:rPr>
-              <w:t>Source</w:t>
-            </w:r>
-          </w:p>
-        </w:tc>
-        <w:tc>
-          <w:tcPr>
-            <w:tcW w:type="dxa" w:w="2835"/>
-            <w:shd w:fill="2E74B5" w:val="clear"/>
-          </w:tcPr>
-          <w:p>
-            <w:pPr>
-              <w:jc w:val="center"/>
-            </w:pPr>
-            <w:r>
-              <w:rPr>
-                <w:b/>
-                <w:color w:val="FFFFFF"/>
-                <w:sz w:val="18"/>
-              </w:rPr>
-              <w:t>Methode</w:t>
-            </w:r>
-          </w:p>
-        </w:tc>
-        <w:tc>
-          <w:tcPr>
-            <w:tcW w:type="dxa" w:w="1984"/>
-            <w:shd w:fill="2E74B5" w:val="clear"/>
-          </w:tcPr>
-          <w:p>
-            <w:pPr>
-              <w:jc w:val="center"/>
-            </w:pPr>
-            <w:r>
-              <w:rPr>
-                <w:b/>
-                <w:color w:val="FFFFFF"/>
-                <w:sz w:val="18"/>
-              </w:rPr>
-              <w:t>Volume</w:t>
-            </w:r>
-          </w:p>
-        </w:tc>
-      </w:tr>
-      <w:tr>
-        <w:tc>
-          <w:tcPr>
-            <w:tcW w:type="dxa" w:w="1984"/>
-          </w:tcPr>
-          <w:p>
-            <w:r>
-              <w:rPr>
-                <w:sz w:val="18"/>
-              </w:rPr>
-              <w:t>HTML Scraping</w:t>
-            </w:r>
-          </w:p>
-        </w:tc>
-        <w:tc>
-          <w:tcPr>
-            <w:tcW w:type="dxa" w:w="2268"/>
-          </w:tcPr>
-          <w:p>
-            <w:r>
-              <w:rPr>
-                <w:sz w:val="18"/>
-              </w:rPr>
-              <w:t>infolocale.fr</w:t>
-            </w:r>
-          </w:p>
-        </w:tc>
-        <w:tc>
-          <w:tcPr>
-            <w:tcW w:type="dxa" w:w="2835"/>
-          </w:tcPr>
-          <w:p>
-            <w:r>
-              <w:rPr>
-                <w:sz w:val="18"/>
-              </w:rPr>
-              <w:t>Selenium + BeautifulSoup</w:t>
-            </w:r>
-          </w:p>
-        </w:tc>
-        <w:tc>
-          <w:tcPr>
-            <w:tcW w:type="dxa" w:w="1984"/>
-          </w:tcPr>
-          <w:p>
-            <w:r>
-              <w:rPr>
-                <w:sz w:val="18"/>
-              </w:rPr>
-              <w:t>~50 events/page</w:t>
-            </w:r>
-          </w:p>
-        </w:tc>
-      </w:tr>
-      <w:tr>
-        <w:tc>
-          <w:tcPr>
-            <w:tcW w:type="dxa" w:w="1984"/>
-            <w:shd w:fill="D6E4F0" w:val="clear"/>
-          </w:tcPr>
-          <w:p>
-            <w:r>
-              <w:rPr>
-                <w:sz w:val="18"/>
-              </w:rPr>
-              <w:t>Algolia API</w:t>
-            </w:r>
-          </w:p>
-        </w:tc>
-        <w:tc>
-          <w:tcPr>
-            <w:tcW w:type="dxa" w:w="2268"/>
-            <w:shd w:fill="D6E4F0" w:val="clear"/>
-          </w:tcPr>
-          <w:p>
-            <w:r>
-              <w:rPr>
-                <w:sz w:val="18"/>
-              </w:rPr>
-              <w:t>Algolia (memo_events)</w:t>
-            </w:r>
-          </w:p>
-        </w:tc>
-        <w:tc>
-          <w:tcPr>
-            <w:tcW w:type="dxa" w:w="2835"/>
-            <w:shd w:fill="D6E4F0" w:val="clear"/>
-          </w:tcPr>
-          <w:p>
-            <w:r>
-              <w:rPr>
-                <w:sz w:val="18"/>
-              </w:rPr>
-              <w:t>HTTPX + Browse endpoint</w:t>
-            </w:r>
-          </w:p>
-        </w:tc>
-        <w:tc>
-          <w:tcPr>
-            <w:tcW w:type="dxa" w:w="1984"/>
-            <w:shd w:fill="D6E4F0" w:val="clear"/>
-          </w:tcPr>
-          <w:p>
-            <w:r>
-              <w:rPr>
-                <w:sz w:val="18"/>
-              </w:rPr>
-              <w:t>110k+ events</w:t>
-            </w:r>
-          </w:p>
-        </w:tc>
-      </w:tr>
-      <w:tr>
-        <w:tc>
-          <w:tcPr>
-            <w:tcW w:type="dxa" w:w="1984"/>
-          </w:tcPr>
-          <w:p>
-            <w:r>
-              <w:rPr>
-                <w:sz w:val="18"/>
-              </w:rPr>
-              <w:t>Open Data</w:t>
-            </w:r>
-          </w:p>
-        </w:tc>
-        <w:tc>
-          <w:tcPr>
-            <w:tcW w:type="dxa" w:w="2268"/>
-          </w:tcPr>
-          <w:p>
-            <w:r>
-              <w:rPr>
-                <w:sz w:val="18"/>
-              </w:rPr>
-              <w:t>data.gouv.fr</w:t>
-            </w:r>
-          </w:p>
-        </w:tc>
-        <w:tc>
-          <w:tcPr>
-            <w:tcW w:type="dxa" w:w="2835"/>
-          </w:tcPr>
-          <w:p>
-            <w:r>
-              <w:rPr>
-                <w:sz w:val="18"/>
-              </w:rPr>
-              <w:t>CSV download + parsing</w:t>
-            </w:r>
-          </w:p>
-        </w:tc>
-        <w:tc>
-          <w:tcPr>
-            <w:tcW w:type="dxa" w:w="1984"/>
-          </w:tcPr>
-          <w:p>
-            <w:r>
-              <w:rPr>
-                <w:sz w:val="18"/>
-              </w:rPr>
-              <w:t>Variable</w:t>
-            </w:r>
-          </w:p>
-        </w:tc>
-      </w:tr>
-    </w:tbl>
-    <w:p/>
-    <w:p>
-      <w:pPr>
-        <w:pStyle w:val="Heading2"/>
-      </w:pPr>
-      <w:r>
-        <w:t>2.2 Flux de donnees</w:t>
-      </w:r>
-    </w:p>
-    <w:p>
-      <w:r>
-        <w:t>1. Recuperation de la cle API Algolia (automatique via Selenium CDP)</w:t>
-      </w:r>
-    </w:p>
-    <w:p>
-      <w:r>
-        <w:t>2. Scraping massif via l'endpoint Browse (pagination par cursor)</w:t>
-      </w:r>
-    </w:p>
-    <w:p>
-      <w:r>
-        <w:t>3. Enrichissement : geocoding via OpenRouteService</w:t>
-      </w:r>
-    </w:p>
-    <w:p>
-      <w:r>
-        <w:t>4. Deduplication : UPSERT PostgreSQL sur le champ uid</w:t>
-      </w:r>
-    </w:p>
-    <w:p>
-      <w:r>
-        <w:t>5. Stockage en base PostgreSQL (table scanned_events)</w:t>
-      </w:r>
-    </w:p>
-    <w:p>
-      <w:r>
-        <w:t>6. Exposition via API FastAPI (GET /api/v1/events)</w:t>
-      </w:r>
-    </w:p>
-    <w:p>
-      <w:r>
-        <w:t>7. Export optionnel en CSV/JSON</w:t>
+        <w:t>L'architecture originale du projet repose sur le scraping classique des pages HTML du site infolocale.fr. Un navigateur Chrome pilote par Selenium charge chaque page de resultats, puis BeautifulSoup extrait les informations des cartes d'evenements.</w:t>
       </w:r>
     </w:p>
     <w:p>
@@ -536,52 +253,47 @@
         <w:pStyle w:val="Heading2"/>
       </w:pPr>
       <w:r>
-        <w:t>2.3 Gestion de la cle API</w:t>
+        <w:t>2.2 Pipeline de donnees</w:t>
       </w:r>
     </w:p>
     <w:p>
       <w:r>
-        <w:t>La cle API Algolia est une secured key avec un timestamp d'expiration (validUntil). Le service algolia_key_service.py gere le renouvellement automatique via :</w:t>
+        <w:t>1. Selenium charge une page de resultats sur infolocale.fr</w:t>
       </w:r>
     </w:p>
     <w:p>
-      <w:pPr>
-        <w:pStyle w:val="ListBullet"/>
-      </w:pPr>
       <w:r>
-        <w:t>Lancement de Chrome headless avec options anti-detection (stealth)</w:t>
+        <w:t>2. BeautifulSoup parse le HTML et extrait les cartes (.memo-card)</w:t>
       </w:r>
     </w:p>
     <w:p>
-      <w:pPr>
-        <w:pStyle w:val="ListBullet"/>
-      </w:pPr>
       <w:r>
-        <w:t>Chargement de infolocale.fr/activites</w:t>
+        <w:t>3. Chaque carte est transformee en objet evenement (titre, date, lieu, image...)</w:t>
       </w:r>
     </w:p>
     <w:p>
-      <w:pPr>
-        <w:pStyle w:val="ListBullet"/>
-      </w:pPr>
       <w:r>
-        <w:t>Interception des requetes reseau via Chrome DevTools Protocol (CDP)</w:t>
+        <w:t>4. Les dates en francais sont parsees (ex: "sam. 15 mars" -&gt; 2026-03-15)</w:t>
       </w:r>
     </w:p>
     <w:p>
-      <w:pPr>
-        <w:pStyle w:val="ListBullet"/>
-      </w:pPr>
       <w:r>
-        <w:t>Extraction de la cle depuis les parametres d'URL des requetes Algolia</w:t>
+        <w:t>5. Les evenements sont stockes en base PostgreSQL (table scanned_events)</w:t>
       </w:r>
     </w:p>
     <w:p>
-      <w:pPr>
-        <w:pStyle w:val="ListBullet"/>
-      </w:pPr>
       <w:r>
-        <w:t>Gestion du WAF Ouest-France (attente du challenge, retries)</w:t>
+        <w:t>6. Deduplication via UPSERT sur le champ uid (infolocale_{data_id})</w:t>
+      </w:r>
+    </w:p>
+    <w:p>
+      <w:r>
+        <w:t>7. Enrichissement optionnel : geocoding via OpenRouteService</w:t>
+      </w:r>
+    </w:p>
+    <w:p>
+      <w:r>
+        <w:t>8. Exposition via API FastAPI (GET /api/v1/events)</w:t>
       </w:r>
     </w:p>
     <w:p>
@@ -589,7 +301,7 @@
         <w:pStyle w:val="Heading2"/>
       </w:pPr>
       <w:r>
-        <w:t>2.4 Stack technique</w:t>
+        <w:t>2.3 Stack technique</w:t>
       </w:r>
     </w:p>
     <w:tbl>
@@ -659,6 +371,91 @@
                 <w:sz w:val="18"/>
               </w:rPr>
               <w:t>Role</w:t>
+            </w:r>
+          </w:p>
+        </w:tc>
+      </w:tr>
+      <w:tr>
+        <w:tc>
+          <w:tcPr>
+            <w:tcW w:type="dxa" w:w="1984"/>
+          </w:tcPr>
+          <w:p>
+            <w:r>
+              <w:rPr>
+                <w:sz w:val="18"/>
+              </w:rPr>
+              <w:t>Scraping</w:t>
+            </w:r>
+          </w:p>
+        </w:tc>
+        <w:tc>
+          <w:tcPr>
+            <w:tcW w:type="dxa" w:w="2835"/>
+          </w:tcPr>
+          <w:p>
+            <w:r>
+              <w:rPr>
+                <w:sz w:val="18"/>
+              </w:rPr>
+              <w:t>Selenium 4 + BeautifulSoup</w:t>
+            </w:r>
+          </w:p>
+        </w:tc>
+        <w:tc>
+          <w:tcPr>
+            <w:tcW w:type="dxa" w:w="2835"/>
+          </w:tcPr>
+          <w:p>
+            <w:r>
+              <w:rPr>
+                <w:sz w:val="18"/>
+              </w:rPr>
+              <w:t>Navigation et parsing HTML</w:t>
+            </w:r>
+          </w:p>
+        </w:tc>
+      </w:tr>
+      <w:tr>
+        <w:tc>
+          <w:tcPr>
+            <w:tcW w:type="dxa" w:w="1984"/>
+            <w:shd w:fill="D6E4F0" w:val="clear"/>
+          </w:tcPr>
+          <w:p>
+            <w:r>
+              <w:rPr>
+                <w:sz w:val="18"/>
+              </w:rPr>
+              <w:t>Driver</w:t>
+            </w:r>
+          </w:p>
+        </w:tc>
+        <w:tc>
+          <w:tcPr>
+            <w:tcW w:type="dxa" w:w="2835"/>
+            <w:shd w:fill="D6E4F0" w:val="clear"/>
+          </w:tcPr>
+          <w:p>
+            <w:r>
+              <w:rPr>
+                <w:sz w:val="18"/>
+              </w:rPr>
+              <w:t>webdriver-manager</w:t>
+            </w:r>
+          </w:p>
+        </w:tc>
+        <w:tc>
+          <w:tcPr>
+            <w:tcW w:type="dxa" w:w="2835"/>
+            <w:shd w:fill="D6E4F0" w:val="clear"/>
+          </w:tcPr>
+          <w:p>
+            <w:r>
+              <w:rPr>
+                <w:sz w:val="18"/>
+              </w:rPr>
+              <w:t>Gestion automatique de ChromeDriver</w:t>
             </w:r>
           </w:p>
         </w:tc>
@@ -800,7 +597,7 @@
               <w:rPr>
                 <w:sz w:val="18"/>
               </w:rPr>
-              <w:t>Scraping</w:t>
+              <w:t>Geocoding</w:t>
             </w:r>
           </w:p>
         </w:tc>
@@ -814,7 +611,7 @@
               <w:rPr>
                 <w:sz w:val="18"/>
               </w:rPr>
-              <w:t>Selenium 4 + HTTPX</w:t>
+              <w:t>OpenRouteService</w:t>
             </w:r>
           </w:p>
         </w:tc>
@@ -822,47 +619,6 @@
           <w:tcPr>
             <w:tcW w:type="dxa" w:w="2835"/>
             <w:shd w:fill="D6E4F0" w:val="clear"/>
-          </w:tcPr>
-          <w:p>
-            <w:r>
-              <w:rPr>
-                <w:sz w:val="18"/>
-              </w:rPr>
-              <w:t>Recuperation donnees</w:t>
-            </w:r>
-          </w:p>
-        </w:tc>
-      </w:tr>
-      <w:tr>
-        <w:tc>
-          <w:tcPr>
-            <w:tcW w:type="dxa" w:w="1984"/>
-          </w:tcPr>
-          <w:p>
-            <w:r>
-              <w:rPr>
-                <w:sz w:val="18"/>
-              </w:rPr>
-              <w:t>Geocoding</w:t>
-            </w:r>
-          </w:p>
-        </w:tc>
-        <w:tc>
-          <w:tcPr>
-            <w:tcW w:type="dxa" w:w="2835"/>
-          </w:tcPr>
-          <w:p>
-            <w:r>
-              <w:rPr>
-                <w:sz w:val="18"/>
-              </w:rPr>
-              <w:t>OpenRouteService</w:t>
-            </w:r>
-          </w:p>
-        </w:tc>
-        <w:tc>
-          <w:tcPr>
-            <w:tcW w:type="dxa" w:w="2835"/>
           </w:tcPr>
           <w:p>
             <w:r>
@@ -878,7 +634,6 @@
         <w:tc>
           <w:tcPr>
             <w:tcW w:type="dxa" w:w="1984"/>
-            <w:shd w:fill="D6E4F0" w:val="clear"/>
           </w:tcPr>
           <w:p>
             <w:r>
@@ -892,7 +647,6 @@
         <w:tc>
           <w:tcPr>
             <w:tcW w:type="dxa" w:w="2835"/>
-            <w:shd w:fill="D6E4F0" w:val="clear"/>
           </w:tcPr>
           <w:p>
             <w:r>
@@ -906,7 +660,6 @@
         <w:tc>
           <w:tcPr>
             <w:tcW w:type="dxa" w:w="2835"/>
-            <w:shd w:fill="D6E4F0" w:val="clear"/>
           </w:tcPr>
           <w:p>
             <w:r>
@@ -922,6 +675,7 @@
         <w:tc>
           <w:tcPr>
             <w:tcW w:type="dxa" w:w="1984"/>
+            <w:shd w:fill="D6E4F0" w:val="clear"/>
           </w:tcPr>
           <w:p>
             <w:r>
@@ -935,6 +689,7 @@
         <w:tc>
           <w:tcPr>
             <w:tcW w:type="dxa" w:w="2835"/>
+            <w:shd w:fill="D6E4F0" w:val="clear"/>
           </w:tcPr>
           <w:p>
             <w:r>
@@ -948,6 +703,7 @@
         <w:tc>
           <w:tcPr>
             <w:tcW w:type="dxa" w:w="2835"/>
+            <w:shd w:fill="D6E4F0" w:val="clear"/>
           </w:tcPr>
           <w:p>
             <w:r>
@@ -959,51 +715,63 @@
           </w:p>
         </w:tc>
       </w:tr>
-      <w:tr>
-        <w:tc>
-          <w:tcPr>
-            <w:tcW w:type="dxa" w:w="1984"/>
-            <w:shd w:fill="D6E4F0" w:val="clear"/>
-          </w:tcPr>
-          <w:p>
-            <w:r>
-              <w:rPr>
-                <w:sz w:val="18"/>
-              </w:rPr>
-              <w:t>Logs</w:t>
-            </w:r>
-          </w:p>
-        </w:tc>
-        <w:tc>
-          <w:tcPr>
-            <w:tcW w:type="dxa" w:w="2835"/>
-            <w:shd w:fill="D6E4F0" w:val="clear"/>
-          </w:tcPr>
-          <w:p>
-            <w:r>
-              <w:rPr>
-                <w:sz w:val="18"/>
-              </w:rPr>
-              <w:t>Loguru</w:t>
-            </w:r>
-          </w:p>
-        </w:tc>
-        <w:tc>
-          <w:tcPr>
-            <w:tcW w:type="dxa" w:w="2835"/>
-            <w:shd w:fill="D6E4F0" w:val="clear"/>
-          </w:tcPr>
-          <w:p>
-            <w:r>
-              <w:rPr>
-                <w:sz w:val="18"/>
-              </w:rPr>
-              <w:t>Journalisation structuree</w:t>
-            </w:r>
-          </w:p>
-        </w:tc>
-      </w:tr>
     </w:tbl>
+    <w:p>
+      <w:pPr>
+        <w:pStyle w:val="Heading2"/>
+      </w:pPr>
+      <w:r>
+        <w:t>2.4 Limites de cette approche</w:t>
+      </w:r>
+    </w:p>
+    <w:p>
+      <w:pPr>
+        <w:pStyle w:val="ListBullet"/>
+      </w:pPr>
+      <w:r>
+        <w:t>Lent : ~50 evenements par page, pagination manuelle, 2s de delai entre chaque page</w:t>
+      </w:r>
+    </w:p>
+    <w:p>
+      <w:pPr>
+        <w:pStyle w:val="ListBullet"/>
+      </w:pPr>
+      <w:r>
+        <w:t>Fragile : depend de la structure HTML (selecteurs CSS .memo-card, .gender, .day...)</w:t>
+      </w:r>
+    </w:p>
+    <w:p>
+      <w:pPr>
+        <w:pStyle w:val="ListBullet"/>
+      </w:pPr>
+      <w:r>
+        <w:t>WAF : le site est protege par un WAF Ouest-France qui bloque les navigateurs headless</w:t>
+      </w:r>
+    </w:p>
+    <w:p>
+      <w:pPr>
+        <w:pStyle w:val="ListBullet"/>
+      </w:pPr>
+      <w:r>
+        <w:t>Incomplet : seules les informations visibles sur la carte sont recuperees (pas de description complete)</w:t>
+      </w:r>
+    </w:p>
+    <w:p>
+      <w:pPr>
+        <w:pStyle w:val="ListBullet"/>
+      </w:pPr>
+      <w:r>
+        <w:t>Volume limite : scraper 110k evenements prendrait des heures</w:t>
+      </w:r>
+    </w:p>
+    <w:p>
+      <w:pPr>
+        <w:pStyle w:val="ListBullet"/>
+      </w:pPr>
+      <w:r>
+        <w:t>Maintenance : tout changement de design du site casse les selecteurs</w:t>
+      </w:r>
+    </w:p>
     <w:p>
       <w:r>
         <w:br w:type="page"/>
@@ -1014,7 +782,7 @@
         <w:pStyle w:val="Heading1"/>
       </w:pPr>
       <w:r>
-        <w:t>3. Architecture proposee (API a la demande)</w:t>
+        <w:t>3. V2 - Scraping via API Algolia</w:t>
       </w:r>
     </w:p>
     <w:p>
@@ -1027,6 +795,206 @@
     </w:p>
     <w:p>
       <w:r>
+        <w:t>Cette approche contourne le HTML en interrogeant directement l'API Algolia utilisee par le frontend d'infolocale.fr. L'index memo_events contient l'integralite des evenements avec toutes leurs metadonnees (titre, texte, lieu, coordonnees GPS, dates, categories, photos...).</w:t>
+      </w:r>
+    </w:p>
+    <w:p>
+      <w:pPr>
+        <w:pStyle w:val="Heading2"/>
+      </w:pPr>
+      <w:r>
+        <w:t>3.2 Pipeline de donnees</w:t>
+      </w:r>
+    </w:p>
+    <w:p>
+      <w:r>
+        <w:t>1. Appel a l'endpoint Browse d'Algolia (pagination par cursor, sans limite de 1000)</w:t>
+      </w:r>
+    </w:p>
+    <w:p>
+      <w:r>
+        <w:t>2. Recuperation de tous les evenements avec leurs metadonnees completes</w:t>
+      </w:r>
+    </w:p>
+    <w:p>
+      <w:r>
+        <w:t>3. Aplatissement des champs imbriques (lieu, rubrique, _geoloc, photo)</w:t>
+      </w:r>
+    </w:p>
+    <w:p>
+      <w:r>
+        <w:t>4. Stockage en base PostgreSQL ou export direct en CSV/JSON</w:t>
+      </w:r>
+    </w:p>
+    <w:p>
+      <w:r>
+        <w:t>5. Exposition via API FastAPI</w:t>
+      </w:r>
+    </w:p>
+    <w:p>
+      <w:pPr>
+        <w:pStyle w:val="Heading2"/>
+      </w:pPr>
+      <w:r>
+        <w:t>3.3 Gestion de la cle API</w:t>
+      </w:r>
+    </w:p>
+    <w:p>
+      <w:r>
+        <w:t>L'acces a l'API Algolia necessite une "secured key" (base64) avec un champ validUntil qui expire regulierement. Le service algolia_key_service.py gere le renouvellement automatique :</w:t>
+      </w:r>
+    </w:p>
+    <w:p>
+      <w:pPr>
+        <w:pStyle w:val="ListBullet"/>
+      </w:pPr>
+      <w:r>
+        <w:t>Lancement de Chrome headless avec options anti-detection (stealth)</w:t>
+      </w:r>
+    </w:p>
+    <w:p>
+      <w:pPr>
+        <w:pStyle w:val="ListBullet"/>
+      </w:pPr>
+      <w:r>
+        <w:t>Chargement de infolocale.fr/activites pour declencher les requetes Algolia</w:t>
+      </w:r>
+    </w:p>
+    <w:p>
+      <w:pPr>
+        <w:pStyle w:val="ListBullet"/>
+      </w:pPr>
+      <w:r>
+        <w:t>Interception des requetes reseau via Chrome DevTools Protocol (CDP)</w:t>
+      </w:r>
+    </w:p>
+    <w:p>
+      <w:pPr>
+        <w:pStyle w:val="ListBullet"/>
+      </w:pPr>
+      <w:r>
+        <w:t>Extraction de la cle depuis les parametres d'URL (x-algolia-api-key)</w:t>
+      </w:r>
+    </w:p>
+    <w:p>
+      <w:pPr>
+        <w:pStyle w:val="ListBullet"/>
+      </w:pPr>
+      <w:r>
+        <w:t>Gestion du WAF Ouest-France (detection de la page challenge, attente, retries)</w:t>
+      </w:r>
+    </w:p>
+    <w:p>
+      <w:pPr>
+        <w:pStyle w:val="ListBullet"/>
+      </w:pPr>
+      <w:r>
+        <w:t>Renouvellement transparent : si la cle expire en cours d'export, elle est renouvelee automatiquement</w:t>
+      </w:r>
+    </w:p>
+    <w:p>
+      <w:pPr>
+        <w:pStyle w:val="Heading2"/>
+      </w:pPr>
+      <w:r>
+        <w:t>3.4 Avantages par rapport a V1</w:t>
+      </w:r>
+    </w:p>
+    <w:p>
+      <w:pPr>
+        <w:pStyle w:val="ListBullet"/>
+      </w:pPr>
+      <w:r>
+        <w:t>Beaucoup plus rapide : 1000 evenements par requete vs ~50 par page HTML</w:t>
+      </w:r>
+    </w:p>
+    <w:p>
+      <w:pPr>
+        <w:pStyle w:val="ListBullet"/>
+      </w:pPr>
+      <w:r>
+        <w:t>Donnees completes : texte integral, coordonnees GPS, tarifs, accessibilite...</w:t>
+      </w:r>
+    </w:p>
+    <w:p>
+      <w:pPr>
+        <w:pStyle w:val="ListBullet"/>
+      </w:pPr>
+      <w:r>
+        <w:t>Plus stable : pas de dependance aux selecteurs CSS du frontend</w:t>
+      </w:r>
+    </w:p>
+    <w:p>
+      <w:pPr>
+        <w:pStyle w:val="ListBullet"/>
+      </w:pPr>
+      <w:r>
+        <w:t>Volume : peut recuperer les 110k+ evenements en quelques minutes</w:t>
+      </w:r>
+    </w:p>
+    <w:p>
+      <w:pPr>
+        <w:pStyle w:val="Heading2"/>
+      </w:pPr>
+      <w:r>
+        <w:t>3.5 Limites</w:t>
+      </w:r>
+    </w:p>
+    <w:p>
+      <w:pPr>
+        <w:pStyle w:val="ListBullet"/>
+      </w:pPr>
+      <w:r>
+        <w:t>Cle API expirant regulierement (necessite Selenium pour le renouvellement)</w:t>
+      </w:r>
+    </w:p>
+    <w:p>
+      <w:pPr>
+        <w:pStyle w:val="ListBullet"/>
+      </w:pPr>
+      <w:r>
+        <w:t>Dependance a l'index Algolia d'Infolocale (s'il change, tout casse)</w:t>
+      </w:r>
+    </w:p>
+    <w:p>
+      <w:pPr>
+        <w:pStyle w:val="ListBullet"/>
+      </w:pPr>
+      <w:r>
+        <w:t>Donnees pas forcement a jour entre deux syncs</w:t>
+      </w:r>
+    </w:p>
+    <w:p>
+      <w:pPr>
+        <w:pStyle w:val="ListBullet"/>
+      </w:pPr>
+      <w:r>
+        <w:t>Necessite toujours une base PostgreSQL pour le stockage</w:t>
+      </w:r>
+    </w:p>
+    <w:p>
+      <w:r>
+        <w:br w:type="page"/>
+      </w:r>
+    </w:p>
+    <w:p>
+      <w:pPr>
+        <w:pStyle w:val="Heading1"/>
+      </w:pPr>
+      <w:r>
+        <w:t>4. V3 - API a la demande (architecture proposee)</w:t>
+      </w:r>
+    </w:p>
+    <w:p>
+      <w:pPr>
+        <w:pStyle w:val="Heading2"/>
+      </w:pPr>
+      <w:r>
+        <w:t>4.1 Principe</w:t>
+      </w:r>
+    </w:p>
+    <w:p>
+      <w:r>
         <w:t>Au lieu de scraper et stocker localement les 110k+ evenements, l'API FastAPI interroge directement Algolia a chaque requete utilisateur. Les filtres geographiques natifs d'Algolia (aroundLatLng, aroundRadius) permettent de ne recuperer que les evenements pertinents.</w:t>
       </w:r>
     </w:p>
@@ -1035,7 +1003,7 @@
         <w:pStyle w:val="Heading2"/>
       </w:pPr>
       <w:r>
-        <w:t>3.2 Flux de donnees simplifie</w:t>
+        <w:t>4.2 Flux de donnees</w:t>
       </w:r>
     </w:p>
     <w:p>
@@ -1045,7 +1013,7 @@
     </w:p>
     <w:p>
       <w:r>
-        <w:t>2. L'API FastAPI transforme la requete en appel Algolia</w:t>
+        <w:t>2. L'API FastAPI transforme la requete en appel Algolia avec les filtres natifs</w:t>
       </w:r>
     </w:p>
     <w:p>
@@ -1060,7 +1028,7 @@
     </w:p>
     <w:p>
       <w:r>
-        <w:t>5. Cache optionnel : les resultats sont mis en cache (Redis ou PostgreSQL)</w:t>
+        <w:t>5. Cache optionnel : les resultats sont mis en cache (Redis ou in-memory)</w:t>
       </w:r>
     </w:p>
     <w:p>
@@ -1068,7 +1036,7 @@
         <w:pStyle w:val="Heading2"/>
       </w:pPr>
       <w:r>
-        <w:t>3.3 Filtres Algolia disponibles</w:t>
+        <w:t>4.3 Filtres Algolia disponibles</w:t>
       </w:r>
     </w:p>
     <w:tbl>
@@ -1404,12 +1372,7 @@
         <w:pStyle w:val="Heading2"/>
       </w:pPr>
       <w:r>
-        <w:t>3.4 Composants supprimes</w:t>
-      </w:r>
-    </w:p>
-    <w:p>
-      <w:r>
-        <w:t>Dans cette approche, plusieurs composants deviennent inutiles :</w:t>
+        <w:t>4.4 Composants supprimes par rapport a V1/V2</w:t>
       </w:r>
     </w:p>
     <w:p>
@@ -1417,7 +1380,7 @@
         <w:pStyle w:val="ListBullet"/>
       </w:pPr>
       <w:r>
-        <w:t>scraper_service.py (scraping HTML Selenium)</w:t>
+        <w:t>scraper_service.py (scraping HTML Selenium — V1)</w:t>
       </w:r>
     </w:p>
     <w:p>
@@ -1465,7 +1428,7 @@
         <w:pStyle w:val="Heading2"/>
       </w:pPr>
       <w:r>
-        <w:t>3.5 Composants conserves</w:t>
+        <w:t>4.5 Composants conserves</w:t>
       </w:r>
     </w:p>
     <w:p>
@@ -1473,7 +1436,7 @@
         <w:pStyle w:val="ListBullet"/>
       </w:pPr>
       <w:r>
-        <w:t>algolia_service.py (adapte pour les requetes a la demande)</w:t>
+        <w:t>algolia_service.py (adapte pour les requetes a la demande avec filtres geo)</w:t>
       </w:r>
     </w:p>
     <w:p>
@@ -1481,7 +1444,7 @@
         <w:pStyle w:val="ListBullet"/>
       </w:pPr>
       <w:r>
-        <w:t>algolia_key_service.py (renouvellement automatique de cle)</w:t>
+        <w:t>algolia_key_service.py (renouvellement automatique de cle — identique a V2)</w:t>
       </w:r>
     </w:p>
     <w:p>
@@ -1510,7 +1473,7 @@
         <w:pStyle w:val="Heading1"/>
       </w:pPr>
       <w:r>
-        <w:t>4. Comparaison detaillee</w:t>
+        <w:t>5. Comparaison detaillee des 3 approches</w:t>
       </w:r>
     </w:p>
     <w:p>
@@ -1518,7 +1481,7 @@
         <w:pStyle w:val="Heading2"/>
       </w:pPr>
       <w:r>
-        <w:t>4.1 Tableau comparatif</w:t>
+        <w:t>5.1 Tableau comparatif</w:t>
       </w:r>
     </w:p>
     <w:tbl>
@@ -1529,14 +1492,15 @@
         <w:tblLook w:firstColumn="1" w:firstRow="1" w:lastColumn="0" w:lastRow="0" w:noHBand="0" w:noVBand="1" w:val="04A0"/>
       </w:tblPr>
       <w:tblGrid>
-        <w:gridCol w:w="2880"/>
-        <w:gridCol w:w="2880"/>
-        <w:gridCol w:w="2880"/>
+        <w:gridCol w:w="2160"/>
+        <w:gridCol w:w="2160"/>
+        <w:gridCol w:w="2160"/>
+        <w:gridCol w:w="2160"/>
       </w:tblGrid>
       <w:tr>
         <w:tc>
           <w:tcPr>
-            <w:tcW w:type="dxa" w:w="2268"/>
+            <w:tcW w:type="dxa" w:w="1701"/>
             <w:shd w:fill="2E74B5" w:val="clear"/>
           </w:tcPr>
           <w:p>
@@ -1555,7 +1519,7 @@
         </w:tc>
         <w:tc>
           <w:tcPr>
-            <w:tcW w:type="dxa" w:w="3118"/>
+            <w:tcW w:type="dxa" w:w="1984"/>
             <w:shd w:fill="2E74B5" w:val="clear"/>
           </w:tcPr>
           <w:p>
@@ -1568,13 +1532,13 @@
                 <w:color w:val="FFFFFF"/>
                 <w:sz w:val="18"/>
               </w:rPr>
-              <w:t>Scraping Algolia</w:t>
+              <w:t>V1 - Scraping HTML</w:t>
             </w:r>
           </w:p>
         </w:tc>
         <w:tc>
           <w:tcPr>
-            <w:tcW w:type="dxa" w:w="3118"/>
+            <w:tcW w:type="dxa" w:w="1984"/>
             <w:shd w:fill="2E74B5" w:val="clear"/>
           </w:tcPr>
           <w:p>
@@ -1587,7 +1551,26 @@
                 <w:color w:val="FFFFFF"/>
                 <w:sz w:val="18"/>
               </w:rPr>
-              <w:t>API a la demande</w:t>
+              <w:t>V2 - Scraping Algolia</w:t>
+            </w:r>
+          </w:p>
+        </w:tc>
+        <w:tc>
+          <w:tcPr>
+            <w:tcW w:type="dxa" w:w="1984"/>
+            <w:shd w:fill="2E74B5" w:val="clear"/>
+          </w:tcPr>
+          <w:p>
+            <w:pPr>
+              <w:jc w:val="center"/>
+            </w:pPr>
+            <w:r>
+              <w:rPr>
+                <w:b/>
+                <w:color w:val="FFFFFF"/>
+                <w:sz w:val="18"/>
+              </w:rPr>
+              <w:t>V3 - API a la demande</w:t>
             </w:r>
           </w:p>
         </w:tc>
@@ -1595,7 +1578,7 @@
       <w:tr>
         <w:tc>
           <w:tcPr>
-            <w:tcW w:type="dxa" w:w="2268"/>
+            <w:tcW w:type="dxa" w:w="1701"/>
           </w:tcPr>
           <w:p>
             <w:r>
@@ -1608,20 +1591,33 @@
         </w:tc>
         <w:tc>
           <w:tcPr>
-            <w:tcW w:type="dxa" w:w="3118"/>
+            <w:tcW w:type="dxa" w:w="1984"/>
           </w:tcPr>
           <w:p>
             <w:r>
               <w:rPr>
                 <w:sz w:val="18"/>
               </w:rPr>
-              <w:t>Donnees obsoletes entre 2 syncs</w:t>
+              <w:t>Obsoletes entre 2 syncs</w:t>
             </w:r>
           </w:p>
         </w:tc>
         <w:tc>
           <w:tcPr>
-            <w:tcW w:type="dxa" w:w="3118"/>
+            <w:tcW w:type="dxa" w:w="1984"/>
+          </w:tcPr>
+          <w:p>
+            <w:r>
+              <w:rPr>
+                <w:sz w:val="18"/>
+              </w:rPr>
+              <w:t>Obsoletes entre 2 syncs</w:t>
+            </w:r>
+          </w:p>
+        </w:tc>
+        <w:tc>
+          <w:tcPr>
+            <w:tcW w:type="dxa" w:w="1984"/>
           </w:tcPr>
           <w:p>
             <w:r>
@@ -1636,8 +1632,65 @@
       <w:tr>
         <w:tc>
           <w:tcPr>
-            <w:tcW w:type="dxa" w:w="2268"/>
+            <w:tcW w:type="dxa" w:w="1701"/>
             <w:shd w:fill="D6E4F0" w:val="clear"/>
+          </w:tcPr>
+          <w:p>
+            <w:r>
+              <w:rPr>
+                <w:sz w:val="18"/>
+              </w:rPr>
+              <w:t>Richesse des donnees</w:t>
+            </w:r>
+          </w:p>
+        </w:tc>
+        <w:tc>
+          <w:tcPr>
+            <w:tcW w:type="dxa" w:w="1984"/>
+            <w:shd w:fill="D6E4F0" w:val="clear"/>
+          </w:tcPr>
+          <w:p>
+            <w:r>
+              <w:rPr>
+                <w:sz w:val="18"/>
+              </w:rPr>
+              <w:t>Limitee (carte HTML)</w:t>
+            </w:r>
+          </w:p>
+        </w:tc>
+        <w:tc>
+          <w:tcPr>
+            <w:tcW w:type="dxa" w:w="1984"/>
+            <w:shd w:fill="D6E4F0" w:val="clear"/>
+          </w:tcPr>
+          <w:p>
+            <w:r>
+              <w:rPr>
+                <w:sz w:val="18"/>
+              </w:rPr>
+              <w:t>Complete (toutes les metadonnees)</w:t>
+            </w:r>
+          </w:p>
+        </w:tc>
+        <w:tc>
+          <w:tcPr>
+            <w:tcW w:type="dxa" w:w="1984"/>
+            <w:shd w:fill="D6E4F0" w:val="clear"/>
+          </w:tcPr>
+          <w:p>
+            <w:r>
+              <w:rPr>
+                <w:sz w:val="18"/>
+              </w:rPr>
+              <w:t>Complete (toutes les metadonnees)</w:t>
+            </w:r>
+          </w:p>
+        </w:tc>
+      </w:tr>
+      <w:tr>
+        <w:tc>
+          <w:tcPr>
+            <w:tcW w:type="dxa" w:w="1701"/>
           </w:tcPr>
           <w:p>
             <w:r>
@@ -1650,8 +1703,20 @@
         </w:tc>
         <w:tc>
           <w:tcPr>
-            <w:tcW w:type="dxa" w:w="3118"/>
-            <w:shd w:fill="D6E4F0" w:val="clear"/>
+            <w:tcW w:type="dxa" w:w="1984"/>
+          </w:tcPr>
+          <w:p>
+            <w:r>
+              <w:rPr>
+                <w:sz w:val="18"/>
+              </w:rPr>
+              <w:t>Variable (scraping lent)</w:t>
+            </w:r>
+          </w:p>
+        </w:tc>
+        <w:tc>
+          <w:tcPr>
+            <w:tcW w:type="dxa" w:w="1984"/>
           </w:tcPr>
           <w:p>
             <w:r>
@@ -1664,8 +1729,7 @@
         </w:tc>
         <w:tc>
           <w:tcPr>
-            <w:tcW w:type="dxa" w:w="3118"/>
-            <w:shd w:fill="D6E4F0" w:val="clear"/>
+            <w:tcW w:type="dxa" w:w="1984"/>
           </w:tcPr>
           <w:p>
             <w:r>
@@ -1680,7 +1744,8 @@
       <w:tr>
         <w:tc>
           <w:tcPr>
-            <w:tcW w:type="dxa" w:w="2268"/>
+            <w:tcW w:type="dxa" w:w="1701"/>
+            <w:shd w:fill="D6E4F0" w:val="clear"/>
           </w:tcPr>
           <w:p>
             <w:r>
@@ -1693,27 +1758,43 @@
         </w:tc>
         <w:tc>
           <w:tcPr>
-            <w:tcW w:type="dxa" w:w="3118"/>
+            <w:tcW w:type="dxa" w:w="1984"/>
+            <w:shd w:fill="D6E4F0" w:val="clear"/>
           </w:tcPr>
           <w:p>
             <w:r>
               <w:rPr>
                 <w:sz w:val="18"/>
               </w:rPr>
-              <w:t>Rapide (donnees locales)</w:t>
+              <w:t>Rapide (SQL local)</w:t>
             </w:r>
           </w:p>
         </w:tc>
         <w:tc>
           <w:tcPr>
-            <w:tcW w:type="dxa" w:w="3118"/>
+            <w:tcW w:type="dxa" w:w="1984"/>
+            <w:shd w:fill="D6E4F0" w:val="clear"/>
           </w:tcPr>
           <w:p>
             <w:r>
               <w:rPr>
                 <w:sz w:val="18"/>
               </w:rPr>
-              <w:t>Moyenne (~200-500ms Algolia)</w:t>
+              <w:t>Rapide (SQL local)</w:t>
+            </w:r>
+          </w:p>
+        </w:tc>
+        <w:tc>
+          <w:tcPr>
+            <w:tcW w:type="dxa" w:w="1984"/>
+            <w:shd w:fill="D6E4F0" w:val="clear"/>
+          </w:tcPr>
+          <w:p>
+            <w:r>
+              <w:rPr>
+                <w:sz w:val="18"/>
+              </w:rPr>
+              <w:t>Moyenne (~200-500ms)</w:t>
             </w:r>
           </w:p>
         </w:tc>
@@ -1721,36 +1802,46 @@
       <w:tr>
         <w:tc>
           <w:tcPr>
-            <w:tcW w:type="dxa" w:w="2268"/>
-            <w:shd w:fill="D6E4F0" w:val="clear"/>
+            <w:tcW w:type="dxa" w:w="1701"/>
           </w:tcPr>
           <w:p>
             <w:r>
               <w:rPr>
                 <w:sz w:val="18"/>
               </w:rPr>
-              <w:t>Complexite infrastructure</w:t>
+              <w:t>Complexite infra</w:t>
             </w:r>
           </w:p>
         </w:tc>
         <w:tc>
           <w:tcPr>
-            <w:tcW w:type="dxa" w:w="3118"/>
-            <w:shd w:fill="D6E4F0" w:val="clear"/>
+            <w:tcW w:type="dxa" w:w="1984"/>
           </w:tcPr>
           <w:p>
             <w:r>
               <w:rPr>
                 <w:sz w:val="18"/>
               </w:rPr>
-              <w:t>PostgreSQL + Alembic + Cron</w:t>
+              <w:t>PostgreSQL + Selenium + Cron</w:t>
             </w:r>
           </w:p>
         </w:tc>
         <w:tc>
           <w:tcPr>
-            <w:tcW w:type="dxa" w:w="3118"/>
-            <w:shd w:fill="D6E4F0" w:val="clear"/>
+            <w:tcW w:type="dxa" w:w="1984"/>
+          </w:tcPr>
+          <w:p>
+            <w:r>
+              <w:rPr>
+                <w:sz w:val="18"/>
+              </w:rPr>
+              <w:t>PostgreSQL + Selenium (cle) + Cron</w:t>
+            </w:r>
+          </w:p>
+        </w:tc>
+        <w:tc>
+          <w:tcPr>
+            <w:tcW w:type="dxa" w:w="1984"/>
           </w:tcPr>
           <w:p>
             <w:r>
@@ -1765,7 +1856,8 @@
       <w:tr>
         <w:tc>
           <w:tcPr>
-            <w:tcW w:type="dxa" w:w="2268"/>
+            <w:tcW w:type="dxa" w:w="1701"/>
+            <w:shd w:fill="D6E4F0" w:val="clear"/>
           </w:tcPr>
           <w:p>
             <w:r>
@@ -1778,27 +1870,43 @@
         </w:tc>
         <w:tc>
           <w:tcPr>
-            <w:tcW w:type="dxa" w:w="3118"/>
+            <w:tcW w:type="dxa" w:w="1984"/>
+            <w:shd w:fill="D6E4F0" w:val="clear"/>
           </w:tcPr>
           <w:p>
             <w:r>
               <w:rPr>
                 <w:sz w:val="18"/>
               </w:rPr>
-              <w:t>Risque de blocage au scraping</w:t>
+              <w:t>Bloquant (chaque page)</w:t>
             </w:r>
           </w:p>
         </w:tc>
         <w:tc>
           <w:tcPr>
-            <w:tcW w:type="dxa" w:w="3118"/>
+            <w:tcW w:type="dxa" w:w="1984"/>
+            <w:shd w:fill="D6E4F0" w:val="clear"/>
           </w:tcPr>
           <w:p>
             <w:r>
               <w:rPr>
                 <w:sz w:val="18"/>
               </w:rPr>
-              <w:t>Meme risque (cle API)</w:t>
+              <w:t>Uniquement pour la cle API</w:t>
+            </w:r>
+          </w:p>
+        </w:tc>
+        <w:tc>
+          <w:tcPr>
+            <w:tcW w:type="dxa" w:w="1984"/>
+            <w:shd w:fill="D6E4F0" w:val="clear"/>
+          </w:tcPr>
+          <w:p>
+            <w:r>
+              <w:rPr>
+                <w:sz w:val="18"/>
+              </w:rPr>
+              <w:t>Uniquement pour la cle API</w:t>
             </w:r>
           </w:p>
         </w:tc>
@@ -1806,8 +1914,7 @@
       <w:tr>
         <w:tc>
           <w:tcPr>
-            <w:tcW w:type="dxa" w:w="2268"/>
-            <w:shd w:fill="D6E4F0" w:val="clear"/>
+            <w:tcW w:type="dxa" w:w="1701"/>
           </w:tcPr>
           <w:p>
             <w:r>
@@ -1820,22 +1927,33 @@
         </w:tc>
         <w:tc>
           <w:tcPr>
-            <w:tcW w:type="dxa" w:w="3118"/>
-            <w:shd w:fill="D6E4F0" w:val="clear"/>
+            <w:tcW w:type="dxa" w:w="1984"/>
           </w:tcPr>
           <w:p>
             <w:r>
               <w:rPr>
                 <w:sz w:val="18"/>
               </w:rPr>
-              <w:t>Post-traitement cote serveur</w:t>
+              <w:t>Post-traitement serveur</w:t>
             </w:r>
           </w:p>
         </w:tc>
         <w:tc>
           <w:tcPr>
-            <w:tcW w:type="dxa" w:w="3118"/>
-            <w:shd w:fill="D6E4F0" w:val="clear"/>
+            <w:tcW w:type="dxa" w:w="1984"/>
+          </w:tcPr>
+          <w:p>
+            <w:r>
+              <w:rPr>
+                <w:sz w:val="18"/>
+              </w:rPr>
+              <w:t>Post-traitement serveur</w:t>
+            </w:r>
+          </w:p>
+        </w:tc>
+        <w:tc>
+          <w:tcPr>
+            <w:tcW w:type="dxa" w:w="1984"/>
           </w:tcPr>
           <w:p>
             <w:r>
@@ -1850,40 +1968,57 @@
       <w:tr>
         <w:tc>
           <w:tcPr>
-            <w:tcW w:type="dxa" w:w="2268"/>
+            <w:tcW w:type="dxa" w:w="1701"/>
+            <w:shd w:fill="D6E4F0" w:val="clear"/>
           </w:tcPr>
           <w:p>
             <w:r>
               <w:rPr>
                 <w:sz w:val="18"/>
               </w:rPr>
-              <w:t>Cout de maintenance</w:t>
+              <w:t>Gestion de cle Algolia</w:t>
             </w:r>
           </w:p>
         </w:tc>
         <w:tc>
           <w:tcPr>
-            <w:tcW w:type="dxa" w:w="3118"/>
+            <w:tcW w:type="dxa" w:w="1984"/>
+            <w:shd w:fill="D6E4F0" w:val="clear"/>
           </w:tcPr>
           <w:p>
             <w:r>
               <w:rPr>
                 <w:sz w:val="18"/>
               </w:rPr>
-              <w:t>Eleve (3 pipelines, sync, cle)</w:t>
+              <w:t>Non necessaire</w:t>
             </w:r>
           </w:p>
         </w:tc>
         <w:tc>
           <w:tcPr>
-            <w:tcW w:type="dxa" w:w="3118"/>
+            <w:tcW w:type="dxa" w:w="1984"/>
+            <w:shd w:fill="D6E4F0" w:val="clear"/>
           </w:tcPr>
           <w:p>
             <w:r>
               <w:rPr>
                 <w:sz w:val="18"/>
               </w:rPr>
-              <w:t>Faible (1 service, cle)</w:t>
+              <w:t>Requise (auto-refresh)</w:t>
+            </w:r>
+          </w:p>
+        </w:tc>
+        <w:tc>
+          <w:tcPr>
+            <w:tcW w:type="dxa" w:w="1984"/>
+            <w:shd w:fill="D6E4F0" w:val="clear"/>
+          </w:tcPr>
+          <w:p>
+            <w:r>
+              <w:rPr>
+                <w:sz w:val="18"/>
+              </w:rPr>
+              <w:t>Requise (auto-refresh)</w:t>
             </w:r>
           </w:p>
         </w:tc>
@@ -1891,8 +2026,7 @@
       <w:tr>
         <w:tc>
           <w:tcPr>
-            <w:tcW w:type="dxa" w:w="2268"/>
-            <w:shd w:fill="D6E4F0" w:val="clear"/>
+            <w:tcW w:type="dxa" w:w="1701"/>
           </w:tcPr>
           <w:p>
             <w:r>
@@ -1905,22 +2039,33 @@
         </w:tc>
         <w:tc>
           <w:tcPr>
-            <w:tcW w:type="dxa" w:w="3118"/>
-            <w:shd w:fill="D6E4F0" w:val="clear"/>
+            <w:tcW w:type="dxa" w:w="1984"/>
           </w:tcPr>
           <w:p>
             <w:r>
               <w:rPr>
                 <w:sz w:val="18"/>
               </w:rPr>
-              <w:t>Oui (donnees locales)</w:t>
+              <w:t>Oui</w:t>
             </w:r>
           </w:p>
         </w:tc>
         <w:tc>
           <w:tcPr>
-            <w:tcW w:type="dxa" w:w="3118"/>
-            <w:shd w:fill="D6E4F0" w:val="clear"/>
+            <w:tcW w:type="dxa" w:w="1984"/>
+          </w:tcPr>
+          <w:p>
+            <w:r>
+              <w:rPr>
+                <w:sz w:val="18"/>
+              </w:rPr>
+              <w:t>Oui</w:t>
+            </w:r>
+          </w:p>
+        </w:tc>
+        <w:tc>
+          <w:tcPr>
+            <w:tcW w:type="dxa" w:w="1984"/>
           </w:tcPr>
           <w:p>
             <w:r>
@@ -1935,40 +2080,57 @@
       <w:tr>
         <w:tc>
           <w:tcPr>
-            <w:tcW w:type="dxa" w:w="2268"/>
+            <w:tcW w:type="dxa" w:w="1701"/>
+            <w:shd w:fill="D6E4F0" w:val="clear"/>
           </w:tcPr>
           <w:p>
             <w:r>
               <w:rPr>
                 <w:sz w:val="18"/>
               </w:rPr>
-              <w:t>Analytique / stats</w:t>
+              <w:t>Maintenance</w:t>
             </w:r>
           </w:p>
         </w:tc>
         <w:tc>
           <w:tcPr>
-            <w:tcW w:type="dxa" w:w="3118"/>
+            <w:tcW w:type="dxa" w:w="1984"/>
+            <w:shd w:fill="D6E4F0" w:val="clear"/>
           </w:tcPr>
           <w:p>
             <w:r>
               <w:rPr>
                 <w:sz w:val="18"/>
               </w:rPr>
-              <w:t>Oui (requetes SQL)</w:t>
+              <w:t>Elevee (selecteurs CSS)</w:t>
             </w:r>
           </w:p>
         </w:tc>
         <w:tc>
           <w:tcPr>
-            <w:tcW w:type="dxa" w:w="3118"/>
+            <w:tcW w:type="dxa" w:w="1984"/>
+            <w:shd w:fill="D6E4F0" w:val="clear"/>
           </w:tcPr>
           <w:p>
             <w:r>
               <w:rPr>
                 <w:sz w:val="18"/>
               </w:rPr>
-              <w:t>Limite (pas de donnees locales)</w:t>
+              <w:t>Moyenne (cle API)</w:t>
+            </w:r>
+          </w:p>
+        </w:tc>
+        <w:tc>
+          <w:tcPr>
+            <w:tcW w:type="dxa" w:w="1984"/>
+            <w:shd w:fill="D6E4F0" w:val="clear"/>
+          </w:tcPr>
+          <w:p>
+            <w:r>
+              <w:rPr>
+                <w:sz w:val="18"/>
+              </w:rPr>
+              <w:t>Faible</w:t>
             </w:r>
           </w:p>
         </w:tc>
@@ -1976,8 +2138,7 @@
       <w:tr>
         <w:tc>
           <w:tcPr>
-            <w:tcW w:type="dxa" w:w="2268"/>
-            <w:shd w:fill="D6E4F0" w:val="clear"/>
+            <w:tcW w:type="dxa" w:w="1701"/>
           </w:tcPr>
           <w:p>
             <w:r>
@@ -1990,8 +2151,20 @@
         </w:tc>
         <w:tc>
           <w:tcPr>
-            <w:tcW w:type="dxa" w:w="3118"/>
-            <w:shd w:fill="D6E4F0" w:val="clear"/>
+            <w:tcW w:type="dxa" w:w="1984"/>
+          </w:tcPr>
+          <w:p>
+            <w:r>
+              <w:rPr>
+                <w:sz w:val="18"/>
+              </w:rPr>
+              <w:t>Zone grise (scraping)</w:t>
+            </w:r>
+          </w:p>
+        </w:tc>
+        <w:tc>
+          <w:tcPr>
+            <w:tcW w:type="dxa" w:w="1984"/>
           </w:tcPr>
           <w:p>
             <w:r>
@@ -2004,15 +2177,14 @@
         </w:tc>
         <w:tc>
           <w:tcPr>
-            <w:tcW w:type="dxa" w:w="3118"/>
-            <w:shd w:fill="D6E4F0" w:val="clear"/>
+            <w:tcW w:type="dxa" w:w="1984"/>
           </w:tcPr>
           <w:p>
             <w:r>
               <w:rPr>
                 <w:sz w:val="18"/>
               </w:rPr>
-              <w:t>Plus leger (usage normal API)</w:t>
+              <w:t>Plus leger (usage normal)</w:t>
             </w:r>
           </w:p>
         </w:tc>
@@ -2024,15 +2196,15 @@
         <w:pStyle w:val="Heading2"/>
       </w:pPr>
       <w:r>
-        <w:t>4.2 Fraicheur des donnees</w:t>
+        <w:t>5.2 Fraicheur des donnees</w:t>
       </w:r>
     </w:p>
     <w:p>
       <w:r>
-        <w:t>L'approche scraping necessite une synchronisation reguliere (cron job) pour maintenir les donnees a jour. Entre deux syncs, les evenements ajoutes, modifies ou annules sur Infolocale ne sont pas refletes.</w:t>
+        <w:t>Les approches V1 et V2 necessitent une synchronisation reguliere (cron job) pour maintenir les donnees a jour. Entre deux syncs, les evenements ajoutes, modifies ou annules sur Infolocale ne sont pas refletes.</w:t>
         <w:br/>
         <w:br/>
-        <w:t>L'approche API a la demande retourne toujours les donnees les plus recentes puisqu'elle interroge Algolia en temps reel.</w:t>
+        <w:t>L'approche V3 retourne toujours les donnees les plus recentes puisqu'elle interroge Algolia en temps reel a chaque requete utilisateur.</w:t>
       </w:r>
     </w:p>
     <w:p>
@@ -2040,15 +2212,15 @@
         <w:pStyle w:val="Heading2"/>
       </w:pPr>
       <w:r>
-        <w:t>4.3 Filtrage geographique</w:t>
+        <w:t>5.3 Filtrage geographique</w:t>
       </w:r>
     </w:p>
     <w:p>
       <w:r>
-        <w:t>Avec le scraping, le filtrage geographique est fait cote serveur apres avoir recupere tous les evenements. Cela implique de stocker les coordonnees GPS et de calculer les distances.</w:t>
+        <w:t>Avec V1 et V2, le filtrage geographique est fait cote serveur apres avoir recupere tous les evenements. Cela implique de stocker les coordonnees GPS et de calculer les distances.</w:t>
         <w:br/>
         <w:br/>
-        <w:t>Algolia propose nativement les filtres aroundLatLng et aroundRadius qui effectuent ce calcul cote Algolia, avec des performances optimisees (index geographique). Le frontend n'a qu'a envoyer la position GPS de l'utilisateur.</w:t>
+        <w:t>V3 utilise les filtres natifs d'Algolia (aroundLatLng, aroundRadius) qui effectuent ce calcul cote Algolia avec des performances optimisees (index geographique). Le frontend n'a qu'a envoyer la position de l'utilisateur.</w:t>
       </w:r>
     </w:p>
     <w:p>
@@ -2056,12 +2228,15 @@
         <w:pStyle w:val="Heading2"/>
       </w:pPr>
       <w:r>
-        <w:t>4.4 Deduplication</w:t>
+        <w:t>5.4 Robustesse face au WAF</w:t>
       </w:r>
     </w:p>
     <w:p>
       <w:r>
-        <w:t>Le scraping necessite un mecanisme de deduplication (UPSERT sur uid) pour eviter les doublons entre les imports. L'API a la demande n'a pas ce probleme puisqu'elle ne stocke rien.</w:t>
+        <w:t>V1 est la plus vulnerable : chaque page scrapee passe par le WAF Ouest-France, qui peut bloquer le navigateur headless a tout moment.</w:t>
+        <w:br/>
+        <w:br/>
+        <w:t>V2 et V3 ne sont exposees au WAF que lors du renouvellement de la cle API (une seule visite de page necessaire), ce qui reduit considerablement le risque de blocage.</w:t>
       </w:r>
     </w:p>
     <w:p>
@@ -2074,7 +2249,7 @@
         <w:pStyle w:val="Heading1"/>
       </w:pPr>
       <w:r>
-        <w:t>5. Analyse des risques</w:t>
+        <w:t>6. Analyse des risques</w:t>
       </w:r>
     </w:p>
     <w:tbl>
@@ -2112,7 +2287,7 @@
         </w:tc>
         <w:tc>
           <w:tcPr>
-            <w:tcW w:type="dxa" w:w="2268"/>
+            <w:tcW w:type="dxa" w:w="1984"/>
             <w:shd w:fill="2E74B5" w:val="clear"/>
           </w:tcPr>
           <w:p>
@@ -2125,13 +2300,13 @@
                 <w:color w:val="FFFFFF"/>
                 <w:sz w:val="18"/>
               </w:rPr>
-              <w:t>Scraping</w:t>
+              <w:t>V1 - HTML</w:t>
             </w:r>
           </w:p>
         </w:tc>
         <w:tc>
           <w:tcPr>
-            <w:tcW w:type="dxa" w:w="2268"/>
+            <w:tcW w:type="dxa" w:w="1984"/>
             <w:shd w:fill="2E74B5" w:val="clear"/>
           </w:tcPr>
           <w:p>
@@ -2144,13 +2319,13 @@
                 <w:color w:val="FFFFFF"/>
                 <w:sz w:val="18"/>
               </w:rPr>
-              <w:t>API a la demande</w:t>
+              <w:t>V2 - Algolia</w:t>
             </w:r>
           </w:p>
         </w:tc>
         <w:tc>
           <w:tcPr>
-            <w:tcW w:type="dxa" w:w="1701"/>
+            <w:tcW w:type="dxa" w:w="1984"/>
             <w:shd w:fill="2E74B5" w:val="clear"/>
           </w:tcPr>
           <w:p>
@@ -2163,7 +2338,7 @@
                 <w:color w:val="FFFFFF"/>
                 <w:sz w:val="18"/>
               </w:rPr>
-              <w:t>Impact</w:t>
+              <w:t>V3 - API demande</w:t>
             </w:r>
           </w:p>
         </w:tc>
@@ -2178,46 +2353,52 @@
               <w:rPr>
                 <w:sz w:val="18"/>
               </w:rPr>
-              <w:t>Expiration de la cle API</w:t>
+              <w:t>Blocage WAF</w:t>
             </w:r>
           </w:p>
         </w:tc>
         <w:tc>
           <w:tcPr>
-            <w:tcW w:type="dxa" w:w="2268"/>
+            <w:tcW w:type="dxa" w:w="1984"/>
           </w:tcPr>
           <w:p>
             <w:r>
               <w:rPr>
                 <w:sz w:val="18"/>
               </w:rPr>
-              <w:t>Bloque le pipeline de sync</w:t>
+              <w:t>Critique</w:t>
+              <w:br/>
+              <w:t>(chaque page)</w:t>
             </w:r>
           </w:p>
         </w:tc>
         <w:tc>
           <w:tcPr>
-            <w:tcW w:type="dxa" w:w="2268"/>
+            <w:tcW w:type="dxa" w:w="1984"/>
           </w:tcPr>
           <w:p>
             <w:r>
               <w:rPr>
                 <w:sz w:val="18"/>
               </w:rPr>
-              <w:t>Bloque les requetes utilisateur</w:t>
+              <w:t>Faible</w:t>
+              <w:br/>
+              <w:t>(cle uniquement)</w:t>
             </w:r>
           </w:p>
         </w:tc>
         <w:tc>
           <w:tcPr>
-            <w:tcW w:type="dxa" w:w="1701"/>
+            <w:tcW w:type="dxa" w:w="1984"/>
           </w:tcPr>
           <w:p>
             <w:r>
               <w:rPr>
                 <w:sz w:val="18"/>
               </w:rPr>
-              <w:t>Critique (les 2)</w:t>
+              <w:t>Faible</w:t>
+              <w:br/>
+              <w:t>(cle uniquement)</w:t>
             </w:r>
           </w:p>
         </w:tc>
@@ -2233,13 +2414,13 @@
               <w:rPr>
                 <w:sz w:val="18"/>
               </w:rPr>
-              <w:t>Blocage WAF</w:t>
+              <w:t>Changement design HTML</w:t>
             </w:r>
           </w:p>
         </w:tc>
         <w:tc>
           <w:tcPr>
-            <w:tcW w:type="dxa" w:w="2268"/>
+            <w:tcW w:type="dxa" w:w="1984"/>
             <w:shd w:fill="D6E4F0" w:val="clear"/>
           </w:tcPr>
           <w:p>
@@ -2247,15 +2428,15 @@
               <w:rPr>
                 <w:sz w:val="18"/>
               </w:rPr>
-              <w:t>Bloque le scraping</w:t>
+              <w:t>Critique</w:t>
               <w:br/>
-              <w:t>(donnees en cache restent dispo)</w:t>
+              <w:t>(selecteurs cassent)</w:t>
             </w:r>
           </w:p>
         </w:tc>
         <w:tc>
           <w:tcPr>
-            <w:tcW w:type="dxa" w:w="2268"/>
+            <w:tcW w:type="dxa" w:w="1984"/>
             <w:shd w:fill="D6E4F0" w:val="clear"/>
           </w:tcPr>
           <w:p>
@@ -2263,13 +2444,13 @@
               <w:rPr>
                 <w:sz w:val="18"/>
               </w:rPr>
-              <w:t>Bloque le renouvellement de cle</w:t>
+              <w:t>Aucun impact</w:t>
             </w:r>
           </w:p>
         </w:tc>
         <w:tc>
           <w:tcPr>
-            <w:tcW w:type="dxa" w:w="1701"/>
+            <w:tcW w:type="dxa" w:w="1984"/>
             <w:shd w:fill="D6E4F0" w:val="clear"/>
           </w:tcPr>
           <w:p>
@@ -2277,7 +2458,7 @@
               <w:rPr>
                 <w:sz w:val="18"/>
               </w:rPr>
-              <w:t>Eleve</w:t>
+              <w:t>Aucun impact</w:t>
             </w:r>
           </w:p>
         </w:tc>
@@ -2292,46 +2473,50 @@
               <w:rPr>
                 <w:sz w:val="18"/>
               </w:rPr>
-              <w:t>Changement d'API Algolia</w:t>
+              <w:t>Expiration cle Algolia</w:t>
             </w:r>
           </w:p>
         </w:tc>
         <w:tc>
           <w:tcPr>
-            <w:tcW w:type="dxa" w:w="2268"/>
+            <w:tcW w:type="dxa" w:w="1984"/>
           </w:tcPr>
           <w:p>
             <w:r>
               <w:rPr>
                 <w:sz w:val="18"/>
               </w:rPr>
-              <w:t>Casse le scraping</w:t>
+              <w:t>Aucun impact</w:t>
             </w:r>
           </w:p>
         </w:tc>
         <w:tc>
           <w:tcPr>
-            <w:tcW w:type="dxa" w:w="2268"/>
+            <w:tcW w:type="dxa" w:w="1984"/>
           </w:tcPr>
           <w:p>
             <w:r>
               <w:rPr>
                 <w:sz w:val="18"/>
               </w:rPr>
-              <w:t>Casse les requetes</w:t>
+              <w:t>Moyen</w:t>
+              <w:br/>
+              <w:t>(auto-refresh gere)</w:t>
             </w:r>
           </w:p>
         </w:tc>
         <w:tc>
           <w:tcPr>
-            <w:tcW w:type="dxa" w:w="1701"/>
+            <w:tcW w:type="dxa" w:w="1984"/>
           </w:tcPr>
           <w:p>
             <w:r>
               <w:rPr>
                 <w:sz w:val="18"/>
               </w:rPr>
-              <w:t>Critique (les 2)</w:t>
+              <w:t>Moyen</w:t>
+              <w:br/>
+              <w:t>(auto-refresh gere)</w:t>
             </w:r>
           </w:p>
         </w:tc>
@@ -2347,13 +2532,13 @@
               <w:rPr>
                 <w:sz w:val="18"/>
               </w:rPr>
-              <w:t>Infolocale change d'index</w:t>
+              <w:t>Changement index Algolia</w:t>
             </w:r>
           </w:p>
         </w:tc>
         <w:tc>
           <w:tcPr>
-            <w:tcW w:type="dxa" w:w="2268"/>
+            <w:tcW w:type="dxa" w:w="1984"/>
             <w:shd w:fill="D6E4F0" w:val="clear"/>
           </w:tcPr>
           <w:p>
@@ -2361,13 +2546,13 @@
               <w:rPr>
                 <w:sz w:val="18"/>
               </w:rPr>
-              <w:t>Casse completement</w:t>
+              <w:t>Aucun impact</w:t>
             </w:r>
           </w:p>
         </w:tc>
         <w:tc>
           <w:tcPr>
-            <w:tcW w:type="dxa" w:w="2268"/>
+            <w:tcW w:type="dxa" w:w="1984"/>
             <w:shd w:fill="D6E4F0" w:val="clear"/>
           </w:tcPr>
           <w:p>
@@ -2375,13 +2560,13 @@
               <w:rPr>
                 <w:sz w:val="18"/>
               </w:rPr>
-              <w:t>Casse completement</w:t>
+              <w:t>Critique</w:t>
             </w:r>
           </w:p>
         </w:tc>
         <w:tc>
           <w:tcPr>
-            <w:tcW w:type="dxa" w:w="1701"/>
+            <w:tcW w:type="dxa" w:w="1984"/>
             <w:shd w:fill="D6E4F0" w:val="clear"/>
           </w:tcPr>
           <w:p>
@@ -2389,7 +2574,7 @@
               <w:rPr>
                 <w:sz w:val="18"/>
               </w:rPr>
-              <w:t>Critique (les 2)</w:t>
+              <w:t>Critique</w:t>
             </w:r>
           </w:p>
         </w:tc>
@@ -2404,43 +2589,28 @@
               <w:rPr>
                 <w:sz w:val="18"/>
               </w:rPr>
-              <w:t>Rate limiting Algolia</w:t>
+              <w:t>Rate limiting</w:t>
             </w:r>
           </w:p>
         </w:tc>
         <w:tc>
           <w:tcPr>
-            <w:tcW w:type="dxa" w:w="2268"/>
+            <w:tcW w:type="dxa" w:w="1984"/>
           </w:tcPr>
           <w:p>
             <w:r>
               <w:rPr>
                 <w:sz w:val="18"/>
               </w:rPr>
-              <w:t>Pendant le scraping</w:t>
+              <w:t>Eleve</w:t>
               <w:br/>
-              <w:t>(110k requetes)</w:t>
+              <w:t>(nombreuses pages)</w:t>
             </w:r>
           </w:p>
         </w:tc>
         <w:tc>
           <w:tcPr>
-            <w:tcW w:type="dxa" w:w="2268"/>
-          </w:tcPr>
-          <w:p>
-            <w:r>
-              <w:rPr>
-                <w:sz w:val="18"/>
-              </w:rPr>
-              <w:t>Proportionnel au trafic</w:t>
-              <w:br/>
-              <w:t>(quelques req/min)</w:t>
-            </w:r>
-          </w:p>
-        </w:tc>
-        <w:tc>
-          <w:tcPr>
-            <w:tcW w:type="dxa" w:w="1701"/>
+            <w:tcW w:type="dxa" w:w="1984"/>
           </w:tcPr>
           <w:p>
             <w:r>
@@ -2448,6 +2618,23 @@
                 <w:sz w:val="18"/>
               </w:rPr>
               <w:t>Moyen</w:t>
+              <w:br/>
+              <w:t>(browse massif)</w:t>
+            </w:r>
+          </w:p>
+        </w:tc>
+        <w:tc>
+          <w:tcPr>
+            <w:tcW w:type="dxa" w:w="1984"/>
+          </w:tcPr>
+          <w:p>
+            <w:r>
+              <w:rPr>
+                <w:sz w:val="18"/>
+              </w:rPr>
+              <w:t>Faible</w:t>
+              <w:br/>
+              <w:t>(quelques req/min)</w:t>
             </w:r>
           </w:p>
         </w:tc>
@@ -2469,7 +2656,7 @@
         </w:tc>
         <w:tc>
           <w:tcPr>
-            <w:tcW w:type="dxa" w:w="2268"/>
+            <w:tcW w:type="dxa" w:w="1984"/>
             <w:shd w:fill="D6E4F0" w:val="clear"/>
           </w:tcPr>
           <w:p>
@@ -2477,13 +2664,15 @@
               <w:rPr>
                 <w:sz w:val="18"/>
               </w:rPr>
-              <w:t>Plus d'acces aux donnees</w:t>
+              <w:t>Critique</w:t>
+              <w:br/>
+              <w:t>(plus de donnees)</w:t>
             </w:r>
           </w:p>
         </w:tc>
         <w:tc>
           <w:tcPr>
-            <w:tcW w:type="dxa" w:w="2268"/>
+            <w:tcW w:type="dxa" w:w="1984"/>
             <w:shd w:fill="D6E4F0" w:val="clear"/>
           </w:tcPr>
           <w:p>
@@ -2491,15 +2680,15 @@
               <w:rPr>
                 <w:sz w:val="18"/>
               </w:rPr>
-              <w:t>Pas d'impact</w:t>
+              <w:t>Critique</w:t>
               <w:br/>
-              <w:t>(pas de base requise)</w:t>
+              <w:t>(plus de donnees)</w:t>
             </w:r>
           </w:p>
         </w:tc>
         <w:tc>
           <w:tcPr>
-            <w:tcW w:type="dxa" w:w="1701"/>
+            <w:tcW w:type="dxa" w:w="1984"/>
             <w:shd w:fill="D6E4F0" w:val="clear"/>
           </w:tcPr>
           <w:p>
@@ -2507,7 +2696,9 @@
               <w:rPr>
                 <w:sz w:val="18"/>
               </w:rPr>
-              <w:t>Eleve (scraping)</w:t>
+              <w:t>Aucun impact</w:t>
+              <w:br/>
+              <w:t>(pas de base requise)</w:t>
             </w:r>
           </w:p>
         </w:tc>
@@ -2522,63 +2713,57 @@
               <w:rPr>
                 <w:sz w:val="18"/>
               </w:rPr>
-              <w:t>Conformite RGPD/legale</w:t>
+              <w:t>Conformite legale</w:t>
             </w:r>
           </w:p>
         </w:tc>
         <w:tc>
           <w:tcPr>
-            <w:tcW w:type="dxa" w:w="2268"/>
+            <w:tcW w:type="dxa" w:w="1984"/>
           </w:tcPr>
           <w:p>
             <w:r>
               <w:rPr>
                 <w:sz w:val="18"/>
               </w:rPr>
-              <w:t>Stockage massif de donnees tierces</w:t>
+              <w:t>Risque eleve</w:t>
+              <w:br/>
+              <w:t>(scraping HTML)</w:t>
             </w:r>
           </w:p>
         </w:tc>
         <w:tc>
           <w:tcPr>
-            <w:tcW w:type="dxa" w:w="2268"/>
+            <w:tcW w:type="dxa" w:w="1984"/>
           </w:tcPr>
           <w:p>
             <w:r>
               <w:rPr>
                 <w:sz w:val="18"/>
               </w:rPr>
-              <w:t>Proxy sans stockage</w:t>
+              <w:t>Risque moyen</w:t>
+              <w:br/>
+              <w:t>(scraping API)</w:t>
             </w:r>
           </w:p>
         </w:tc>
         <w:tc>
           <w:tcPr>
-            <w:tcW w:type="dxa" w:w="1701"/>
+            <w:tcW w:type="dxa" w:w="1984"/>
           </w:tcPr>
           <w:p>
             <w:r>
               <w:rPr>
                 <w:sz w:val="18"/>
               </w:rPr>
-              <w:t>Moyen (scraping)</w:t>
+              <w:t>Risque faible</w:t>
+              <w:br/>
+              <w:t>(usage proxy)</w:t>
             </w:r>
           </w:p>
         </w:tc>
       </w:tr>
     </w:tbl>
-    <w:p/>
-    <w:p>
-      <w:r>
-        <w:rPr>
-          <w:b/>
-        </w:rPr>
-        <w:t xml:space="preserve">Note : </w:t>
-      </w:r>
-      <w:r>
-        <w:t>Le risque d'expiration de cle est commun aux deux approches. Le service algolia_key_service.py le gere automatiquement dans les deux cas.</w:t>
-      </w:r>
-    </w:p>
     <w:p>
       <w:r>
         <w:br w:type="page"/>
@@ -2589,7 +2774,7 @@
         <w:pStyle w:val="Heading1"/>
       </w:pPr>
       <w:r>
-        <w:t>6. Performance et scalabilite</w:t>
+        <w:t>7. Performance et scalabilite</w:t>
       </w:r>
     </w:p>
     <w:p>
@@ -2597,7 +2782,7 @@
         <w:pStyle w:val="Heading2"/>
       </w:pPr>
       <w:r>
-        <w:t>6.1 Latence</w:t>
+        <w:t>7.1 Latence</w:t>
       </w:r>
     </w:p>
     <w:tbl>
@@ -2608,14 +2793,15 @@
         <w:tblLook w:firstColumn="1" w:firstRow="1" w:lastColumn="0" w:lastRow="0" w:noHBand="0" w:noVBand="1" w:val="04A0"/>
       </w:tblPr>
       <w:tblGrid>
-        <w:gridCol w:w="2880"/>
-        <w:gridCol w:w="2880"/>
-        <w:gridCol w:w="2880"/>
+        <w:gridCol w:w="2160"/>
+        <w:gridCol w:w="2160"/>
+        <w:gridCol w:w="2160"/>
+        <w:gridCol w:w="2160"/>
       </w:tblGrid>
       <w:tr>
         <w:tc>
           <w:tcPr>
-            <w:tcW w:type="dxa" w:w="2551"/>
+            <w:tcW w:type="dxa" w:w="2268"/>
             <w:shd w:fill="2E74B5" w:val="clear"/>
           </w:tcPr>
           <w:p>
@@ -2634,7 +2820,7 @@
         </w:tc>
         <w:tc>
           <w:tcPr>
-            <w:tcW w:type="dxa" w:w="2835"/>
+            <w:tcW w:type="dxa" w:w="1984"/>
             <w:shd w:fill="2E74B5" w:val="clear"/>
           </w:tcPr>
           <w:p>
@@ -2647,13 +2833,13 @@
                 <w:color w:val="FFFFFF"/>
                 <w:sz w:val="18"/>
               </w:rPr>
-              <w:t>Scraping (donnees locales)</w:t>
+              <w:t>V1 - HTML</w:t>
             </w:r>
           </w:p>
         </w:tc>
         <w:tc>
           <w:tcPr>
-            <w:tcW w:type="dxa" w:w="2835"/>
+            <w:tcW w:type="dxa" w:w="1984"/>
             <w:shd w:fill="2E74B5" w:val="clear"/>
           </w:tcPr>
           <w:p>
@@ -2666,7 +2852,26 @@
                 <w:color w:val="FFFFFF"/>
                 <w:sz w:val="18"/>
               </w:rPr>
-              <w:t>API a la demande</w:t>
+              <w:t>V2 - Algolia</w:t>
+            </w:r>
+          </w:p>
+        </w:tc>
+        <w:tc>
+          <w:tcPr>
+            <w:tcW w:type="dxa" w:w="1984"/>
+            <w:shd w:fill="2E74B5" w:val="clear"/>
+          </w:tcPr>
+          <w:p>
+            <w:pPr>
+              <w:jc w:val="center"/>
+            </w:pPr>
+            <w:r>
+              <w:rPr>
+                <w:b/>
+                <w:color w:val="FFFFFF"/>
+                <w:sz w:val="18"/>
+              </w:rPr>
+              <w:t>V3 - API demande</w:t>
             </w:r>
           </w:p>
         </w:tc>
@@ -2674,7 +2879,66 @@
       <w:tr>
         <w:tc>
           <w:tcPr>
-            <w:tcW w:type="dxa" w:w="2551"/>
+            <w:tcW w:type="dxa" w:w="2268"/>
+          </w:tcPr>
+          <w:p>
+            <w:r>
+              <w:rPr>
+                <w:sz w:val="18"/>
+              </w:rPr>
+              <w:t>Scraping initial</w:t>
+            </w:r>
+          </w:p>
+        </w:tc>
+        <w:tc>
+          <w:tcPr>
+            <w:tcW w:type="dxa" w:w="1984"/>
+          </w:tcPr>
+          <w:p>
+            <w:r>
+              <w:rPr>
+                <w:sz w:val="18"/>
+              </w:rPr>
+              <w:t>Plusieurs heures</w:t>
+              <w:br/>
+              <w:t>(110k events)</w:t>
+            </w:r>
+          </w:p>
+        </w:tc>
+        <w:tc>
+          <w:tcPr>
+            <w:tcW w:type="dxa" w:w="1984"/>
+          </w:tcPr>
+          <w:p>
+            <w:r>
+              <w:rPr>
+                <w:sz w:val="18"/>
+              </w:rPr>
+              <w:t>~5-15 min</w:t>
+              <w:br/>
+              <w:t>(110k events)</w:t>
+            </w:r>
+          </w:p>
+        </w:tc>
+        <w:tc>
+          <w:tcPr>
+            <w:tcW w:type="dxa" w:w="1984"/>
+          </w:tcPr>
+          <w:p>
+            <w:r>
+              <w:rPr>
+                <w:sz w:val="18"/>
+              </w:rPr>
+              <w:t>Aucun</w:t>
+            </w:r>
+          </w:p>
+        </w:tc>
+      </w:tr>
+      <w:tr>
+        <w:tc>
+          <w:tcPr>
+            <w:tcW w:type="dxa" w:w="2268"/>
+            <w:shd w:fill="D6E4F0" w:val="clear"/>
           </w:tcPr>
           <w:p>
             <w:r>
@@ -2687,27 +2951,49 @@
         </w:tc>
         <w:tc>
           <w:tcPr>
-            <w:tcW w:type="dxa" w:w="2835"/>
+            <w:tcW w:type="dxa" w:w="1984"/>
+            <w:shd w:fill="D6E4F0" w:val="clear"/>
           </w:tcPr>
           <w:p>
             <w:r>
               <w:rPr>
                 <w:sz w:val="18"/>
               </w:rPr>
-              <w:t>~10-50 ms (SQL local)</w:t>
+              <w:t>~10-50 ms</w:t>
+              <w:br/>
+              <w:t>(SQL local)</w:t>
             </w:r>
           </w:p>
         </w:tc>
         <w:tc>
           <w:tcPr>
-            <w:tcW w:type="dxa" w:w="2835"/>
+            <w:tcW w:type="dxa" w:w="1984"/>
+            <w:shd w:fill="D6E4F0" w:val="clear"/>
           </w:tcPr>
           <w:p>
             <w:r>
               <w:rPr>
                 <w:sz w:val="18"/>
               </w:rPr>
-              <w:t>~200-500 ms (Algolia)</w:t>
+              <w:t>~10-50 ms</w:t>
+              <w:br/>
+              <w:t>(SQL local)</w:t>
+            </w:r>
+          </w:p>
+        </w:tc>
+        <w:tc>
+          <w:tcPr>
+            <w:tcW w:type="dxa" w:w="1984"/>
+            <w:shd w:fill="D6E4F0" w:val="clear"/>
+          </w:tcPr>
+          <w:p>
+            <w:r>
+              <w:rPr>
+                <w:sz w:val="18"/>
+              </w:rPr>
+              <w:t>~200-500 ms</w:t>
+              <w:br/>
+              <w:t>(Algolia distant)</w:t>
             </w:r>
           </w:p>
         </w:tc>
@@ -2715,93 +3001,7 @@
       <w:tr>
         <w:tc>
           <w:tcPr>
-            <w:tcW w:type="dxa" w:w="2551"/>
-            <w:shd w:fill="D6E4F0" w:val="clear"/>
-          </w:tcPr>
-          <w:p>
-            <w:r>
-              <w:rPr>
-                <w:sz w:val="18"/>
-              </w:rPr>
-              <w:t>Sync initiale</w:t>
-            </w:r>
-          </w:p>
-        </w:tc>
-        <w:tc>
-          <w:tcPr>
-            <w:tcW w:type="dxa" w:w="2835"/>
-            <w:shd w:fill="D6E4F0" w:val="clear"/>
-          </w:tcPr>
-          <w:p>
-            <w:r>
-              <w:rPr>
-                <w:sz w:val="18"/>
-              </w:rPr>
-              <w:t>~5-15 min (110k events)</w:t>
-            </w:r>
-          </w:p>
-        </w:tc>
-        <w:tc>
-          <w:tcPr>
-            <w:tcW w:type="dxa" w:w="2835"/>
-            <w:shd w:fill="D6E4F0" w:val="clear"/>
-          </w:tcPr>
-          <w:p>
-            <w:r>
-              <w:rPr>
-                <w:sz w:val="18"/>
-              </w:rPr>
-              <w:t>Aucune</w:t>
-            </w:r>
-          </w:p>
-        </w:tc>
-      </w:tr>
-      <w:tr>
-        <w:tc>
-          <w:tcPr>
-            <w:tcW w:type="dxa" w:w="2551"/>
-          </w:tcPr>
-          <w:p>
-            <w:r>
-              <w:rPr>
-                <w:sz w:val="18"/>
-              </w:rPr>
-              <w:t>Renouvellement de cle</w:t>
-            </w:r>
-          </w:p>
-        </w:tc>
-        <w:tc>
-          <w:tcPr>
-            <w:tcW w:type="dxa" w:w="2835"/>
-          </w:tcPr>
-          <w:p>
-            <w:r>
-              <w:rPr>
-                <w:sz w:val="18"/>
-              </w:rPr>
-              <w:t>~10-15 s (Selenium)</w:t>
-            </w:r>
-          </w:p>
-        </w:tc>
-        <w:tc>
-          <w:tcPr>
-            <w:tcW w:type="dxa" w:w="2835"/>
-          </w:tcPr>
-          <w:p>
-            <w:r>
-              <w:rPr>
-                <w:sz w:val="18"/>
-              </w:rPr>
-              <w:t>~10-15 s (Selenium)</w:t>
-            </w:r>
-          </w:p>
-        </w:tc>
-      </w:tr>
-      <w:tr>
-        <w:tc>
-          <w:tcPr>
-            <w:tcW w:type="dxa" w:w="2551"/>
-            <w:shd w:fill="D6E4F0" w:val="clear"/>
+            <w:tcW w:type="dxa" w:w="2268"/>
           </w:tcPr>
           <w:p>
             <w:r>
@@ -2814,7 +3014,54 @@
         </w:tc>
         <w:tc>
           <w:tcPr>
-            <w:tcW w:type="dxa" w:w="2835"/>
+            <w:tcW w:type="dxa" w:w="1984"/>
+          </w:tcPr>
+          <w:p>
+            <w:r>
+              <w:rPr>
+                <w:sz w:val="18"/>
+              </w:rPr>
+              <w:t>~50-200 ms</w:t>
+              <w:br/>
+              <w:t>(calcul serveur)</w:t>
+            </w:r>
+          </w:p>
+        </w:tc>
+        <w:tc>
+          <w:tcPr>
+            <w:tcW w:type="dxa" w:w="1984"/>
+          </w:tcPr>
+          <w:p>
+            <w:r>
+              <w:rPr>
+                <w:sz w:val="18"/>
+              </w:rPr>
+              <w:t>~50-200 ms</w:t>
+              <w:br/>
+              <w:t>(calcul serveur)</w:t>
+            </w:r>
+          </w:p>
+        </w:tc>
+        <w:tc>
+          <w:tcPr>
+            <w:tcW w:type="dxa" w:w="1984"/>
+          </w:tcPr>
+          <w:p>
+            <w:r>
+              <w:rPr>
+                <w:sz w:val="18"/>
+              </w:rPr>
+              <w:t>~50-100 ms</w:t>
+              <w:br/>
+              <w:t>(index Algolia natif)</w:t>
+            </w:r>
+          </w:p>
+        </w:tc>
+      </w:tr>
+      <w:tr>
+        <w:tc>
+          <w:tcPr>
+            <w:tcW w:type="dxa" w:w="2268"/>
             <w:shd w:fill="D6E4F0" w:val="clear"/>
           </w:tcPr>
           <w:p>
@@ -2822,13 +3069,13 @@
               <w:rPr>
                 <w:sz w:val="18"/>
               </w:rPr>
-              <w:t>~50-200 ms (PostGIS/SQL)</w:t>
+              <w:t>Renouvellement cle</w:t>
             </w:r>
           </w:p>
         </w:tc>
         <w:tc>
           <w:tcPr>
-            <w:tcW w:type="dxa" w:w="2835"/>
+            <w:tcW w:type="dxa" w:w="1984"/>
             <w:shd w:fill="D6E4F0" w:val="clear"/>
           </w:tcPr>
           <w:p>
@@ -2836,7 +3083,39 @@
               <w:rPr>
                 <w:sz w:val="18"/>
               </w:rPr>
-              <w:t>~50-100 ms (Algolia natif)</w:t>
+              <w:t>Non applicable</w:t>
+            </w:r>
+          </w:p>
+        </w:tc>
+        <w:tc>
+          <w:tcPr>
+            <w:tcW w:type="dxa" w:w="1984"/>
+            <w:shd w:fill="D6E4F0" w:val="clear"/>
+          </w:tcPr>
+          <w:p>
+            <w:r>
+              <w:rPr>
+                <w:sz w:val="18"/>
+              </w:rPr>
+              <w:t>~10-15 s</w:t>
+              <w:br/>
+              <w:t>(Selenium)</w:t>
+            </w:r>
+          </w:p>
+        </w:tc>
+        <w:tc>
+          <w:tcPr>
+            <w:tcW w:type="dxa" w:w="1984"/>
+            <w:shd w:fill="D6E4F0" w:val="clear"/>
+          </w:tcPr>
+          <w:p>
+            <w:r>
+              <w:rPr>
+                <w:sz w:val="18"/>
+              </w:rPr>
+              <w:t>~10-15 s</w:t>
+              <w:br/>
+              <w:t>(Selenium)</w:t>
             </w:r>
           </w:p>
         </w:tc>
@@ -2848,15 +3127,18 @@
         <w:pStyle w:val="Heading2"/>
       </w:pPr>
       <w:r>
-        <w:t>6.2 Scalabilite</w:t>
+        <w:t>7.2 Scalabilite</w:t>
       </w:r>
     </w:p>
     <w:p>
       <w:r>
-        <w:t>Approche scraping : la scalabilite est limitee par la taille de la base PostgreSQL et le temps de synchronisation. Chaque nouvelle sync doit parcourir tous les evenements.</w:t>
+        <w:t>V1 : la scalabilite est tres limitee. Le temps de scraping croit lineairement avec le nombre de pages, et le WAF peut bloquer a tout moment.</w:t>
         <w:br/>
         <w:br/>
-        <w:t>Approche API : la scalabilite est geree par Algolia (infrastructure CDN). L'ajout d'un cache Redis permet de reduire les appels repetes a Algolia.</w:t>
+        <w:t>V2 : meilleure scalabilite grace a l'API Algolia, mais la taille de la base PostgreSQL et le temps de synchronisation restent des facteurs limitants.</w:t>
+        <w:br/>
+        <w:br/>
+        <w:t>V3 : la scalabilite est geree par Algolia (infrastructure CDN mondiale). L'ajout d'un cache Redis permet de reduire les appels repetes.</w:t>
       </w:r>
     </w:p>
     <w:p>
@@ -2864,12 +3146,12 @@
         <w:pStyle w:val="Heading2"/>
       </w:pPr>
       <w:r>
-        <w:t>6.3 Cache (approche hybride)</w:t>
+        <w:t>7.3 Cache (approche V3)</w:t>
       </w:r>
     </w:p>
     <w:p>
       <w:r>
-        <w:t>L'approche recommandee utilise un cache a plusieurs niveaux :</w:t>
+        <w:t>L'approche V3 peut utiliser un cache a plusieurs niveaux :</w:t>
       </w:r>
     </w:p>
     <w:p>
@@ -2906,7 +3188,7 @@
         <w:pStyle w:val="Heading1"/>
       </w:pPr>
       <w:r>
-        <w:t>7. Cout et maintenance</w:t>
+        <w:t>8. Cout et maintenance</w:t>
       </w:r>
     </w:p>
     <w:p>
@@ -2914,7 +3196,7 @@
         <w:pStyle w:val="Heading2"/>
       </w:pPr>
       <w:r>
-        <w:t>7.1 Complexite du code</w:t>
+        <w:t>8.1 Complexite du code</w:t>
       </w:r>
     </w:p>
     <w:tbl>
@@ -2925,14 +3207,15 @@
         <w:tblLook w:firstColumn="1" w:firstRow="1" w:lastColumn="0" w:lastRow="0" w:noHBand="0" w:noVBand="1" w:val="04A0"/>
       </w:tblPr>
       <w:tblGrid>
-        <w:gridCol w:w="2880"/>
-        <w:gridCol w:w="2880"/>
-        <w:gridCol w:w="2880"/>
+        <w:gridCol w:w="2160"/>
+        <w:gridCol w:w="2160"/>
+        <w:gridCol w:w="2160"/>
+        <w:gridCol w:w="2160"/>
       </w:tblGrid>
       <w:tr>
         <w:tc>
           <w:tcPr>
-            <w:tcW w:type="dxa" w:w="2835"/>
+            <w:tcW w:type="dxa" w:w="2268"/>
             <w:shd w:fill="2E74B5" w:val="clear"/>
           </w:tcPr>
           <w:p>
@@ -2951,7 +3234,7 @@
         </w:tc>
         <w:tc>
           <w:tcPr>
-            <w:tcW w:type="dxa" w:w="2551"/>
+            <w:tcW w:type="dxa" w:w="1701"/>
             <w:shd w:fill="2E74B5" w:val="clear"/>
           </w:tcPr>
           <w:p>
@@ -2964,13 +3247,13 @@
                 <w:color w:val="FFFFFF"/>
                 <w:sz w:val="18"/>
               </w:rPr>
-              <w:t>Scraping (lignes)</w:t>
+              <w:t>V1 - HTML</w:t>
             </w:r>
           </w:p>
         </w:tc>
         <w:tc>
           <w:tcPr>
-            <w:tcW w:type="dxa" w:w="2835"/>
+            <w:tcW w:type="dxa" w:w="1701"/>
             <w:shd w:fill="2E74B5" w:val="clear"/>
           </w:tcPr>
           <w:p>
@@ -2983,7 +3266,26 @@
                 <w:color w:val="FFFFFF"/>
                 <w:sz w:val="18"/>
               </w:rPr>
-              <w:t>API a la demande (lignes)</w:t>
+              <w:t>V2 - Algolia</w:t>
+            </w:r>
+          </w:p>
+        </w:tc>
+        <w:tc>
+          <w:tcPr>
+            <w:tcW w:type="dxa" w:w="1701"/>
+            <w:shd w:fill="2E74B5" w:val="clear"/>
+          </w:tcPr>
+          <w:p>
+            <w:pPr>
+              <w:jc w:val="center"/>
+            </w:pPr>
+            <w:r>
+              <w:rPr>
+                <w:b/>
+                <w:color w:val="FFFFFF"/>
+                <w:sz w:val="18"/>
+              </w:rPr>
+              <w:t>V3 - API demande</w:t>
             </w:r>
           </w:p>
         </w:tc>
@@ -2991,7 +3293,7 @@
       <w:tr>
         <w:tc>
           <w:tcPr>
-            <w:tcW w:type="dxa" w:w="2835"/>
+            <w:tcW w:type="dxa" w:w="2268"/>
           </w:tcPr>
           <w:p>
             <w:r>
@@ -3004,20 +3306,33 @@
         </w:tc>
         <w:tc>
           <w:tcPr>
-            <w:tcW w:type="dxa" w:w="2551"/>
+            <w:tcW w:type="dxa" w:w="1701"/>
           </w:tcPr>
           <w:p>
             <w:r>
               <w:rPr>
                 <w:sz w:val="18"/>
               </w:rPr>
-              <w:t>~250</w:t>
+              <w:t>~250 lignes</w:t>
             </w:r>
           </w:p>
         </w:tc>
         <w:tc>
           <w:tcPr>
-            <w:tcW w:type="dxa" w:w="2835"/>
+            <w:tcW w:type="dxa" w:w="1701"/>
+          </w:tcPr>
+          <w:p>
+            <w:r>
+              <w:rPr>
+                <w:sz w:val="18"/>
+              </w:rPr>
+              <w:t>Inutilise</w:t>
+            </w:r>
+          </w:p>
+        </w:tc>
+        <w:tc>
+          <w:tcPr>
+            <w:tcW w:type="dxa" w:w="1701"/>
           </w:tcPr>
           <w:p>
             <w:r>
@@ -3032,7 +3347,7 @@
       <w:tr>
         <w:tc>
           <w:tcPr>
-            <w:tcW w:type="dxa" w:w="2835"/>
+            <w:tcW w:type="dxa" w:w="2268"/>
             <w:shd w:fill="D6E4F0" w:val="clear"/>
           </w:tcPr>
           <w:p>
@@ -3046,7 +3361,7 @@
         </w:tc>
         <w:tc>
           <w:tcPr>
-            <w:tcW w:type="dxa" w:w="2551"/>
+            <w:tcW w:type="dxa" w:w="1701"/>
             <w:shd w:fill="D6E4F0" w:val="clear"/>
           </w:tcPr>
           <w:p>
@@ -3054,13 +3369,27 @@
               <w:rPr>
                 <w:sz w:val="18"/>
               </w:rPr>
-              <w:t>~300</w:t>
+              <w:t>Absent</w:t>
             </w:r>
           </w:p>
         </w:tc>
         <w:tc>
           <w:tcPr>
-            <w:tcW w:type="dxa" w:w="2835"/>
+            <w:tcW w:type="dxa" w:w="1701"/>
+            <w:shd w:fill="D6E4F0" w:val="clear"/>
+          </w:tcPr>
+          <w:p>
+            <w:r>
+              <w:rPr>
+                <w:sz w:val="18"/>
+              </w:rPr>
+              <w:t>~300 lignes</w:t>
+            </w:r>
+          </w:p>
+        </w:tc>
+        <w:tc>
+          <w:tcPr>
+            <w:tcW w:type="dxa" w:w="1701"/>
             <w:shd w:fill="D6E4F0" w:val="clear"/>
           </w:tcPr>
           <w:p>
@@ -3076,7 +3405,7 @@
       <w:tr>
         <w:tc>
           <w:tcPr>
-            <w:tcW w:type="dxa" w:w="2835"/>
+            <w:tcW w:type="dxa" w:w="2268"/>
           </w:tcPr>
           <w:p>
             <w:r>
@@ -3089,20 +3418,33 @@
         </w:tc>
         <w:tc>
           <w:tcPr>
-            <w:tcW w:type="dxa" w:w="2551"/>
+            <w:tcW w:type="dxa" w:w="1701"/>
           </w:tcPr>
           <w:p>
             <w:r>
               <w:rPr>
                 <w:sz w:val="18"/>
               </w:rPr>
-              <w:t>~280</w:t>
+              <w:t>Absent</w:t>
             </w:r>
           </w:p>
         </w:tc>
         <w:tc>
           <w:tcPr>
-            <w:tcW w:type="dxa" w:w="2835"/>
+            <w:tcW w:type="dxa" w:w="1701"/>
+          </w:tcPr>
+          <w:p>
+            <w:r>
+              <w:rPr>
+                <w:sz w:val="18"/>
+              </w:rPr>
+              <w:t>~280 lignes</w:t>
+            </w:r>
+          </w:p>
+        </w:tc>
+        <w:tc>
+          <w:tcPr>
+            <w:tcW w:type="dxa" w:w="1701"/>
           </w:tcPr>
           <w:p>
             <w:r>
@@ -3117,7 +3459,7 @@
       <w:tr>
         <w:tc>
           <w:tcPr>
-            <w:tcW w:type="dxa" w:w="2835"/>
+            <w:tcW w:type="dxa" w:w="2268"/>
             <w:shd w:fill="D6E4F0" w:val="clear"/>
           </w:tcPr>
           <w:p>
@@ -3131,7 +3473,7 @@
         </w:tc>
         <w:tc>
           <w:tcPr>
-            <w:tcW w:type="dxa" w:w="2551"/>
+            <w:tcW w:type="dxa" w:w="1701"/>
             <w:shd w:fill="D6E4F0" w:val="clear"/>
           </w:tcPr>
           <w:p>
@@ -3139,13 +3481,27 @@
               <w:rPr>
                 <w:sz w:val="18"/>
               </w:rPr>
-              <w:t>~150</w:t>
+              <w:t>~150 lignes</w:t>
             </w:r>
           </w:p>
         </w:tc>
         <w:tc>
           <w:tcPr>
-            <w:tcW w:type="dxa" w:w="2835"/>
+            <w:tcW w:type="dxa" w:w="1701"/>
+            <w:shd w:fill="D6E4F0" w:val="clear"/>
+          </w:tcPr>
+          <w:p>
+            <w:r>
+              <w:rPr>
+                <w:sz w:val="18"/>
+              </w:rPr>
+              <w:t>~150 lignes</w:t>
+            </w:r>
+          </w:p>
+        </w:tc>
+        <w:tc>
+          <w:tcPr>
+            <w:tcW w:type="dxa" w:w="1701"/>
             <w:shd w:fill="D6E4F0" w:val="clear"/>
           </w:tcPr>
           <w:p>
@@ -3161,7 +3517,7 @@
       <w:tr>
         <w:tc>
           <w:tcPr>
-            <w:tcW w:type="dxa" w:w="2835"/>
+            <w:tcW w:type="dxa" w:w="2268"/>
           </w:tcPr>
           <w:p>
             <w:r>
@@ -3174,20 +3530,33 @@
         </w:tc>
         <w:tc>
           <w:tcPr>
-            <w:tcW w:type="dxa" w:w="2551"/>
+            <w:tcW w:type="dxa" w:w="1701"/>
           </w:tcPr>
           <w:p>
             <w:r>
               <w:rPr>
                 <w:sz w:val="18"/>
               </w:rPr>
-              <w:t>~200</w:t>
+              <w:t>~200 lignes</w:t>
             </w:r>
           </w:p>
         </w:tc>
         <w:tc>
           <w:tcPr>
-            <w:tcW w:type="dxa" w:w="2835"/>
+            <w:tcW w:type="dxa" w:w="1701"/>
+          </w:tcPr>
+          <w:p>
+            <w:r>
+              <w:rPr>
+                <w:sz w:val="18"/>
+              </w:rPr>
+              <w:t>~200 lignes</w:t>
+            </w:r>
+          </w:p>
+        </w:tc>
+        <w:tc>
+          <w:tcPr>
+            <w:tcW w:type="dxa" w:w="1701"/>
           </w:tcPr>
           <w:p>
             <w:r>
@@ -3202,7 +3571,7 @@
       <w:tr>
         <w:tc>
           <w:tcPr>
-            <w:tcW w:type="dxa" w:w="2835"/>
+            <w:tcW w:type="dxa" w:w="2268"/>
             <w:shd w:fill="D6E4F0" w:val="clear"/>
           </w:tcPr>
           <w:p>
@@ -3216,7 +3585,7 @@
         </w:tc>
         <w:tc>
           <w:tcPr>
-            <w:tcW w:type="dxa" w:w="2551"/>
+            <w:tcW w:type="dxa" w:w="1701"/>
             <w:shd w:fill="D6E4F0" w:val="clear"/>
           </w:tcPr>
           <w:p>
@@ -3224,13 +3593,27 @@
               <w:rPr>
                 <w:sz w:val="18"/>
               </w:rPr>
-              <w:t>~200</w:t>
+              <w:t>~200 lignes</w:t>
             </w:r>
           </w:p>
         </w:tc>
         <w:tc>
           <w:tcPr>
-            <w:tcW w:type="dxa" w:w="2835"/>
+            <w:tcW w:type="dxa" w:w="1701"/>
+            <w:shd w:fill="D6E4F0" w:val="clear"/>
+          </w:tcPr>
+          <w:p>
+            <w:r>
+              <w:rPr>
+                <w:sz w:val="18"/>
+              </w:rPr>
+              <w:t>~200 lignes</w:t>
+            </w:r>
+          </w:p>
+        </w:tc>
+        <w:tc>
+          <w:tcPr>
+            <w:tcW w:type="dxa" w:w="1701"/>
             <w:shd w:fill="D6E4F0" w:val="clear"/>
           </w:tcPr>
           <w:p>
@@ -3246,7 +3629,7 @@
       <w:tr>
         <w:tc>
           <w:tcPr>
-            <w:tcW w:type="dxa" w:w="2835"/>
+            <w:tcW w:type="dxa" w:w="2268"/>
           </w:tcPr>
           <w:p>
             <w:r>
@@ -3259,20 +3642,33 @@
         </w:tc>
         <w:tc>
           <w:tcPr>
-            <w:tcW w:type="dxa" w:w="2551"/>
+            <w:tcW w:type="dxa" w:w="1701"/>
           </w:tcPr>
           <w:p>
             <w:r>
               <w:rPr>
                 <w:sz w:val="18"/>
               </w:rPr>
-              <w:t>~200</w:t>
+              <w:t>~200 lignes</w:t>
             </w:r>
           </w:p>
         </w:tc>
         <w:tc>
           <w:tcPr>
-            <w:tcW w:type="dxa" w:w="2835"/>
+            <w:tcW w:type="dxa" w:w="1701"/>
+          </w:tcPr>
+          <w:p>
+            <w:r>
+              <w:rPr>
+                <w:sz w:val="18"/>
+              </w:rPr>
+              <w:t>~200 lignes</w:t>
+            </w:r>
+          </w:p>
+        </w:tc>
+        <w:tc>
+          <w:tcPr>
+            <w:tcW w:type="dxa" w:w="1701"/>
           </w:tcPr>
           <w:p>
             <w:r>
@@ -3287,7 +3683,7 @@
       <w:tr>
         <w:tc>
           <w:tcPr>
-            <w:tcW w:type="dxa" w:w="2835"/>
+            <w:tcW w:type="dxa" w:w="2268"/>
             <w:shd w:fill="D6E4F0" w:val="clear"/>
           </w:tcPr>
           <w:p>
@@ -3301,7 +3697,7 @@
         </w:tc>
         <w:tc>
           <w:tcPr>
-            <w:tcW w:type="dxa" w:w="2551"/>
+            <w:tcW w:type="dxa" w:w="1701"/>
             <w:shd w:fill="D6E4F0" w:val="clear"/>
           </w:tcPr>
           <w:p>
@@ -3309,13 +3705,27 @@
               <w:rPr>
                 <w:sz w:val="18"/>
               </w:rPr>
-              <w:t>~150</w:t>
+              <w:t>~150 lignes</w:t>
             </w:r>
           </w:p>
         </w:tc>
         <w:tc>
           <w:tcPr>
-            <w:tcW w:type="dxa" w:w="2835"/>
+            <w:tcW w:type="dxa" w:w="1701"/>
+            <w:shd w:fill="D6E4F0" w:val="clear"/>
+          </w:tcPr>
+          <w:p>
+            <w:r>
+              <w:rPr>
+                <w:sz w:val="18"/>
+              </w:rPr>
+              <w:t>~150 lignes</w:t>
+            </w:r>
+          </w:p>
+        </w:tc>
+        <w:tc>
+          <w:tcPr>
+            <w:tcW w:type="dxa" w:w="1701"/>
             <w:shd w:fill="D6E4F0" w:val="clear"/>
           </w:tcPr>
           <w:p>
@@ -3331,7 +3741,7 @@
       <w:tr>
         <w:tc>
           <w:tcPr>
-            <w:tcW w:type="dxa" w:w="2835"/>
+            <w:tcW w:type="dxa" w:w="2268"/>
           </w:tcPr>
           <w:p>
             <w:r>
@@ -3344,20 +3754,33 @@
         </w:tc>
         <w:tc>
           <w:tcPr>
-            <w:tcW w:type="dxa" w:w="2551"/>
+            <w:tcW w:type="dxa" w:w="1701"/>
           </w:tcPr>
           <w:p>
             <w:r>
               <w:rPr>
                 <w:sz w:val="18"/>
               </w:rPr>
-              <w:t>~1 730 lignes</w:t>
+              <w:t>~1 150 lignes</w:t>
             </w:r>
           </w:p>
         </w:tc>
         <w:tc>
           <w:tcPr>
-            <w:tcW w:type="dxa" w:w="2835"/>
+            <w:tcW w:type="dxa" w:w="1701"/>
+          </w:tcPr>
+          <w:p>
+            <w:r>
+              <w:rPr>
+                <w:sz w:val="18"/>
+              </w:rPr>
+              <w:t>~1 480 lignes</w:t>
+            </w:r>
+          </w:p>
+        </w:tc>
+        <w:tc>
+          <w:tcPr>
+            <w:tcW w:type="dxa" w:w="1701"/>
           </w:tcPr>
           <w:p>
             <w:r>
@@ -3372,22 +3795,11 @@
     </w:tbl>
     <w:p/>
     <w:p>
-      <w:r>
-        <w:rPr>
-          <w:b/>
-        </w:rPr>
-        <w:t xml:space="preserve">Reduction de ~65% du code </w:t>
-      </w:r>
-      <w:r>
-        <w:t>avec l'approche API a la demande, ce qui reduit proportionnellement la surface de bugs et l'effort de maintenance.</w:t>
-      </w:r>
-    </w:p>
-    <w:p>
       <w:pPr>
         <w:pStyle w:val="Heading2"/>
       </w:pPr>
       <w:r>
-        <w:t>7.2 Infrastructure</w:t>
+        <w:t>8.2 Infrastructure</w:t>
       </w:r>
     </w:p>
     <w:tbl>
@@ -3398,9 +3810,10 @@
         <w:tblLook w:firstColumn="1" w:firstRow="1" w:lastColumn="0" w:lastRow="0" w:noHBand="0" w:noVBand="1" w:val="04A0"/>
       </w:tblPr>
       <w:tblGrid>
-        <w:gridCol w:w="2880"/>
-        <w:gridCol w:w="2880"/>
-        <w:gridCol w:w="2880"/>
+        <w:gridCol w:w="2160"/>
+        <w:gridCol w:w="2160"/>
+        <w:gridCol w:w="2160"/>
+        <w:gridCol w:w="2160"/>
       </w:tblGrid>
       <w:tr>
         <w:tc>
@@ -3424,7 +3837,7 @@
         </w:tc>
         <w:tc>
           <w:tcPr>
-            <w:tcW w:type="dxa" w:w="2835"/>
+            <w:tcW w:type="dxa" w:w="1701"/>
             <w:shd w:fill="2E74B5" w:val="clear"/>
           </w:tcPr>
           <w:p>
@@ -3437,13 +3850,13 @@
                 <w:color w:val="FFFFFF"/>
                 <w:sz w:val="18"/>
               </w:rPr>
-              <w:t>Scraping</w:t>
+              <w:t>V1 - HTML</w:t>
             </w:r>
           </w:p>
         </w:tc>
         <w:tc>
           <w:tcPr>
-            <w:tcW w:type="dxa" w:w="3118"/>
+            <w:tcW w:type="dxa" w:w="1984"/>
             <w:shd w:fill="2E74B5" w:val="clear"/>
           </w:tcPr>
           <w:p>
@@ -3456,7 +3869,26 @@
                 <w:color w:val="FFFFFF"/>
                 <w:sz w:val="18"/>
               </w:rPr>
-              <w:t>API a la demande</w:t>
+              <w:t>V2 - Algolia</w:t>
+            </w:r>
+          </w:p>
+        </w:tc>
+        <w:tc>
+          <w:tcPr>
+            <w:tcW w:type="dxa" w:w="1984"/>
+            <w:shd w:fill="2E74B5" w:val="clear"/>
+          </w:tcPr>
+          <w:p>
+            <w:pPr>
+              <w:jc w:val="center"/>
+            </w:pPr>
+            <w:r>
+              <w:rPr>
+                <w:b/>
+                <w:color w:val="FFFFFF"/>
+                <w:sz w:val="18"/>
+              </w:rPr>
+              <w:t>V3 - API demande</w:t>
             </w:r>
           </w:p>
         </w:tc>
@@ -3477,27 +3909,40 @@
         </w:tc>
         <w:tc>
           <w:tcPr>
-            <w:tcW w:type="dxa" w:w="2835"/>
+            <w:tcW w:type="dxa" w:w="1701"/>
           </w:tcPr>
           <w:p>
             <w:r>
               <w:rPr>
                 <w:sz w:val="18"/>
               </w:rPr>
-              <w:t>Requis (scanned_events)</w:t>
+              <w:t>Requis</w:t>
             </w:r>
           </w:p>
         </w:tc>
         <w:tc>
           <w:tcPr>
-            <w:tcW w:type="dxa" w:w="3118"/>
+            <w:tcW w:type="dxa" w:w="1984"/>
           </w:tcPr>
           <w:p>
             <w:r>
               <w:rPr>
                 <w:sz w:val="18"/>
               </w:rPr>
-              <w:t>Optionnel (cache/users)</w:t>
+              <w:t>Requis</w:t>
+            </w:r>
+          </w:p>
+        </w:tc>
+        <w:tc>
+          <w:tcPr>
+            <w:tcW w:type="dxa" w:w="1984"/>
+          </w:tcPr>
+          <w:p>
+            <w:r>
+              <w:rPr>
+                <w:sz w:val="18"/>
+              </w:rPr>
+              <w:t>Optionnel (cache)</w:t>
             </w:r>
           </w:p>
         </w:tc>
@@ -3519,7 +3964,7 @@
         </w:tc>
         <w:tc>
           <w:tcPr>
-            <w:tcW w:type="dxa" w:w="2835"/>
+            <w:tcW w:type="dxa" w:w="1701"/>
             <w:shd w:fill="D6E4F0" w:val="clear"/>
           </w:tcPr>
           <w:p>
@@ -3533,7 +3978,21 @@
         </w:tc>
         <w:tc>
           <w:tcPr>
-            <w:tcW w:type="dxa" w:w="3118"/>
+            <w:tcW w:type="dxa" w:w="1984"/>
+            <w:shd w:fill="D6E4F0" w:val="clear"/>
+          </w:tcPr>
+          <w:p>
+            <w:r>
+              <w:rPr>
+                <w:sz w:val="18"/>
+              </w:rPr>
+              <w:t>Non utilise</w:t>
+            </w:r>
+          </w:p>
+        </w:tc>
+        <w:tc>
+          <w:tcPr>
+            <w:tcW w:type="dxa" w:w="1984"/>
             <w:shd w:fill="D6E4F0" w:val="clear"/>
           </w:tcPr>
           <w:p>
@@ -3562,27 +4021,40 @@
         </w:tc>
         <w:tc>
           <w:tcPr>
-            <w:tcW w:type="dxa" w:w="2835"/>
+            <w:tcW w:type="dxa" w:w="1701"/>
           </w:tcPr>
           <w:p>
             <w:r>
               <w:rPr>
                 <w:sz w:val="18"/>
               </w:rPr>
-              <w:t>Pour scraping + cle API</w:t>
+              <w:t>Requis (scraping)</w:t>
             </w:r>
           </w:p>
         </w:tc>
         <w:tc>
           <w:tcPr>
-            <w:tcW w:type="dxa" w:w="3118"/>
+            <w:tcW w:type="dxa" w:w="1984"/>
           </w:tcPr>
           <w:p>
             <w:r>
               <w:rPr>
                 <w:sz w:val="18"/>
               </w:rPr>
-              <w:t>Uniquement pour cle API</w:t>
+              <w:t>Requis (cle API)</w:t>
+            </w:r>
+          </w:p>
+        </w:tc>
+        <w:tc>
+          <w:tcPr>
+            <w:tcW w:type="dxa" w:w="1984"/>
+          </w:tcPr>
+          <w:p>
+            <w:r>
+              <w:rPr>
+                <w:sz w:val="18"/>
+              </w:rPr>
+              <w:t>Requis (cle API)</w:t>
             </w:r>
           </w:p>
         </w:tc>
@@ -3604,7 +4076,7 @@
         </w:tc>
         <w:tc>
           <w:tcPr>
-            <w:tcW w:type="dxa" w:w="2835"/>
+            <w:tcW w:type="dxa" w:w="1701"/>
             <w:shd w:fill="D6E4F0" w:val="clear"/>
           </w:tcPr>
           <w:p>
@@ -3612,13 +4084,27 @@
               <w:rPr>
                 <w:sz w:val="18"/>
               </w:rPr>
-              <w:t>Requis (sync periodique)</w:t>
+              <w:t>Requis (sync)</w:t>
             </w:r>
           </w:p>
         </w:tc>
         <w:tc>
           <w:tcPr>
-            <w:tcW w:type="dxa" w:w="3118"/>
+            <w:tcW w:type="dxa" w:w="1984"/>
+            <w:shd w:fill="D6E4F0" w:val="clear"/>
+          </w:tcPr>
+          <w:p>
+            <w:r>
+              <w:rPr>
+                <w:sz w:val="18"/>
+              </w:rPr>
+              <w:t>Requis (sync)</w:t>
+            </w:r>
+          </w:p>
+        </w:tc>
+        <w:tc>
+          <w:tcPr>
+            <w:tcW w:type="dxa" w:w="1984"/>
             <w:shd w:fill="D6E4F0" w:val="clear"/>
           </w:tcPr>
           <w:p>
@@ -3647,20 +4133,33 @@
         </w:tc>
         <w:tc>
           <w:tcPr>
-            <w:tcW w:type="dxa" w:w="2835"/>
+            <w:tcW w:type="dxa" w:w="1701"/>
           </w:tcPr>
           <w:p>
             <w:r>
               <w:rPr>
                 <w:sz w:val="18"/>
               </w:rPr>
-              <w:t>~500 Mo (110k events)</w:t>
+              <w:t>~500 Mo</w:t>
             </w:r>
           </w:p>
         </w:tc>
         <w:tc>
           <w:tcPr>
-            <w:tcW w:type="dxa" w:w="3118"/>
+            <w:tcW w:type="dxa" w:w="1984"/>
+          </w:tcPr>
+          <w:p>
+            <w:r>
+              <w:rPr>
+                <w:sz w:val="18"/>
+              </w:rPr>
+              <w:t>~500 Mo</w:t>
+            </w:r>
+          </w:p>
+        </w:tc>
+        <w:tc>
+          <w:tcPr>
+            <w:tcW w:type="dxa" w:w="1984"/>
           </w:tcPr>
           <w:p>
             <w:r>
@@ -3683,7 +4182,7 @@
         <w:pStyle w:val="Heading1"/>
       </w:pPr>
       <w:r>
-        <w:t>8. Recommandation finale</w:t>
+        <w:t>9. Recommandation finale</w:t>
       </w:r>
     </w:p>
     <w:p>
@@ -3691,12 +4190,31 @@
         <w:pStyle w:val="Heading2"/>
       </w:pPr>
       <w:r>
-        <w:t>8.1 Approche recommandee : Hybride</w:t>
+        <w:t>9.1 Synthese</w:t>
       </w:r>
     </w:p>
     <w:p>
       <w:r>
-        <w:t>L'approche recommandee est un modele hybride qui combine les avantages des deux architectures :</w:t>
+        <w:t>V1 (scraping HTML) a permis de demarrer le projet et de valider le concept, mais cette approche est fragile, lente et limitee en donnees.</w:t>
+        <w:br/>
+        <w:br/>
+        <w:t>V2 (scraping Algolia) a apporte un gain majeur en termes de vitesse, de completude des donnees et de stabilite. Le mecanisme d'auto-renouvellement de la cle API resout le probleme de l'expiration.</w:t>
+        <w:br/>
+        <w:br/>
+        <w:t>V3 (API a la demande) est l'evolution logique pour un cas d'usage centre sur la recherche d'evenements par localisation : elle est plus simple, garantit des donnees fraiches, et exploite le filtrage geographique natif d'Algolia.</w:t>
+      </w:r>
+    </w:p>
+    <w:p>
+      <w:pPr>
+        <w:pStyle w:val="Heading2"/>
+      </w:pPr>
+      <w:r>
+        <w:t>9.2 Approche recommandee : Hybride V2+V3</w:t>
+      </w:r>
+    </w:p>
+    <w:p>
+      <w:r>
+        <w:t>L'approche recommandee combine les avantages de V2 et V3 :</w:t>
       </w:r>
     </w:p>
     <w:p/>
@@ -3706,10 +4224,10 @@
           <w:b/>
           <w:color w:val="2E74B5"/>
         </w:rPr>
-        <w:t xml:space="preserve">API a la demande pour les requetes utilisateur : </w:t>
+        <w:t xml:space="preserve">API a la demande pour les requetes utilisateur (V3) : </w:t>
       </w:r>
       <w:r>
-        <w:t>Les recherches geographiques et par categorie sont transmises directement a Algolia avec les filtres natifs (aroundLatLng, facetFilters). Cela garantit des donnees toujours fraiches et un filtrage performant.</w:t>
+        <w:t>Les recherches geographiques et par categorie sont transmises directement a Algolia avec les filtres natifs (aroundLatLng, facetFilters). Donnees toujours fraiches, filtrage performant.</w:t>
       </w:r>
     </w:p>
     <w:p>
@@ -3721,7 +4239,7 @@
         <w:t xml:space="preserve">Cache intelligent : </w:t>
       </w:r>
       <w:r>
-        <w:t>Un cache Redis (TTL 15-30 min) stocke les resultats des requetes frequentes pour eviter de surcharger Algolia et reduire la latence.</w:t>
+        <w:t>Un cache Redis (TTL 15-30 min) stocke les resultats des requetes frequentes pour reduire la latence et eviter de surcharger Algolia.</w:t>
       </w:r>
     </w:p>
     <w:p>
@@ -3730,10 +4248,10 @@
           <w:b/>
           <w:color w:val="2E74B5"/>
         </w:rPr>
-        <w:t xml:space="preserve">Renouvellement automatique de la cle : </w:t>
+        <w:t xml:space="preserve">Renouvellement automatique de la cle (V2) : </w:t>
       </w:r>
       <w:r>
-        <w:t>Le service algolia_key_service.py existant gere le renouvellement transparent de la cle API expiree.</w:t>
+        <w:t>Le service algolia_key_service.py gere le renouvellement transparent de la cle API expiree, commun a V2 et V3.</w:t>
       </w:r>
     </w:p>
     <w:p>
@@ -3742,10 +4260,10 @@
           <w:b/>
           <w:color w:val="2E74B5"/>
         </w:rPr>
-        <w:t xml:space="preserve">Base PostgreSQL allegee : </w:t>
+        <w:t xml:space="preserve">Export massif optionnel (V2) : </w:t>
       </w:r>
       <w:r>
-        <w:t>PostgreSQL conserve uniquement les donnees utilisateur (favoris, preferences, historique) et eventuellement un cache d'evenements pour l'analytique.</w:t>
+        <w:t>Conserver la possibilite d'export CSV/JSON via algolia_service.py pour les besoins d'analytique ou d'archivage.</w:t>
       </w:r>
     </w:p>
     <w:p>
@@ -3753,52 +4271,7 @@
         <w:pStyle w:val="Heading2"/>
       </w:pPr>
       <w:r>
-        <w:t>8.2 Quand garder le scraping</w:t>
-      </w:r>
-    </w:p>
-    <w:p>
-      <w:r>
-        <w:t>Le scraping massif reste pertinent dans les cas suivants :</w:t>
-      </w:r>
-    </w:p>
-    <w:p>
-      <w:pPr>
-        <w:pStyle w:val="ListBullet"/>
-      </w:pPr>
-      <w:r>
-        <w:t>Besoin d'analytique avancee (statistiques, tendances, rapports)</w:t>
-      </w:r>
-    </w:p>
-    <w:p>
-      <w:pPr>
-        <w:pStyle w:val="ListBullet"/>
-      </w:pPr>
-      <w:r>
-        <w:t>Mode offline requis (application mobile sans connexion)</w:t>
-      </w:r>
-    </w:p>
-    <w:p>
-      <w:pPr>
-        <w:pStyle w:val="ListBullet"/>
-      </w:pPr>
-      <w:r>
-        <w:t>Besoin de croiser avec d'autres sources de donnees localement</w:t>
-      </w:r>
-    </w:p>
-    <w:p>
-      <w:pPr>
-        <w:pStyle w:val="ListBullet"/>
-      </w:pPr>
-      <w:r>
-        <w:t>Requirement de conserver un historique des evenements passes</w:t>
-      </w:r>
-    </w:p>
-    <w:p>
-      <w:pPr>
-        <w:pStyle w:val="Heading2"/>
-      </w:pPr>
-      <w:r>
-        <w:t>8.3 Matrice de decision</w:t>
+        <w:t>9.3 Matrice de decision</w:t>
       </w:r>
     </w:p>
     <w:tbl>
@@ -3875,7 +4348,7 @@
               <w:rPr>
                 <w:sz w:val="18"/>
               </w:rPr>
-              <w:t>API a la demande</w:t>
+              <w:t>V3 - API a la demande</w:t>
             </w:r>
           </w:p>
         </w:tc>
@@ -3905,7 +4378,7 @@
               <w:rPr>
                 <w:sz w:val="18"/>
               </w:rPr>
-              <w:t>Scraping + sync</w:t>
+              <w:t>V2 - Scraping Algolia + sync</w:t>
             </w:r>
           </w:p>
         </w:tc>
@@ -3933,7 +4406,7 @@
               <w:rPr>
                 <w:sz w:val="18"/>
               </w:rPr>
-              <w:t>Scraping (donnees locales)</w:t>
+              <w:t>V2 - Scraping Algolia (donnees locales)</w:t>
             </w:r>
           </w:p>
         </w:tc>
@@ -3963,7 +4436,7 @@
               <w:rPr>
                 <w:sz w:val="18"/>
               </w:rPr>
-              <w:t>Hybride (cache + ML local)</w:t>
+              <w:t>Hybride V2+V3 (cache + ML local)</w:t>
             </w:r>
           </w:p>
         </w:tc>
@@ -3991,7 +4464,7 @@
               <w:rPr>
                 <w:sz w:val="18"/>
               </w:rPr>
-              <w:t>API a la demande</w:t>
+              <w:t>V3 - API a la demande</w:t>
             </w:r>
           </w:p>
         </w:tc>
@@ -4021,7 +4494,35 @@
               <w:rPr>
                 <w:sz w:val="18"/>
               </w:rPr>
-              <w:t>Scraping</w:t>
+              <w:t>V2 - Scraping Algolia</w:t>
+            </w:r>
+          </w:p>
+        </w:tc>
+      </w:tr>
+      <w:tr>
+        <w:tc>
+          <w:tcPr>
+            <w:tcW w:type="dxa" w:w="3969"/>
+          </w:tcPr>
+          <w:p>
+            <w:r>
+              <w:rPr>
+                <w:sz w:val="18"/>
+              </w:rPr>
+              <w:t>Prototype rapide</w:t>
+            </w:r>
+          </w:p>
+        </w:tc>
+        <w:tc>
+          <w:tcPr>
+            <w:tcW w:type="dxa" w:w="3969"/>
+          </w:tcPr>
+          <w:p>
+            <w:r>
+              <w:rPr>
+                <w:sz w:val="18"/>
+              </w:rPr>
+              <w:t>V1 - Scraping HTML (deja en place)</w:t>
             </w:r>
           </w:p>
         </w:tc>
@@ -4037,12 +4538,12 @@
         <w:pStyle w:val="Heading1"/>
       </w:pPr>
       <w:r>
-        <w:t>9. Plan de migration</w:t>
+        <w:t>10. Plan de migration vers V3</w:t>
       </w:r>
     </w:p>
     <w:p>
       <w:r>
-        <w:t>Si la decision est prise de migrer vers l'approche API a la demande, voici les etapes recommandees :</w:t>
+        <w:t>Si la decision est prise de migrer vers l'approche V3 (API a la demande), voici les etapes recommandees :</w:t>
       </w:r>
     </w:p>
     <w:p>
@@ -4186,7 +4687,7 @@
         <w:pStyle w:val="ListBullet"/>
       </w:pPr>
       <w:r>
-        <w:t>Supprimer les services inutilises (scraper, storage, opendata)</w:t>
+        <w:t>Supprimer scraper_service.py (V1 obsolete)</w:t>
       </w:r>
     </w:p>
     <w:p>
@@ -4203,6 +4704,14 @@
       </w:pPr>
       <w:r>
         <w:t>Mettre a jour la documentation</w:t>
+      </w:r>
+    </w:p>
+    <w:p>
+      <w:pPr>
+        <w:pStyle w:val="ListBullet"/>
+      </w:pPr>
+      <w:r>
+        <w:t>Conserver algolia_service.py et export_events.py pour l'export ponctuel</w:t>
       </w:r>
     </w:p>
     <w:p/>
@@ -4229,12 +4738,19 @@
     </w:p>
     <w:p>
       <w:r>
-        <w:t>L'approche actuelle par scraping massif a permis de construire une base solide avec 3 pipelines d'ingestion, un mecanisme de deduplication et un renouvellement automatique de la cle API. Cependant, pour un cas d'usage centre sur la recherche d'evenements par localisation, l'approche API a la demande est plus adaptee : elle est plus simple, plus fiable, et garantit des donnees toujours a jour.</w:t>
-      </w:r>
-    </w:p>
-    <w:p>
-      <w:r>
-        <w:t>L'approche hybride recommandee conserve le meilleur des deux mondes : la fraicheur des donnees en temps reel, le filtrage geographique natif d'Algolia, et la possibilite de maintenir un cache local pour les performances et l'analytique.</w:t>
+        <w:t>Le projet a evolue en trois etapes naturelles :</w:t>
+        <w:br/>
+        <w:br/>
+        <w:t>V1 (scraping HTML) a permis de valider le concept et de construire l'infrastructure de base (API, base de donnees, modeles).</w:t>
+        <w:br/>
+        <w:br/>
+        <w:t>V2 (scraping Algolia) a apporte un saut qualitatif majeur : acces a l'integralite des 110k+ evenements avec toutes leurs metadonnees, et un mecanisme robuste de renouvellement de cle API.</w:t>
+        <w:br/>
+        <w:br/>
+        <w:t>V3 (API a la demande) est l'evolution naturelle pour un produit centre sur la recherche d'evenements par localisation. Elle simplifie drastiquement l'architecture tout en garantissant des donnees toujours a jour et un filtrage geographique performant.</w:t>
+        <w:br/>
+        <w:br/>
+        <w:t>L'approche hybride V2+V3 recommandee permet de conserver le meilleur de chaque version selon les besoins.</w:t>
       </w:r>
     </w:p>
     <w:p/>

</xml_diff>

<commit_message>
docs: correction des accents dans le rapport Word
Tous les accents français manquants ont été ajoutés
(récupération, événements, données, clé, nécessite, etc.)

Co-Authored-By: Claude Opus 4.6 <noreply@anthropic.com>
</commit_message>
<xml_diff>
--- a/backend/doc/rapport_comparatif_scraping_vs_api.docx
+++ b/backend/doc/rapport_comparatif_scraping_vs_api.docx
@@ -30,9 +30,9 @@
           <w:color w:val="595959"/>
           <w:sz w:val="32"/>
         </w:rPr>
-        <w:t>Trois approches pour la recuperation</w:t>
+        <w:t>Trois approches pour la récupération</w:t>
         <w:br/>
-        <w:t>des evenements Infolocale</w:t>
+        <w:t>des événements Infolocale</w:t>
       </w:r>
     </w:p>
     <w:p/>
@@ -62,7 +62,7 @@
         <w:pStyle w:val="Heading1"/>
       </w:pPr>
       <w:r>
-        <w:t>Table des matieres</w:t>
+        <w:t>Table des matières</w:t>
       </w:r>
     </w:p>
     <w:p>
@@ -78,7 +78,7 @@
         <w:spacing w:after="40"/>
       </w:pPr>
       <w:r>
-        <w:t>2. V1 - Scraping HTML (architecture originale)</w:t>
+        <w:t>2. V1 – Scraping HTML (architecture originale)</w:t>
       </w:r>
     </w:p>
     <w:p>
@@ -86,7 +86,7 @@
         <w:spacing w:after="40"/>
       </w:pPr>
       <w:r>
-        <w:t>3. V2 - Scraping via API Algolia</w:t>
+        <w:t>3. V2 – Scraping via API Algolia</w:t>
       </w:r>
     </w:p>
     <w:p>
@@ -94,7 +94,7 @@
         <w:spacing w:after="40"/>
       </w:pPr>
       <w:r>
-        <w:t>4. V3 - API a la demande (architecture proposee)</w:t>
+        <w:t>4. V3 – API à la demande (architecture proposée)</w:t>
       </w:r>
     </w:p>
     <w:p>
@@ -102,7 +102,7 @@
         <w:spacing w:after="40"/>
       </w:pPr>
       <w:r>
-        <w:t>5. Comparaison detaillee des 3 approches</w:t>
+        <w:t>5. Comparaison détaillée des 3 approches</w:t>
       </w:r>
     </w:p>
     <w:p>
@@ -118,7 +118,7 @@
         <w:spacing w:after="40"/>
       </w:pPr>
       <w:r>
-        <w:t>7. Performance et scalabilite</w:t>
+        <w:t>7. Performance et scalabilité</w:t>
       </w:r>
     </w:p>
     <w:p>
@@ -126,7 +126,7 @@
         <w:spacing w:after="40"/>
       </w:pPr>
       <w:r>
-        <w:t>8. Cout et maintenance</w:t>
+        <w:t>8. Coût et maintenance</w:t>
       </w:r>
     </w:p>
     <w:p>
@@ -160,7 +160,7 @@
     </w:p>
     <w:p>
       <w:r>
-        <w:t>Le projet scraping_infolocale a pour objectif de recuperer les evenements publies sur la plateforme infolocale.fr (propriete du groupe Ouest-France) et de les mettre a disposition via une API REST et une interface frontend.</w:t>
+        <w:t>Le projet scraping_infolocale a pour objectif de récupérer les événements publiés sur la plateforme infolocale.fr (propriété du groupe Ouest-France) et de les mettre à disposition via une API REST et une interface frontend.</w:t>
       </w:r>
     </w:p>
     <w:p>
@@ -168,12 +168,12 @@
         <w:pStyle w:val="Heading2"/>
       </w:pPr>
       <w:r>
-        <w:t>1.1 Source de donnees</w:t>
+        <w:t>1.1 Source de données</w:t>
       </w:r>
     </w:p>
     <w:p>
       <w:r>
-        <w:t>Infolocale.fr est une plateforme d'evenements locaux couvrant l'ensemble du territoire francais. Le site affiche les evenements sous forme de cartes HTML et utilise en interne un index Algolia (memo_events, 110 000+ evenements) pour la recherche cote frontend.</w:t>
+        <w:t>Infolocale.fr est une plateforme d'événements locaux couvrant l'ensemble du territoire français. Le site affiche les événements sous forme de cartes HTML et utilise en interne un index Algolia (memo_events, 110 000+ événements) pour la recherche côté frontend.</w:t>
       </w:r>
     </w:p>
     <w:p>
@@ -186,7 +186,7 @@
     </w:p>
     <w:p>
       <w:r>
-        <w:t>Ce rapport compare trois architectures possibles pour exploiter ces donnees :</w:t>
+        <w:t>Ce rapport compare trois architectures possibles pour exploiter ces données :</w:t>
       </w:r>
     </w:p>
     <w:p>
@@ -194,10 +194,10 @@
         <w:rPr>
           <w:b/>
         </w:rPr>
-        <w:t xml:space="preserve">V1 - Scraping HTML (originale) : </w:t>
+        <w:t xml:space="preserve">V1 – Scraping HTML (originale) : </w:t>
       </w:r>
       <w:r>
-        <w:t>Parcourir les pages HTML d'infolocale.fr avec Selenium et BeautifulSoup pour extraire les evenements, les stocker en base PostgreSQL, puis les servir via une API FastAPI.</w:t>
+        <w:t>Parcourir les pages HTML d'infolocale.fr avec Selenium et BeautifulSoup pour extraire les événements, les stocker en base PostgreSQL, puis les servir via une API FastAPI.</w:t>
       </w:r>
     </w:p>
     <w:p>
@@ -205,10 +205,10 @@
         <w:rPr>
           <w:b/>
         </w:rPr>
-        <w:t xml:space="preserve">V2 - Scraping Algolia : </w:t>
+        <w:t xml:space="preserve">V2 – Scraping Algolia : </w:t>
       </w:r>
       <w:r>
-        <w:t>Interroger directement l'API Algolia (index memo_events) pour recuperer massivement les evenements, les stocker en base et les servir via l'API. Necessite une cle API avec auto-renouvellement.</w:t>
+        <w:t>Interroger directement l'API Algolia (index memo_events) pour récupérer massivement les événements, les stocker en base et les servir via l'API. Nécessite une clé API avec auto-renouvellement.</w:t>
       </w:r>
     </w:p>
     <w:p>
@@ -216,10 +216,10 @@
         <w:rPr>
           <w:b/>
         </w:rPr>
-        <w:t xml:space="preserve">V3 - API a la demande (proposee) : </w:t>
+        <w:t xml:space="preserve">V3 – API à la demande (proposée) : </w:t>
       </w:r>
       <w:r>
-        <w:t>L'API FastAPI interroge Algolia en temps reel a chaque requete utilisateur, en utilisant les filtres geographiques natifs d'Algolia. Pas de stockage local des evenements.</w:t>
+        <w:t>L'API FastAPI interroge Algolia en temps réel à chaque requête utilisateur, en utilisant les filtres géographiques natifs d'Algolia. Pas de stockage local des événements.</w:t>
       </w:r>
     </w:p>
     <w:p>
@@ -232,7 +232,7 @@
         <w:pStyle w:val="Heading1"/>
       </w:pPr>
       <w:r>
-        <w:t>2. V1 - Scraping HTML (architecture originale)</w:t>
+        <w:t>2. V1 – Scraping HTML (architecture originale)</w:t>
       </w:r>
     </w:p>
     <w:p>
@@ -245,7 +245,7 @@
     </w:p>
     <w:p>
       <w:r>
-        <w:t>L'architecture originale du projet repose sur le scraping classique des pages HTML du site infolocale.fr. Un navigateur Chrome pilote par Selenium charge chaque page de resultats, puis BeautifulSoup extrait les informations des cartes d'evenements.</w:t>
+        <w:t>L'architecture originale du projet repose sur le scraping classique des pages HTML du site infolocale.fr. Un navigateur Chrome piloté par Selenium charge chaque page de résultats, puis BeautifulSoup extrait les informations des cartes d'événements.</w:t>
       </w:r>
     </w:p>
     <w:p>
@@ -253,12 +253,12 @@
         <w:pStyle w:val="Heading2"/>
       </w:pPr>
       <w:r>
-        <w:t>2.2 Pipeline de donnees</w:t>
+        <w:t>2.2 Pipeline de données</w:t>
       </w:r>
     </w:p>
     <w:p>
       <w:r>
-        <w:t>1. Selenium charge une page de resultats sur infolocale.fr</w:t>
+        <w:t>1. Selenium charge une page de résultats sur infolocale.fr</w:t>
       </w:r>
     </w:p>
     <w:p>
@@ -268,27 +268,27 @@
     </w:p>
     <w:p>
       <w:r>
-        <w:t>3. Chaque carte est transformee en objet evenement (titre, date, lieu, image...)</w:t>
+        <w:t>3. Chaque carte est transformée en objet événement (titre, date, lieu, image…)</w:t>
       </w:r>
     </w:p>
     <w:p>
       <w:r>
-        <w:t>4. Les dates en francais sont parsees (ex: "sam. 15 mars" -&gt; 2026-03-15)</w:t>
+        <w:t>4. Les dates en français sont parsées (ex : « sam. 15 mars » → 2026-03-15)</w:t>
       </w:r>
     </w:p>
     <w:p>
       <w:r>
-        <w:t>5. Les evenements sont stockes en base PostgreSQL (table scanned_events)</w:t>
+        <w:t>5. Les événements sont stockés en base PostgreSQL (table scanned_events)</w:t>
       </w:r>
     </w:p>
     <w:p>
       <w:r>
-        <w:t>6. Deduplication via UPSERT sur le champ uid (infolocale_{data_id})</w:t>
+        <w:t>6. Déduplication via UPSERT sur le champ uid (infolocale_{data_id})</w:t>
       </w:r>
     </w:p>
     <w:p>
       <w:r>
-        <w:t>7. Enrichissement optionnel : geocoding via OpenRouteService</w:t>
+        <w:t>7. Enrichissement optionnel : géocodage via OpenRouteService</w:t>
       </w:r>
     </w:p>
     <w:p>
@@ -370,7 +370,7 @@
                 <w:color w:val="FFFFFF"/>
                 <w:sz w:val="18"/>
               </w:rPr>
-              <w:t>Role</w:t>
+              <w:t>Rôle</w:t>
             </w:r>
           </w:p>
         </w:tc>
@@ -540,7 +540,7 @@
               <w:rPr>
                 <w:sz w:val="18"/>
               </w:rPr>
-              <w:t>Modeles et validation</w:t>
+              <w:t>Modèles et validation</w:t>
             </w:r>
           </w:p>
         </w:tc>
@@ -555,7 +555,7 @@
               <w:rPr>
                 <w:sz w:val="18"/>
               </w:rPr>
-              <w:t>Base de donnees</w:t>
+              <w:t>Base de données</w:t>
             </w:r>
           </w:p>
         </w:tc>
@@ -581,7 +581,7 @@
               <w:rPr>
                 <w:sz w:val="18"/>
               </w:rPr>
-              <w:t>Stockage evenements</w:t>
+              <w:t>Stockage événements</w:t>
             </w:r>
           </w:p>
         </w:tc>
@@ -597,7 +597,7 @@
               <w:rPr>
                 <w:sz w:val="18"/>
               </w:rPr>
-              <w:t>Geocoding</w:t>
+              <w:t>Géocodage</w:t>
             </w:r>
           </w:p>
         </w:tc>
@@ -625,7 +625,7 @@
               <w:rPr>
                 <w:sz w:val="18"/>
               </w:rPr>
-              <w:t>Enrichissement geographique</w:t>
+              <w:t>Enrichissement géographique</w:t>
             </w:r>
           </w:p>
         </w:tc>
@@ -666,7 +666,7 @@
               <w:rPr>
                 <w:sz w:val="18"/>
               </w:rPr>
-              <w:t>Schema de base</w:t>
+              <w:t>Schéma de base</w:t>
             </w:r>
           </w:p>
         </w:tc>
@@ -729,7 +729,7 @@
         <w:pStyle w:val="ListBullet"/>
       </w:pPr>
       <w:r>
-        <w:t>Lent : ~50 evenements par page, pagination manuelle, 2s de delai entre chaque page</w:t>
+        <w:t>Lent : ~50 événements par page, pagination manuelle, 2 s de délai entre chaque page</w:t>
       </w:r>
     </w:p>
     <w:p>
@@ -737,7 +737,7 @@
         <w:pStyle w:val="ListBullet"/>
       </w:pPr>
       <w:r>
-        <w:t>Fragile : depend de la structure HTML (selecteurs CSS .memo-card, .gender, .day...)</w:t>
+        <w:t>Fragile : dépend de la structure HTML (sélecteurs CSS .memo-card, .gender, .day…)</w:t>
       </w:r>
     </w:p>
     <w:p>
@@ -745,7 +745,7 @@
         <w:pStyle w:val="ListBullet"/>
       </w:pPr>
       <w:r>
-        <w:t>WAF : le site est protege par un WAF Ouest-France qui bloque les navigateurs headless</w:t>
+        <w:t>WAF : le site est protégé par un WAF Ouest-France qui bloque les navigateurs headless</w:t>
       </w:r>
     </w:p>
     <w:p>
@@ -753,7 +753,7 @@
         <w:pStyle w:val="ListBullet"/>
       </w:pPr>
       <w:r>
-        <w:t>Incomplet : seules les informations visibles sur la carte sont recuperees (pas de description complete)</w:t>
+        <w:t>Incomplet : seules les informations visibles sur la carte sont récupérées (pas de description complète)</w:t>
       </w:r>
     </w:p>
     <w:p>
@@ -761,7 +761,7 @@
         <w:pStyle w:val="ListBullet"/>
       </w:pPr>
       <w:r>
-        <w:t>Volume limite : scraper 110k evenements prendrait des heures</w:t>
+        <w:t>Volume limité : scraper 110k événements prendrait des heures</w:t>
       </w:r>
     </w:p>
     <w:p>
@@ -769,7 +769,7 @@
         <w:pStyle w:val="ListBullet"/>
       </w:pPr>
       <w:r>
-        <w:t>Maintenance : tout changement de design du site casse les selecteurs</w:t>
+        <w:t>Maintenance : tout changement de design du site casse les sélecteurs</w:t>
       </w:r>
     </w:p>
     <w:p>
@@ -782,7 +782,7 @@
         <w:pStyle w:val="Heading1"/>
       </w:pPr>
       <w:r>
-        <w:t>3. V2 - Scraping via API Algolia</w:t>
+        <w:t>3. V2 – Scraping via API Algolia</w:t>
       </w:r>
     </w:p>
     <w:p>
@@ -795,7 +795,7 @@
     </w:p>
     <w:p>
       <w:r>
-        <w:t>Cette approche contourne le HTML en interrogeant directement l'API Algolia utilisee par le frontend d'infolocale.fr. L'index memo_events contient l'integralite des evenements avec toutes leurs metadonnees (titre, texte, lieu, coordonnees GPS, dates, categories, photos...).</w:t>
+        <w:t>Cette approche contourne le HTML en interrogeant directement l'API Algolia utilisée par le frontend d'infolocale.fr. L'index memo_events contient l'intégralité des événements avec toutes leurs métadonnées (titre, texte, lieu, coordonnées GPS, dates, catégories, photos…).</w:t>
       </w:r>
     </w:p>
     <w:p>
@@ -803,22 +803,22 @@
         <w:pStyle w:val="Heading2"/>
       </w:pPr>
       <w:r>
-        <w:t>3.2 Pipeline de donnees</w:t>
+        <w:t>3.2 Pipeline de données</w:t>
       </w:r>
     </w:p>
     <w:p>
       <w:r>
-        <w:t>1. Appel a l'endpoint Browse d'Algolia (pagination par cursor, sans limite de 1000)</w:t>
+        <w:t>1. Appel à l'endpoint Browse d'Algolia (pagination par cursor, sans limite de 1000)</w:t>
       </w:r>
     </w:p>
     <w:p>
       <w:r>
-        <w:t>2. Recuperation de tous les evenements avec leurs metadonnees completes</w:t>
+        <w:t>2. Récupération de tous les événements avec leurs métadonnées complètes</w:t>
       </w:r>
     </w:p>
     <w:p>
       <w:r>
-        <w:t>3. Aplatissement des champs imbriques (lieu, rubrique, _geoloc, photo)</w:t>
+        <w:t>3. Aplatissement des champs imbriqués (lieu, rubrique, _geoloc, photo)</w:t>
       </w:r>
     </w:p>
     <w:p>
@@ -836,12 +836,12 @@
         <w:pStyle w:val="Heading2"/>
       </w:pPr>
       <w:r>
-        <w:t>3.3 Gestion de la cle API</w:t>
+        <w:t>3.3 Gestion de la clé API</w:t>
       </w:r>
     </w:p>
     <w:p>
       <w:r>
-        <w:t>L'acces a l'API Algolia necessite une "secured key" (base64) avec un champ validUntil qui expire regulierement. Le service algolia_key_service.py gere le renouvellement automatique :</w:t>
+        <w:t>L'accès à l'API Algolia nécessite une « secured key » (base64) avec un champ validUntil qui expire régulièrement. Le service algolia_key_service.py gère le renouvellement automatique :</w:t>
       </w:r>
     </w:p>
     <w:p>
@@ -849,7 +849,7 @@
         <w:pStyle w:val="ListBullet"/>
       </w:pPr>
       <w:r>
-        <w:t>Lancement de Chrome headless avec options anti-detection (stealth)</w:t>
+        <w:t>Lancement de Chrome headless avec options anti-détection (stealth)</w:t>
       </w:r>
     </w:p>
     <w:p>
@@ -857,7 +857,7 @@
         <w:pStyle w:val="ListBullet"/>
       </w:pPr>
       <w:r>
-        <w:t>Chargement de infolocale.fr/activites pour declencher les requetes Algolia</w:t>
+        <w:t>Chargement de infolocale.fr/activités pour déclencher les requêtes Algolia</w:t>
       </w:r>
     </w:p>
     <w:p>
@@ -865,7 +865,7 @@
         <w:pStyle w:val="ListBullet"/>
       </w:pPr>
       <w:r>
-        <w:t>Interception des requetes reseau via Chrome DevTools Protocol (CDP)</w:t>
+        <w:t>Interception des requêtes réseau via Chrome DevTools Protocol (CDP)</w:t>
       </w:r>
     </w:p>
     <w:p>
@@ -873,7 +873,7 @@
         <w:pStyle w:val="ListBullet"/>
       </w:pPr>
       <w:r>
-        <w:t>Extraction de la cle depuis les parametres d'URL (x-algolia-api-key)</w:t>
+        <w:t>Extraction de la clé depuis les paramètres d'URL (x-algolia-api-key)</w:t>
       </w:r>
     </w:p>
     <w:p>
@@ -881,7 +881,7 @@
         <w:pStyle w:val="ListBullet"/>
       </w:pPr>
       <w:r>
-        <w:t>Gestion du WAF Ouest-France (detection de la page challenge, attente, retries)</w:t>
+        <w:t>Gestion du WAF Ouest-France (détection de la page challenge, attente, retries)</w:t>
       </w:r>
     </w:p>
     <w:p>
@@ -889,7 +889,7 @@
         <w:pStyle w:val="ListBullet"/>
       </w:pPr>
       <w:r>
-        <w:t>Renouvellement transparent : si la cle expire en cours d'export, elle est renouvelee automatiquement</w:t>
+        <w:t>Renouvellement transparent : si la clé expire en cours d'export, elle est renouvelée automatiquement</w:t>
       </w:r>
     </w:p>
     <w:p>
@@ -897,7 +897,7 @@
         <w:pStyle w:val="Heading2"/>
       </w:pPr>
       <w:r>
-        <w:t>3.4 Avantages par rapport a V1</w:t>
+        <w:t>3.4 Avantages par rapport à V1</w:t>
       </w:r>
     </w:p>
     <w:p>
@@ -905,7 +905,7 @@
         <w:pStyle w:val="ListBullet"/>
       </w:pPr>
       <w:r>
-        <w:t>Beaucoup plus rapide : 1000 evenements par requete vs ~50 par page HTML</w:t>
+        <w:t>Beaucoup plus rapide : 1000 événements par requête vs ~50 par page HTML</w:t>
       </w:r>
     </w:p>
     <w:p>
@@ -913,7 +913,7 @@
         <w:pStyle w:val="ListBullet"/>
       </w:pPr>
       <w:r>
-        <w:t>Donnees completes : texte integral, coordonnees GPS, tarifs, accessibilite...</w:t>
+        <w:t>Données complètes : texte intégral, coordonnées GPS, tarifs, accessibilité…</w:t>
       </w:r>
     </w:p>
     <w:p>
@@ -921,7 +921,7 @@
         <w:pStyle w:val="ListBullet"/>
       </w:pPr>
       <w:r>
-        <w:t>Plus stable : pas de dependance aux selecteurs CSS du frontend</w:t>
+        <w:t>Plus stable : pas de dépendance aux sélecteurs CSS du frontend</w:t>
       </w:r>
     </w:p>
     <w:p>
@@ -929,7 +929,7 @@
         <w:pStyle w:val="ListBullet"/>
       </w:pPr>
       <w:r>
-        <w:t>Volume : peut recuperer les 110k+ evenements en quelques minutes</w:t>
+        <w:t>Volume : peut récupérer les 110k+ événements en quelques minutes</w:t>
       </w:r>
     </w:p>
     <w:p>
@@ -945,7 +945,7 @@
         <w:pStyle w:val="ListBullet"/>
       </w:pPr>
       <w:r>
-        <w:t>Cle API expirant regulierement (necessite Selenium pour le renouvellement)</w:t>
+        <w:t>Clé API expirant régulièrement (nécessite Selenium pour le renouvellement)</w:t>
       </w:r>
     </w:p>
     <w:p>
@@ -953,7 +953,7 @@
         <w:pStyle w:val="ListBullet"/>
       </w:pPr>
       <w:r>
-        <w:t>Dependance a l'index Algolia d'Infolocale (s'il change, tout casse)</w:t>
+        <w:t>Dépendance à l'index Algolia d'Infolocale (s'il change, tout casse)</w:t>
       </w:r>
     </w:p>
     <w:p>
@@ -961,7 +961,7 @@
         <w:pStyle w:val="ListBullet"/>
       </w:pPr>
       <w:r>
-        <w:t>Donnees pas forcement a jour entre deux syncs</w:t>
+        <w:t>Données pas forcément à jour entre deux syncs</w:t>
       </w:r>
     </w:p>
     <w:p>
@@ -969,7 +969,7 @@
         <w:pStyle w:val="ListBullet"/>
       </w:pPr>
       <w:r>
-        <w:t>Necessite toujours une base PostgreSQL pour le stockage</w:t>
+        <w:t>Nécessite toujours une base PostgreSQL pour le stockage</w:t>
       </w:r>
     </w:p>
     <w:p>
@@ -982,7 +982,7 @@
         <w:pStyle w:val="Heading1"/>
       </w:pPr>
       <w:r>
-        <w:t>4. V3 - API a la demande (architecture proposee)</w:t>
+        <w:t>4. V3 – API à la demande (architecture proposée)</w:t>
       </w:r>
     </w:p>
     <w:p>
@@ -995,7 +995,7 @@
     </w:p>
     <w:p>
       <w:r>
-        <w:t>Au lieu de scraper et stocker localement les 110k+ evenements, l'API FastAPI interroge directement Algolia a chaque requete utilisateur. Les filtres geographiques natifs d'Algolia (aroundLatLng, aroundRadius) permettent de ne recuperer que les evenements pertinents.</w:t>
+        <w:t>Au lieu de scraper et stocker localement les 110k+ événements, l'API FastAPI interroge directement Algolia à chaque requête utilisateur. Les filtres géographiques natifs d'Algolia (aroundLatLng, aroundRadius) permettent de ne récupérer que les événements pertinents.</w:t>
       </w:r>
     </w:p>
     <w:p>
@@ -1003,32 +1003,32 @@
         <w:pStyle w:val="Heading2"/>
       </w:pPr>
       <w:r>
-        <w:t>4.2 Flux de donnees</w:t>
+        <w:t>4.2 Flux de données</w:t>
       </w:r>
     </w:p>
     <w:p>
       <w:r>
-        <w:t>1. L'utilisateur envoie une requete : GET /events?lat=48.8&amp;lng=2.3&amp;radius=10km</w:t>
+        <w:t>1. L'utilisateur envoie une requête : GET /events?lat=48.8&amp;lng=2.3&amp;radius=10km</w:t>
       </w:r>
     </w:p>
     <w:p>
       <w:r>
-        <w:t>2. L'API FastAPI transforme la requete en appel Algolia avec les filtres natifs</w:t>
+        <w:t>2. L'API FastAPI transforme la requête en appel Algolia avec les filtres natifs</w:t>
       </w:r>
     </w:p>
     <w:p>
       <w:r>
-        <w:t>3. Algolia retourne uniquement les evenements dans le rayon demande</w:t>
+        <w:t>3. Algolia retourne uniquement les événements dans le rayon demandé</w:t>
       </w:r>
     </w:p>
     <w:p>
       <w:r>
-        <w:t>4. L'API formate et retourne la reponse au frontend</w:t>
+        <w:t>4. L'API formate et retourne la réponse au frontend</w:t>
       </w:r>
     </w:p>
     <w:p>
       <w:r>
-        <w:t>5. Cache optionnel : les resultats sont mis en cache (Redis ou in-memory)</w:t>
+        <w:t>5. Cache optionnel : les résultats sont mis en cache (Redis ou in-memory)</w:t>
       </w:r>
     </w:p>
     <w:p>
@@ -1067,7 +1067,7 @@
                 <w:color w:val="FFFFFF"/>
                 <w:sz w:val="18"/>
               </w:rPr>
-              <w:t>Parametre Algolia</w:t>
+              <w:t>Paramètre Algolia</w:t>
             </w:r>
           </w:p>
         </w:tc>
@@ -1176,7 +1176,7 @@
               <w:rPr>
                 <w:sz w:val="18"/>
               </w:rPr>
-              <w:t>Rayon en metres</w:t>
+              <w:t>Rayon en mètres</w:t>
             </w:r>
           </w:p>
         </w:tc>
@@ -1261,7 +1261,7 @@
               <w:rPr>
                 <w:sz w:val="18"/>
               </w:rPr>
-              <w:t>Filtres sur categories</w:t>
+              <w:t>Filtres sur catégories</w:t>
             </w:r>
           </w:p>
         </w:tc>
@@ -1303,7 +1303,7 @@
               <w:rPr>
                 <w:sz w:val="18"/>
               </w:rPr>
-              <w:t>Nombre de resultats par page</w:t>
+              <w:t>Nombre de résultats par page</w:t>
             </w:r>
           </w:p>
         </w:tc>
@@ -1346,7 +1346,7 @@
               <w:rPr>
                 <w:sz w:val="18"/>
               </w:rPr>
-              <w:t>Numero de page</w:t>
+              <w:t>Numéro de page</w:t>
             </w:r>
           </w:p>
         </w:tc>
@@ -1372,7 +1372,7 @@
         <w:pStyle w:val="Heading2"/>
       </w:pPr>
       <w:r>
-        <w:t>4.4 Composants supprimes par rapport a V1/V2</w:t>
+        <w:t>4.4 Composants supprimés par rapport à V1/V2</w:t>
       </w:r>
     </w:p>
     <w:p>
@@ -1388,7 +1388,7 @@
         <w:pStyle w:val="ListBullet"/>
       </w:pPr>
       <w:r>
-        <w:t>storage_service.py (stockage PostgreSQL des evenements)</w:t>
+        <w:t>storage_service.py (stockage PostgreSQL des événements)</w:t>
       </w:r>
     </w:p>
     <w:p>
@@ -1412,7 +1412,7 @@
         <w:pStyle w:val="ListBullet"/>
       </w:pPr>
       <w:r>
-        <w:t>Table scanned_events (plus necessaire pour les evenements)</w:t>
+        <w:t>Table scanned_events (plus nécessaire pour les événements)</w:t>
       </w:r>
     </w:p>
     <w:p>
@@ -1420,7 +1420,7 @@
         <w:pStyle w:val="ListBullet"/>
       </w:pPr>
       <w:r>
-        <w:t>Migrations Alembic pour la table evenements</w:t>
+        <w:t>Migrations Alembic pour la table événements</w:t>
       </w:r>
     </w:p>
     <w:p>
@@ -1428,7 +1428,7 @@
         <w:pStyle w:val="Heading2"/>
       </w:pPr>
       <w:r>
-        <w:t>4.5 Composants conserves</w:t>
+        <w:t>4.5 Composants conservés</w:t>
       </w:r>
     </w:p>
     <w:p>
@@ -1436,7 +1436,7 @@
         <w:pStyle w:val="ListBullet"/>
       </w:pPr>
       <w:r>
-        <w:t>algolia_service.py (adapte pour les requetes a la demande avec filtres geo)</w:t>
+        <w:t>algolia_service.py (adapté pour les requêtes à la demande avec filtres géo)</w:t>
       </w:r>
     </w:p>
     <w:p>
@@ -1444,7 +1444,7 @@
         <w:pStyle w:val="ListBullet"/>
       </w:pPr>
       <w:r>
-        <w:t>algolia_key_service.py (renouvellement automatique de cle — identique a V2)</w:t>
+        <w:t>algolia_key_service.py (renouvellement automatique de clé — identique à V2)</w:t>
       </w:r>
     </w:p>
     <w:p>
@@ -1452,7 +1452,7 @@
         <w:pStyle w:val="ListBullet"/>
       </w:pPr>
       <w:r>
-        <w:t>geocoding_service.py (geocoding inverse si necessaire)</w:t>
+        <w:t>geocoding_service.py (géocodage inverse si nécessaire)</w:t>
       </w:r>
     </w:p>
     <w:p>
@@ -1460,7 +1460,7 @@
         <w:pStyle w:val="ListBullet"/>
       </w:pPr>
       <w:r>
-        <w:t>API FastAPI (routes adaptees pour le proxy Algolia)</w:t>
+        <w:t>API FastAPI (routes adaptées pour le proxy Algolia)</w:t>
       </w:r>
     </w:p>
     <w:p>
@@ -1473,7 +1473,7 @@
         <w:pStyle w:val="Heading1"/>
       </w:pPr>
       <w:r>
-        <w:t>5. Comparaison detaillee des 3 approches</w:t>
+        <w:t>5. Comparaison détaillée des 3 approches</w:t>
       </w:r>
     </w:p>
     <w:p>
@@ -1513,7 +1513,7 @@
                 <w:color w:val="FFFFFF"/>
                 <w:sz w:val="18"/>
               </w:rPr>
-              <w:t>Critere</w:t>
+              <w:t>Critère</w:t>
             </w:r>
           </w:p>
         </w:tc>
@@ -1532,7 +1532,7 @@
                 <w:color w:val="FFFFFF"/>
                 <w:sz w:val="18"/>
               </w:rPr>
-              <w:t>V1 - Scraping HTML</w:t>
+              <w:t>V1 – Scraping HTML</w:t>
             </w:r>
           </w:p>
         </w:tc>
@@ -1551,7 +1551,7 @@
                 <w:color w:val="FFFFFF"/>
                 <w:sz w:val="18"/>
               </w:rPr>
-              <w:t>V2 - Scraping Algolia</w:t>
+              <w:t>V2 – Scraping Algolia</w:t>
             </w:r>
           </w:p>
         </w:tc>
@@ -1570,7 +1570,7 @@
                 <w:color w:val="FFFFFF"/>
                 <w:sz w:val="18"/>
               </w:rPr>
-              <w:t>V3 - API a la demande</w:t>
+              <w:t>V3 – API à la demande</w:t>
             </w:r>
           </w:p>
         </w:tc>
@@ -1585,7 +1585,7 @@
               <w:rPr>
                 <w:sz w:val="18"/>
               </w:rPr>
-              <w:t>Fraicheur des donnees</w:t>
+              <w:t>Fraîcheur des données</w:t>
             </w:r>
           </w:p>
         </w:tc>
@@ -1598,7 +1598,7 @@
               <w:rPr>
                 <w:sz w:val="18"/>
               </w:rPr>
-              <w:t>Obsoletes entre 2 syncs</w:t>
+              <w:t>Obsolètes entre 2 syncs</w:t>
             </w:r>
           </w:p>
         </w:tc>
@@ -1611,7 +1611,7 @@
               <w:rPr>
                 <w:sz w:val="18"/>
               </w:rPr>
-              <w:t>Obsoletes entre 2 syncs</w:t>
+              <w:t>Obsolètes entre 2 syncs</w:t>
             </w:r>
           </w:p>
         </w:tc>
@@ -1624,7 +1624,7 @@
               <w:rPr>
                 <w:sz w:val="18"/>
               </w:rPr>
-              <w:t>Temps reel</w:t>
+              <w:t>Temps réel</w:t>
             </w:r>
           </w:p>
         </w:tc>
@@ -1640,7 +1640,7 @@
               <w:rPr>
                 <w:sz w:val="18"/>
               </w:rPr>
-              <w:t>Richesse des donnees</w:t>
+              <w:t>Richesse des données</w:t>
             </w:r>
           </w:p>
         </w:tc>
@@ -1654,7 +1654,7 @@
               <w:rPr>
                 <w:sz w:val="18"/>
               </w:rPr>
-              <w:t>Limitee (carte HTML)</w:t>
+              <w:t>Limitée (carte HTML)</w:t>
             </w:r>
           </w:p>
         </w:tc>
@@ -1668,7 +1668,7 @@
               <w:rPr>
                 <w:sz w:val="18"/>
               </w:rPr>
-              <w:t>Complete (toutes les metadonnees)</w:t>
+              <w:t>Complète (toutes les métadonnées)</w:t>
             </w:r>
           </w:p>
         </w:tc>
@@ -1682,7 +1682,7 @@
               <w:rPr>
                 <w:sz w:val="18"/>
               </w:rPr>
-              <w:t>Complete (toutes les metadonnees)</w:t>
+              <w:t>Complète (toutes les métadonnées)</w:t>
             </w:r>
           </w:p>
         </w:tc>
@@ -1697,7 +1697,7 @@
               <w:rPr>
                 <w:sz w:val="18"/>
               </w:rPr>
-              <w:t>Volume stocke</w:t>
+              <w:t>Volume stocké</w:t>
             </w:r>
           </w:p>
         </w:tc>
@@ -1794,7 +1794,7 @@
               <w:rPr>
                 <w:sz w:val="18"/>
               </w:rPr>
-              <w:t>Moyenne (~200-500ms)</w:t>
+              <w:t>Moyenne (~200-500 ms)</w:t>
             </w:r>
           </w:p>
         </w:tc>
@@ -1809,7 +1809,7 @@
               <w:rPr>
                 <w:sz w:val="18"/>
               </w:rPr>
-              <w:t>Complexite infra</w:t>
+              <w:t>Complexité infra</w:t>
             </w:r>
           </w:p>
         </w:tc>
@@ -1835,7 +1835,7 @@
               <w:rPr>
                 <w:sz w:val="18"/>
               </w:rPr>
-              <w:t>PostgreSQL + Selenium (cle) + Cron</w:t>
+              <w:t>PostgreSQL + Selenium (clé) + Cron</w:t>
             </w:r>
           </w:p>
         </w:tc>
@@ -1864,7 +1864,7 @@
               <w:rPr>
                 <w:sz w:val="18"/>
               </w:rPr>
-              <w:t>Resilience WAF</w:t>
+              <w:t>Résilience WAF</w:t>
             </w:r>
           </w:p>
         </w:tc>
@@ -1892,7 +1892,7 @@
               <w:rPr>
                 <w:sz w:val="18"/>
               </w:rPr>
-              <w:t>Uniquement pour la cle API</w:t>
+              <w:t>Uniquement pour la clé API</w:t>
             </w:r>
           </w:p>
         </w:tc>
@@ -1906,7 +1906,7 @@
               <w:rPr>
                 <w:sz w:val="18"/>
               </w:rPr>
-              <w:t>Uniquement pour la cle API</w:t>
+              <w:t>Uniquement pour la clé API</w:t>
             </w:r>
           </w:p>
         </w:tc>
@@ -1921,7 +1921,7 @@
               <w:rPr>
                 <w:sz w:val="18"/>
               </w:rPr>
-              <w:t>Filtrage geographique</w:t>
+              <w:t>Filtrage géographique</w:t>
             </w:r>
           </w:p>
         </w:tc>
@@ -1976,7 +1976,7 @@
               <w:rPr>
                 <w:sz w:val="18"/>
               </w:rPr>
-              <w:t>Gestion de cle Algolia</w:t>
+              <w:t>Gestion de clé Algolia</w:t>
             </w:r>
           </w:p>
         </w:tc>
@@ -1990,7 +1990,7 @@
               <w:rPr>
                 <w:sz w:val="18"/>
               </w:rPr>
-              <w:t>Non necessaire</w:t>
+              <w:t>Non nécessaire</w:t>
             </w:r>
           </w:p>
         </w:tc>
@@ -2102,7 +2102,7 @@
               <w:rPr>
                 <w:sz w:val="18"/>
               </w:rPr>
-              <w:t>Elevee (selecteurs CSS)</w:t>
+              <w:t>Élevée (sélecteurs CSS)</w:t>
             </w:r>
           </w:p>
         </w:tc>
@@ -2116,7 +2116,7 @@
               <w:rPr>
                 <w:sz w:val="18"/>
               </w:rPr>
-              <w:t>Moyenne (cle API)</w:t>
+              <w:t>Moyenne (clé API)</w:t>
             </w:r>
           </w:p>
         </w:tc>
@@ -2145,7 +2145,7 @@
               <w:rPr>
                 <w:sz w:val="18"/>
               </w:rPr>
-              <w:t>Conformite legale</w:t>
+              <w:t>Conformité légale</w:t>
             </w:r>
           </w:p>
         </w:tc>
@@ -2184,7 +2184,7 @@
               <w:rPr>
                 <w:sz w:val="18"/>
               </w:rPr>
-              <w:t>Plus leger (usage normal)</w:t>
+              <w:t>Plus léger (usage normal)</w:t>
             </w:r>
           </w:p>
         </w:tc>
@@ -2196,15 +2196,15 @@
         <w:pStyle w:val="Heading2"/>
       </w:pPr>
       <w:r>
-        <w:t>5.2 Fraicheur des donnees</w:t>
+        <w:t>5.2 Fraîcheur des données</w:t>
       </w:r>
     </w:p>
     <w:p>
       <w:r>
-        <w:t>Les approches V1 et V2 necessitent une synchronisation reguliere (cron job) pour maintenir les donnees a jour. Entre deux syncs, les evenements ajoutes, modifies ou annules sur Infolocale ne sont pas refletes.</w:t>
+        <w:t>Les approches V1 et V2 nécessitent une synchronisation régulière (cron job) pour maintenir les données à jour. Entre deux syncs, les événements ajoutés, modifiés ou annulés sur Infolocale ne sont pas reflétés.</w:t>
         <w:br/>
         <w:br/>
-        <w:t>L'approche V3 retourne toujours les donnees les plus recentes puisqu'elle interroge Algolia en temps reel a chaque requete utilisateur.</w:t>
+        <w:t>L'approche V3 retourne toujours les données les plus récentes puisqu'elle interroge Algolia en temps réel à chaque requête utilisateur.</w:t>
       </w:r>
     </w:p>
     <w:p>
@@ -2212,15 +2212,15 @@
         <w:pStyle w:val="Heading2"/>
       </w:pPr>
       <w:r>
-        <w:t>5.3 Filtrage geographique</w:t>
+        <w:t>5.3 Filtrage géographique</w:t>
       </w:r>
     </w:p>
     <w:p>
       <w:r>
-        <w:t>Avec V1 et V2, le filtrage geographique est fait cote serveur apres avoir recupere tous les evenements. Cela implique de stocker les coordonnees GPS et de calculer les distances.</w:t>
+        <w:t>Avec V1 et V2, le filtrage géographique est fait côté serveur après avoir récupéré tous les événements. Cela implique de stocker les coordonnées GPS et de calculer les distances.</w:t>
         <w:br/>
         <w:br/>
-        <w:t>V3 utilise les filtres natifs d'Algolia (aroundLatLng, aroundRadius) qui effectuent ce calcul cote Algolia avec des performances optimisees (index geographique). Le frontend n'a qu'a envoyer la position de l'utilisateur.</w:t>
+        <w:t>V3 utilise les filtres natifs d'Algolia (aroundLatLng, aroundRadius) qui effectuent ce calcul côté Algolia avec des performances optimisées (index géographique). Le frontend n'a qu'à envoyer la position de l'utilisateur.</w:t>
       </w:r>
     </w:p>
     <w:p>
@@ -2233,10 +2233,10 @@
     </w:p>
     <w:p>
       <w:r>
-        <w:t>V1 est la plus vulnerable : chaque page scrapee passe par le WAF Ouest-France, qui peut bloquer le navigateur headless a tout moment.</w:t>
+        <w:t>V1 est la plus vulnérable : chaque page scrapée passe par le WAF Ouest-France, qui peut bloquer le navigateur headless à tout moment.</w:t>
         <w:br/>
         <w:br/>
-        <w:t>V2 et V3 ne sont exposees au WAF que lors du renouvellement de la cle API (une seule visite de page necessaire), ce qui reduit considerablement le risque de blocage.</w:t>
+        <w:t>V2 et V3 ne sont exposées au WAF que lors du renouvellement de la clé API (une seule visite de page nécessaire), ce qui réduit considérablement le risque de blocage.</w:t>
       </w:r>
     </w:p>
     <w:p>
@@ -2300,7 +2300,7 @@
                 <w:color w:val="FFFFFF"/>
                 <w:sz w:val="18"/>
               </w:rPr>
-              <w:t>V1 - HTML</w:t>
+              <w:t>V1 – HTML</w:t>
             </w:r>
           </w:p>
         </w:tc>
@@ -2319,7 +2319,7 @@
                 <w:color w:val="FFFFFF"/>
                 <w:sz w:val="18"/>
               </w:rPr>
-              <w:t>V2 - Algolia</w:t>
+              <w:t>V2 – Algolia</w:t>
             </w:r>
           </w:p>
         </w:tc>
@@ -2338,7 +2338,7 @@
                 <w:color w:val="FFFFFF"/>
                 <w:sz w:val="18"/>
               </w:rPr>
-              <w:t>V3 - API demande</w:t>
+              <w:t>V3 – API demande</w:t>
             </w:r>
           </w:p>
         </w:tc>
@@ -2383,7 +2383,7 @@
               </w:rPr>
               <w:t>Faible</w:t>
               <w:br/>
-              <w:t>(cle uniquement)</w:t>
+              <w:t>(clé uniquement)</w:t>
             </w:r>
           </w:p>
         </w:tc>
@@ -2398,7 +2398,7 @@
               </w:rPr>
               <w:t>Faible</w:t>
               <w:br/>
-              <w:t>(cle uniquement)</w:t>
+              <w:t>(clé uniquement)</w:t>
             </w:r>
           </w:p>
         </w:tc>
@@ -2430,7 +2430,7 @@
               </w:rPr>
               <w:t>Critique</w:t>
               <w:br/>
-              <w:t>(selecteurs cassent)</w:t>
+              <w:t>(sélecteurs cassent)</w:t>
             </w:r>
           </w:p>
         </w:tc>
@@ -2473,7 +2473,7 @@
               <w:rPr>
                 <w:sz w:val="18"/>
               </w:rPr>
-              <w:t>Expiration cle Algolia</w:t>
+              <w:t>Expiration clé Algolia</w:t>
             </w:r>
           </w:p>
         </w:tc>
@@ -2501,7 +2501,7 @@
               </w:rPr>
               <w:t>Moyen</w:t>
               <w:br/>
-              <w:t>(auto-refresh gere)</w:t>
+              <w:t>(auto-refresh géré)</w:t>
             </w:r>
           </w:p>
         </w:tc>
@@ -2516,7 +2516,7 @@
               </w:rPr>
               <w:t>Moyen</w:t>
               <w:br/>
-              <w:t>(auto-refresh gere)</w:t>
+              <w:t>(auto-refresh géré)</w:t>
             </w:r>
           </w:p>
         </w:tc>
@@ -2602,7 +2602,7 @@
               <w:rPr>
                 <w:sz w:val="18"/>
               </w:rPr>
-              <w:t>Eleve</w:t>
+              <w:t>Élevé</w:t>
               <w:br/>
               <w:t>(nombreuses pages)</w:t>
             </w:r>
@@ -2666,7 +2666,7 @@
               </w:rPr>
               <w:t>Critique</w:t>
               <w:br/>
-              <w:t>(plus de donnees)</w:t>
+              <w:t>(plus de données)</w:t>
             </w:r>
           </w:p>
         </w:tc>
@@ -2682,7 +2682,7 @@
               </w:rPr>
               <w:t>Critique</w:t>
               <w:br/>
-              <w:t>(plus de donnees)</w:t>
+              <w:t>(plus de données)</w:t>
             </w:r>
           </w:p>
         </w:tc>
@@ -2713,7 +2713,7 @@
               <w:rPr>
                 <w:sz w:val="18"/>
               </w:rPr>
-              <w:t>Conformite legale</w:t>
+              <w:t>Conformité légale</w:t>
             </w:r>
           </w:p>
         </w:tc>
@@ -2726,7 +2726,7 @@
               <w:rPr>
                 <w:sz w:val="18"/>
               </w:rPr>
-              <w:t>Risque eleve</w:t>
+              <w:t>Risque élevé</w:t>
               <w:br/>
               <w:t>(scraping HTML)</w:t>
             </w:r>
@@ -2774,7 +2774,7 @@
         <w:pStyle w:val="Heading1"/>
       </w:pPr>
       <w:r>
-        <w:t>7. Performance et scalabilite</w:t>
+        <w:t>7. Performance et scalabilité</w:t>
       </w:r>
     </w:p>
     <w:p>
@@ -2814,7 +2814,7 @@
                 <w:color w:val="FFFFFF"/>
                 <w:sz w:val="18"/>
               </w:rPr>
-              <w:t>Operation</w:t>
+              <w:t>Opération</w:t>
             </w:r>
           </w:p>
         </w:tc>
@@ -2833,7 +2833,7 @@
                 <w:color w:val="FFFFFF"/>
                 <w:sz w:val="18"/>
               </w:rPr>
-              <w:t>V1 - HTML</w:t>
+              <w:t>V1 – HTML</w:t>
             </w:r>
           </w:p>
         </w:tc>
@@ -2852,7 +2852,7 @@
                 <w:color w:val="FFFFFF"/>
                 <w:sz w:val="18"/>
               </w:rPr>
-              <w:t>V2 - Algolia</w:t>
+              <w:t>V2 – Algolia</w:t>
             </w:r>
           </w:p>
         </w:tc>
@@ -2871,7 +2871,7 @@
                 <w:color w:val="FFFFFF"/>
                 <w:sz w:val="18"/>
               </w:rPr>
-              <w:t>V3 - API demande</w:t>
+              <w:t>V3 – API demande</w:t>
             </w:r>
           </w:p>
         </w:tc>
@@ -2945,7 +2945,7 @@
               <w:rPr>
                 <w:sz w:val="18"/>
               </w:rPr>
-              <w:t>Requete utilisateur</w:t>
+              <w:t>Requête utilisateur</w:t>
             </w:r>
           </w:p>
         </w:tc>
@@ -3008,7 +3008,7 @@
               <w:rPr>
                 <w:sz w:val="18"/>
               </w:rPr>
-              <w:t>Recherche geographique</w:t>
+              <w:t>Recherche géographique</w:t>
             </w:r>
           </w:p>
         </w:tc>
@@ -3069,7 +3069,7 @@
               <w:rPr>
                 <w:sz w:val="18"/>
               </w:rPr>
-              <w:t>Renouvellement cle</w:t>
+              <w:t>Renouvellement clé</w:t>
             </w:r>
           </w:p>
         </w:tc>
@@ -3127,18 +3127,18 @@
         <w:pStyle w:val="Heading2"/>
       </w:pPr>
       <w:r>
-        <w:t>7.2 Scalabilite</w:t>
+        <w:t>7.2 Scalabilité</w:t>
       </w:r>
     </w:p>
     <w:p>
       <w:r>
-        <w:t>V1 : la scalabilite est tres limitee. Le temps de scraping croit lineairement avec le nombre de pages, et le WAF peut bloquer a tout moment.</w:t>
+        <w:t>V1 : la scalabilité est très limitée. Le temps de scraping croît linéairement avec le nombre de pages, et le WAF peut bloquer à tout moment.</w:t>
         <w:br/>
         <w:br/>
-        <w:t>V2 : meilleure scalabilite grace a l'API Algolia, mais la taille de la base PostgreSQL et le temps de synchronisation restent des facteurs limitants.</w:t>
+        <w:t>V2 : meilleure scalabilité grâce à l'API Algolia, mais la taille de la base PostgreSQL et le temps de synchronisation restent des facteurs limitants.</w:t>
         <w:br/>
         <w:br/>
-        <w:t>V3 : la scalabilite est geree par Algolia (infrastructure CDN mondiale). L'ajout d'un cache Redis permet de reduire les appels repetes.</w:t>
+        <w:t>V3 : la scalabilité est gérée par Algolia (infrastructure CDN mondiale). L'ajout d'un cache Redis permet de réduire les appels répétés.</w:t>
       </w:r>
     </w:p>
     <w:p>
@@ -3151,7 +3151,7 @@
     </w:p>
     <w:p>
       <w:r>
-        <w:t>L'approche V3 peut utiliser un cache a plusieurs niveaux :</w:t>
+        <w:t>L'approche V3 peut utiliser un cache à plusieurs niveaux :</w:t>
       </w:r>
     </w:p>
     <w:p>
@@ -3159,7 +3159,7 @@
         <w:pStyle w:val="ListBullet"/>
       </w:pPr>
       <w:r>
-        <w:t>Cache applicatif (in-memory, TTL 5 min) : pour les requetes identiques rapprochees</w:t>
+        <w:t>Cache applicatif (in-memory, TTL 5 min) : pour les requêtes identiques rapprochées</w:t>
       </w:r>
     </w:p>
     <w:p>
@@ -3167,7 +3167,7 @@
         <w:pStyle w:val="ListBullet"/>
       </w:pPr>
       <w:r>
-        <w:t>Cache Redis (TTL 30 min) : pour les requetes par zone geographique</w:t>
+        <w:t>Cache Redis (TTL 30 min) : pour les requêtes par zone géographique</w:t>
       </w:r>
     </w:p>
     <w:p>
@@ -3175,7 +3175,7 @@
         <w:pStyle w:val="ListBullet"/>
       </w:pPr>
       <w:r>
-        <w:t>Cache PostgreSQL (TTL 24h, optionnel) : pour l'analytique et les stats</w:t>
+        <w:t>Cache PostgreSQL (TTL 24 h, optionnel) : pour l'analytique et les stats</w:t>
       </w:r>
     </w:p>
     <w:p>
@@ -3188,7 +3188,7 @@
         <w:pStyle w:val="Heading1"/>
       </w:pPr>
       <w:r>
-        <w:t>8. Cout et maintenance</w:t>
+        <w:t>8. Coût et maintenance</w:t>
       </w:r>
     </w:p>
     <w:p>
@@ -3196,7 +3196,7 @@
         <w:pStyle w:val="Heading2"/>
       </w:pPr>
       <w:r>
-        <w:t>8.1 Complexite du code</w:t>
+        <w:t>8.1 Complexité du code</w:t>
       </w:r>
     </w:p>
     <w:tbl>
@@ -3247,7 +3247,7 @@
                 <w:color w:val="FFFFFF"/>
                 <w:sz w:val="18"/>
               </w:rPr>
-              <w:t>V1 - HTML</w:t>
+              <w:t>V1 – HTML</w:t>
             </w:r>
           </w:p>
         </w:tc>
@@ -3266,7 +3266,7 @@
                 <w:color w:val="FFFFFF"/>
                 <w:sz w:val="18"/>
               </w:rPr>
-              <w:t>V2 - Algolia</w:t>
+              <w:t>V2 – Algolia</w:t>
             </w:r>
           </w:p>
         </w:tc>
@@ -3285,7 +3285,7 @@
                 <w:color w:val="FFFFFF"/>
                 <w:sz w:val="18"/>
               </w:rPr>
-              <w:t>V3 - API demande</w:t>
+              <w:t>V3 – API demande</w:t>
             </w:r>
           </w:p>
         </w:tc>
@@ -3326,7 +3326,7 @@
               <w:rPr>
                 <w:sz w:val="18"/>
               </w:rPr>
-              <w:t>Inutilise</w:t>
+              <w:t>Inutilisé</w:t>
             </w:r>
           </w:p>
         </w:tc>
@@ -3339,7 +3339,7 @@
               <w:rPr>
                 <w:sz w:val="18"/>
               </w:rPr>
-              <w:t>Supprime</w:t>
+              <w:t>Supprimé</w:t>
             </w:r>
           </w:p>
         </w:tc>
@@ -3397,7 +3397,7 @@
               <w:rPr>
                 <w:sz w:val="18"/>
               </w:rPr>
-              <w:t>~150 (simplifie)</w:t>
+              <w:t>~150 (simplifié)</w:t>
             </w:r>
           </w:p>
         </w:tc>
@@ -3451,7 +3451,7 @@
               <w:rPr>
                 <w:sz w:val="18"/>
               </w:rPr>
-              <w:t>~280 (inchange)</w:t>
+              <w:t>~280 (inchangé)</w:t>
             </w:r>
           </w:p>
         </w:tc>
@@ -3509,7 +3509,7 @@
               <w:rPr>
                 <w:sz w:val="18"/>
               </w:rPr>
-              <w:t>Supprime</w:t>
+              <w:t>Supprimé</w:t>
             </w:r>
           </w:p>
         </w:tc>
@@ -3563,7 +3563,7 @@
               <w:rPr>
                 <w:sz w:val="18"/>
               </w:rPr>
-              <w:t>Supprime</w:t>
+              <w:t>Supprimé</w:t>
             </w:r>
           </w:p>
         </w:tc>
@@ -3621,7 +3621,7 @@
               <w:rPr>
                 <w:sz w:val="18"/>
               </w:rPr>
-              <w:t>Supprime</w:t>
+              <w:t>Supprimé</w:t>
             </w:r>
           </w:p>
         </w:tc>
@@ -3675,7 +3675,7 @@
               <w:rPr>
                 <w:sz w:val="18"/>
               </w:rPr>
-              <w:t>~100 (simplifie)</w:t>
+              <w:t>~100 (simplifié)</w:t>
             </w:r>
           </w:p>
         </w:tc>
@@ -3850,7 +3850,7 @@
                 <w:color w:val="FFFFFF"/>
                 <w:sz w:val="18"/>
               </w:rPr>
-              <w:t>V1 - HTML</w:t>
+              <w:t>V1 – HTML</w:t>
             </w:r>
           </w:p>
         </w:tc>
@@ -3869,7 +3869,7 @@
                 <w:color w:val="FFFFFF"/>
                 <w:sz w:val="18"/>
               </w:rPr>
-              <w:t>V2 - Algolia</w:t>
+              <w:t>V2 – Algolia</w:t>
             </w:r>
           </w:p>
         </w:tc>
@@ -3888,7 +3888,7 @@
                 <w:color w:val="FFFFFF"/>
                 <w:sz w:val="18"/>
               </w:rPr>
-              <w:t>V3 - API demande</w:t>
+              <w:t>V3 – API demande</w:t>
             </w:r>
           </w:p>
         </w:tc>
@@ -3972,7 +3972,7 @@
               <w:rPr>
                 <w:sz w:val="18"/>
               </w:rPr>
-              <w:t>Non utilise</w:t>
+              <w:t>Non utilisé</w:t>
             </w:r>
           </w:p>
         </w:tc>
@@ -3986,7 +3986,7 @@
               <w:rPr>
                 <w:sz w:val="18"/>
               </w:rPr>
-              <w:t>Non utilise</w:t>
+              <w:t>Non utilisé</w:t>
             </w:r>
           </w:p>
         </w:tc>
@@ -4041,7 +4041,7 @@
               <w:rPr>
                 <w:sz w:val="18"/>
               </w:rPr>
-              <w:t>Requis (cle API)</w:t>
+              <w:t>Requis (clé API)</w:t>
             </w:r>
           </w:p>
         </w:tc>
@@ -4054,7 +4054,7 @@
               <w:rPr>
                 <w:sz w:val="18"/>
               </w:rPr>
-              <w:t>Requis (cle API)</w:t>
+              <w:t>Requis (clé API)</w:t>
             </w:r>
           </w:p>
         </w:tc>
@@ -4190,18 +4190,18 @@
         <w:pStyle w:val="Heading2"/>
       </w:pPr>
       <w:r>
-        <w:t>9.1 Synthese</w:t>
+        <w:t>9.1 Synthèse</w:t>
       </w:r>
     </w:p>
     <w:p>
       <w:r>
-        <w:t>V1 (scraping HTML) a permis de demarrer le projet et de valider le concept, mais cette approche est fragile, lente et limitee en donnees.</w:t>
+        <w:t>V1 (scraping HTML) a permis de démarrer le projet et de valider le concept, mais cette approche est fragile, lente et limitée en données.</w:t>
         <w:br/>
         <w:br/>
-        <w:t>V2 (scraping Algolia) a apporte un gain majeur en termes de vitesse, de completude des donnees et de stabilite. Le mecanisme d'auto-renouvellement de la cle API resout le probleme de l'expiration.</w:t>
+        <w:t>V2 (scraping Algolia) a apporté un gain majeur en termes de vitesse, de complétude des données et de stabilité. Le mécanisme d'auto-renouvellement de la clé API résout le problème de l'expiration.</w:t>
         <w:br/>
         <w:br/>
-        <w:t>V3 (API a la demande) est l'evolution logique pour un cas d'usage centre sur la recherche d'evenements par localisation : elle est plus simple, garantit des donnees fraiches, et exploite le filtrage geographique natif d'Algolia.</w:t>
+        <w:t>V3 (API à la demande) est l'évolution logique pour un cas d'usage centré sur la recherche d'événements par localisation : elle est plus simple, garantit des données fraîches, et exploite le filtrage géographique natif d'Algolia.</w:t>
       </w:r>
     </w:p>
     <w:p>
@@ -4209,12 +4209,12 @@
         <w:pStyle w:val="Heading2"/>
       </w:pPr>
       <w:r>
-        <w:t>9.2 Approche recommandee : Hybride V2+V3</w:t>
+        <w:t>9.2 Approche recommandée : Hybride V2+V3</w:t>
       </w:r>
     </w:p>
     <w:p>
       <w:r>
-        <w:t>L'approche recommandee combine les avantages de V2 et V3 :</w:t>
+        <w:t>L'approche recommandée combine les avantages de V2 et V3 :</w:t>
       </w:r>
     </w:p>
     <w:p/>
@@ -4224,10 +4224,10 @@
           <w:b/>
           <w:color w:val="2E74B5"/>
         </w:rPr>
-        <w:t xml:space="preserve">API a la demande pour les requetes utilisateur (V3) : </w:t>
+        <w:t xml:space="preserve">API à la demande pour les requêtes utilisateur (V3) : </w:t>
       </w:r>
       <w:r>
-        <w:t>Les recherches geographiques et par categorie sont transmises directement a Algolia avec les filtres natifs (aroundLatLng, facetFilters). Donnees toujours fraiches, filtrage performant.</w:t>
+        <w:t>Les recherches géographiques et par catégorie sont transmises directement à Algolia avec les filtres natifs (aroundLatLng, facetFilters). Données toujours fraîches, filtrage performant.</w:t>
       </w:r>
     </w:p>
     <w:p>
@@ -4239,7 +4239,7 @@
         <w:t xml:space="preserve">Cache intelligent : </w:t>
       </w:r>
       <w:r>
-        <w:t>Un cache Redis (TTL 15-30 min) stocke les resultats des requetes frequentes pour reduire la latence et eviter de surcharger Algolia.</w:t>
+        <w:t>Un cache Redis (TTL 15-30 min) stocke les résultats des requêtes fréquentes pour réduire la latence et éviter de surcharger Algolia.</w:t>
       </w:r>
     </w:p>
     <w:p>
@@ -4248,10 +4248,10 @@
           <w:b/>
           <w:color w:val="2E74B5"/>
         </w:rPr>
-        <w:t xml:space="preserve">Renouvellement automatique de la cle (V2) : </w:t>
+        <w:t xml:space="preserve">Renouvellement automatique de la clé (V2) : </w:t>
       </w:r>
       <w:r>
-        <w:t>Le service algolia_key_service.py gere le renouvellement transparent de la cle API expiree, commun a V2 et V3.</w:t>
+        <w:t>Le service algolia_key_service.py gère le renouvellement transparent de la clé API expirée, commun à V2 et V3.</w:t>
       </w:r>
     </w:p>
     <w:p>
@@ -4263,7 +4263,7 @@
         <w:t xml:space="preserve">Export massif optionnel (V2) : </w:t>
       </w:r>
       <w:r>
-        <w:t>Conserver la possibilite d'export CSV/JSON via algolia_service.py pour les besoins d'analytique ou d'archivage.</w:t>
+        <w:t>Conserver la possibilité d'export CSV/JSON via algolia_service.py pour les besoins d'analytique ou d'archivage.</w:t>
       </w:r>
     </w:p>
     <w:p>
@@ -4271,7 +4271,7 @@
         <w:pStyle w:val="Heading2"/>
       </w:pPr>
       <w:r>
-        <w:t>9.3 Matrice de decision</w:t>
+        <w:t>9.3 Matrice de décision</w:t>
       </w:r>
     </w:p>
     <w:tbl>
@@ -4320,7 +4320,7 @@
                 <w:color w:val="FFFFFF"/>
                 <w:sz w:val="18"/>
               </w:rPr>
-              <w:t>Approche recommandee</w:t>
+              <w:t>Approche recommandée</w:t>
             </w:r>
           </w:p>
         </w:tc>
@@ -4335,7 +4335,7 @@
               <w:rPr>
                 <w:sz w:val="18"/>
               </w:rPr>
-              <w:t>App web : chercher des evenements proches</w:t>
+              <w:t>App web : chercher des événements proches</w:t>
             </w:r>
           </w:p>
         </w:tc>
@@ -4348,7 +4348,7 @@
               <w:rPr>
                 <w:sz w:val="18"/>
               </w:rPr>
-              <w:t>V3 - API a la demande</w:t>
+              <w:t>V3 – API à la demande</w:t>
             </w:r>
           </w:p>
         </w:tc>
@@ -4378,7 +4378,7 @@
               <w:rPr>
                 <w:sz w:val="18"/>
               </w:rPr>
-              <w:t>V2 - Scraping Algolia + sync</w:t>
+              <w:t>V2 – Scraping Algolia + sync</w:t>
             </w:r>
           </w:p>
         </w:tc>
@@ -4406,7 +4406,7 @@
               <w:rPr>
                 <w:sz w:val="18"/>
               </w:rPr>
-              <w:t>V2 - Scraping Algolia (donnees locales)</w:t>
+              <w:t>V2 – Scraping Algolia (données locales)</w:t>
             </w:r>
           </w:p>
         </w:tc>
@@ -4451,7 +4451,7 @@
               <w:rPr>
                 <w:sz w:val="18"/>
               </w:rPr>
-              <w:t>Simple affichage d'evenements</w:t>
+              <w:t>Simple affichage d'événements</w:t>
             </w:r>
           </w:p>
         </w:tc>
@@ -4464,7 +4464,7 @@
               <w:rPr>
                 <w:sz w:val="18"/>
               </w:rPr>
-              <w:t>V3 - API a la demande</w:t>
+              <w:t>V3 – API à la demande</w:t>
             </w:r>
           </w:p>
         </w:tc>
@@ -4494,7 +4494,7 @@
               <w:rPr>
                 <w:sz w:val="18"/>
               </w:rPr>
-              <w:t>V2 - Scraping Algolia</w:t>
+              <w:t>V2 – Scraping Algolia</w:t>
             </w:r>
           </w:p>
         </w:tc>
@@ -4522,7 +4522,7 @@
               <w:rPr>
                 <w:sz w:val="18"/>
               </w:rPr>
-              <w:t>V1 - Scraping HTML (deja en place)</w:t>
+              <w:t>V1 – Scraping HTML (déjà en place)</w:t>
             </w:r>
           </w:p>
         </w:tc>
@@ -4543,7 +4543,7 @@
     </w:p>
     <w:p>
       <w:r>
-        <w:t>Si la decision est prise de migrer vers l'approche V3 (API a la demande), voici les etapes recommandees :</w:t>
+        <w:t>Si la décision est prise de migrer vers l'approche V3 (API à la demande), voici les étapes recommandées :</w:t>
       </w:r>
     </w:p>
     <w:p>
@@ -4559,7 +4559,7 @@
         <w:pStyle w:val="ListBullet"/>
       </w:pPr>
       <w:r>
-        <w:t>Ajouter les methodes de recherche geographique (aroundLatLng, aroundRadius)</w:t>
+        <w:t>Ajouter les méthodes de recherche géographique (aroundLatLng, aroundRadius)</w:t>
       </w:r>
     </w:p>
     <w:p>
@@ -4567,7 +4567,7 @@
         <w:pStyle w:val="ListBullet"/>
       </w:pPr>
       <w:r>
-        <w:t>Ajouter le support des facetFilters pour les categories</w:t>
+        <w:t>Ajouter le support des facetFilters pour les catégories</w:t>
       </w:r>
     </w:p>
     <w:p>
@@ -4575,7 +4575,7 @@
         <w:pStyle w:val="ListBullet"/>
       </w:pPr>
       <w:r>
-        <w:t>Transformer les hits Algolia en schema EventRead existant</w:t>
+        <w:t>Transformer les hits Algolia en schéma EventRead existant</w:t>
       </w:r>
     </w:p>
     <w:p>
@@ -4583,7 +4583,7 @@
         <w:pStyle w:val="Heading2"/>
       </w:pPr>
       <w:r>
-        <w:t>Phase 2 : Creer les nouveaux endpoints API (1-2 jours)</w:t>
+        <w:t>Phase 2 : Créer les nouveaux endpoints API (1-2 jours)</w:t>
       </w:r>
     </w:p>
     <w:p>
@@ -4591,7 +4591,7 @@
         <w:pStyle w:val="ListBullet"/>
       </w:pPr>
       <w:r>
-        <w:t>GET /events?lat=...&amp;lng=...&amp;radius=... (recherche geo)</w:t>
+        <w:t>GET /events?lat=...&amp;lng=...&amp;radius=... (recherche géo)</w:t>
       </w:r>
     </w:p>
     <w:p>
@@ -4623,7 +4623,7 @@
         <w:pStyle w:val="ListBullet"/>
       </w:pPr>
       <w:r>
-        <w:t>Integrer Redis comme cache de resultats</w:t>
+        <w:t>Intégrer Redis comme cache de résultats</w:t>
       </w:r>
     </w:p>
     <w:p>
@@ -4631,7 +4631,7 @@
         <w:pStyle w:val="ListBullet"/>
       </w:pPr>
       <w:r>
-        <w:t>Definir les cles de cache (hash de la requete)</w:t>
+        <w:t>Définir les clés de cache (hash de la requête)</w:t>
       </w:r>
     </w:p>
     <w:p>
@@ -4639,7 +4639,7 @@
         <w:pStyle w:val="ListBullet"/>
       </w:pPr>
       <w:r>
-        <w:t>Configurer les TTL par type de requete</w:t>
+        <w:t>Configurer les TTL par type de requête</w:t>
       </w:r>
     </w:p>
     <w:p>
@@ -4655,7 +4655,7 @@
         <w:pStyle w:val="ListBullet"/>
       </w:pPr>
       <w:r>
-        <w:t>Mettre a jour les appels API pour utiliser les nouveaux endpoints</w:t>
+        <w:t>Mettre à jour les appels API pour utiliser les nouveaux endpoints</w:t>
       </w:r>
     </w:p>
     <w:p>
@@ -4663,7 +4663,7 @@
         <w:pStyle w:val="ListBullet"/>
       </w:pPr>
       <w:r>
-        <w:t>Passer la geolocalisation du navigateur a l'API</w:t>
+        <w:t>Passer la géolocalisation du navigateur à l'API</w:t>
       </w:r>
     </w:p>
     <w:p>
@@ -4671,7 +4671,7 @@
         <w:pStyle w:val="ListBullet"/>
       </w:pPr>
       <w:r>
-        <w:t>Gerer le chargement (indicateur pendant l'appel Algolia)</w:t>
+        <w:t>Gérer le chargement (indicateur pendant l'appel Algolia)</w:t>
       </w:r>
     </w:p>
     <w:p>
@@ -4687,7 +4687,7 @@
         <w:pStyle w:val="ListBullet"/>
       </w:pPr>
       <w:r>
-        <w:t>Supprimer scraper_service.py (V1 obsolete)</w:t>
+        <w:t>Supprimer scraper_service.py (V1 obsolète)</w:t>
       </w:r>
     </w:p>
     <w:p>
@@ -4703,7 +4703,7 @@
         <w:pStyle w:val="ListBullet"/>
       </w:pPr>
       <w:r>
-        <w:t>Mettre a jour la documentation</w:t>
+        <w:t>Mettre à jour la documentation</w:t>
       </w:r>
     </w:p>
     <w:p>
@@ -4720,7 +4720,7 @@
         <w:rPr>
           <w:b/>
         </w:rPr>
-        <w:t>Effort total estime : 5 a 8 jours de developpement</w:t>
+        <w:t>Effort total estimé : 5 à 8 jours de développement</w:t>
       </w:r>
     </w:p>
     <w:p>
@@ -4738,19 +4738,19 @@
     </w:p>
     <w:p>
       <w:r>
-        <w:t>Le projet a evolue en trois etapes naturelles :</w:t>
+        <w:t>Le projet a évolué en trois étapes naturelles :</w:t>
         <w:br/>
         <w:br/>
-        <w:t>V1 (scraping HTML) a permis de valider le concept et de construire l'infrastructure de base (API, base de donnees, modeles).</w:t>
+        <w:t>V1 (scraping HTML) a permis de valider le concept et de construire l'infrastructure de base (API, base de données, modèles).</w:t>
         <w:br/>
         <w:br/>
-        <w:t>V2 (scraping Algolia) a apporte un saut qualitatif majeur : acces a l'integralite des 110k+ evenements avec toutes leurs metadonnees, et un mecanisme robuste de renouvellement de cle API.</w:t>
+        <w:t>V2 (scraping Algolia) a apporté un saut qualitatif majeur : accès à l'intégralité des 110k+ événements avec toutes leurs métadonnées, et un mécanisme robuste de renouvellement de clé API.</w:t>
         <w:br/>
         <w:br/>
-        <w:t>V3 (API a la demande) est l'evolution naturelle pour un produit centre sur la recherche d'evenements par localisation. Elle simplifie drastiquement l'architecture tout en garantissant des donnees toujours a jour et un filtrage geographique performant.</w:t>
+        <w:t>V3 (API à la demande) est l'évolution naturelle pour un produit centré sur la recherche d'événements par localisation. Elle simplifie drastiquement l'architecture tout en garantissant des données toujours à jour et un filtrage géographique performant.</w:t>
         <w:br/>
         <w:br/>
-        <w:t>L'approche hybride V2+V3 recommandee permet de conserver le meilleur de chaque version selon les besoins.</w:t>
+        <w:t>L'approche hybride V2+V3 recommandée permet de conserver le meilleur de chaque version selon les besoins.</w:t>
       </w:r>
     </w:p>
     <w:p/>

</xml_diff>